<commit_message>
docs(paper): rewrite on 0.9.11, with the injected-mistake test as a script
The paper is now about the method across software and hardware: one
structure for every product, declare once, derive, check, engines for
the hard problems, and mistakes turned into rules. The sensor stick is
one short example rather than the subject.

markers/run.py is the test the paper reports: the same 20 mistakes as
the first run, each tagged with the kind of drift it tests, plus three
correct changes and two unchanged runs. On 0.9.4 it caught 15; on 0.9.11
it catches 20 and every control passes. Table II, Section V's counts and
Fig. 4 are read from its results, so the paper follows the last run.

The figures are redrawn plain: black on white, the paper's serif, one
colour for what goes wrong, no labels a caption already says.

Co-Authored-By: Claude Opus 5.5 <noreply@anthropic.com>
Claude-Session: https://claude.ai/code/session_0185NnNkfrVmB6KpyPa4GJCQ
</commit_message>
<xml_diff>
--- a/docs/paper/Fiducial_Zdravkovic_Aleksa.docx
+++ b/docs/paper/Fiducial_Zdravkovic_Aleksa.docx
@@ -232,7 +232,7 @@
         <w:t>Abstract—</w:t>
       </w:r>
       <w:r>
-        <w:t>This paper presents Fiducial, an open-source platform for building products that span several disciplines – a printed case, a circuit board, firmware and a web application – with AI coding agents. Every fact about the product is declared once in typed files, every artifact is derived from those files by one command, and a continuous-integration gate fails when an artifact no longer follows from its declaration. Hard problems such as part placement, routing and solid modelling are handed to established engines. A public example, a USB-C temperature and humidity stick, is carried from one declaration to a routed board, a checked case, firmware and a web page. When 20 realistic mistakes were injected into two products, the gates caught 15 of them before merge.</w:t>
+        <w:t>This paper presents Fiducial, an open-source platform for building products that span software and hardware – a web application, firmware, a circuit board and a printed case – with AI coding agents. It gives every product the same structure: each fact is declared once in typed files, every artifact that depends on it is derived by one command, and checks on every commit refuse anything that no longer follows from its declaration. Hard problems such as part placement and solid modelling are handed to established engines, so the platform grows by declarations rather than by special cases. To test it, 20 realistic mistakes were injected into two products. The first run caught 15. Each miss was turned into a general rule, and the current version catches 20 of the 20 while letting every correct change through.</w:t>
       </w:r>
     </w:p>
     <w:p>
@@ -246,7 +246,7 @@
         <w:t>Keywords—</w:t>
       </w:r>
       <w:r>
-        <w:t>AI agents, single source of truth, hardware–software co-design, constraint solving, PCB automation, continuous integration</w:t>
+        <w:t>AI agents, single source of truth, code generation, consistency checking, hardware–software co-design, continuous integration</w:t>
       </w:r>
     </w:p>
     <w:p>
@@ -263,7 +263,7 @@
         <w:pStyle w:val="BodyText"/>
       </w:pPr>
       <w:r>
-        <w:t>While building Outreach [1], an off-grid messaging system made of radios, gateways, a companion app and printed cases, the author ran into the same problem more than once. The radio firmware and the app disagreed on the layout of a Bluetooth message, and a printed case did not fit the board it was made for. Neither part was wrong on its own. Each was designed in its own tool, the facts they shared were copied by hand, and one copy changed while the other did not. The mistake showed up only when the parts were put together.</w:t>
+        <w:t>While building Outreach [1], an off-grid messaging system made of radios, gateways, a companion app and printed cases, the author ran into the same problem more than once. The firmware and the app disagreed on the layout of a message, and a printed case did not fit the board it was made for. Neither part was wrong on its own. The facts they shared were copied by hand between different tools, one copy changed, and the mistake showed up only when the parts were put together.</w:t>
       </w:r>
     </w:p>
     <w:p>
@@ -271,7 +271,7 @@
         <w:pStyle w:val="BodyText"/>
       </w:pPr>
       <w:r>
-        <w:t>AI coding agents [2], [3] now write a large part of the code in a project. That makes each copy faster to write, but it does not remove the copies. An agent working in the firmware repository does not know that the board changed, and an agent working on the case does not know which connector the board uses. Writing disconnected copies faster only gives an inconsistent product sooner.</w:t>
+        <w:t>This is how most products are built, and AI coding agents [2], [3] make it faster without making it safer. An agent is quick inside one codebase but knows nothing about the others: the agent writing the firmware does not know the board changed, and the one writing the web page does not know the firmware did. Every project also invents its own layout, scripts and habits, so each new product starts from scratch and every agent has to learn it again.</w:t>
       </w:r>
     </w:p>
     <w:p>
@@ -279,7 +279,7 @@
         <w:pStyle w:val="BodyText"/>
       </w:pPr>
       <w:r>
-        <w:t>Fiducial [4] was made to solve this from the other side: each fact is declared once, and everything that needs it is derived from it. The case, the board, the firmware’s pin map and the web page’s types are all outputs of the same declaration, regenerated by one command and checked by one gate (Fig. 1). Agents, and the person working with them, edit the declarations and never the outputs.</w:t>
+        <w:t>Fiducial [4] takes the opposite approach. Every product is built the same way, in one repository, around one rule: each fact is declared once, and everything that needs it is derived from it and checked (Fig. 1). People and agents edit the declarations, never the outputs. This paper explains the idea, how the platform is put together and why, and how its checks hold up against mistakes made on purpose.</w:t>
       </w:r>
     </w:p>
     <w:p>
@@ -293,7 +293,7 @@
       <w:r>
         <w:drawing>
           <wp:inline xmlns:a="http://schemas.openxmlformats.org/drawingml/2006/main" xmlns:pic="http://schemas.openxmlformats.org/drawingml/2006/picture">
-            <wp:extent cx="3086100" cy="1641790"/>
+            <wp:extent cx="2880360" cy="2349894"/>
             <wp:docPr id="1" name="Picture 1"/>
             <wp:cNvGraphicFramePr>
               <a:graphicFrameLocks noChangeAspect="1"/>
@@ -302,7 +302,7 @@
               <a:graphicData uri="http://schemas.openxmlformats.org/drawingml/2006/picture">
                 <pic:pic>
                   <pic:nvPicPr>
-                    <pic:cNvPr id="0" name="fig1-one-declaration.jpg"/>
+                    <pic:cNvPr id="0" name="fig1-one-fact.png"/>
                     <pic:cNvPicPr/>
                   </pic:nvPicPr>
                   <pic:blipFill>
@@ -314,7 +314,7 @@
                   <pic:spPr>
                     <a:xfrm>
                       <a:off x="0" y="0"/>
-                      <a:ext cx="3086100" cy="1641790"/>
+                      <a:ext cx="2880360" cy="2349894"/>
                     </a:xfrm>
                     <a:prstGeom prst="rect"/>
                   </pic:spPr>
@@ -330,7 +330,7 @@
         <w:pStyle w:val="Slika"/>
       </w:pPr>
       <w:r>
-        <w:t>One declaration, four disciplines. The sensor’s data line is declared on GPIO4 once; fid derive places and routes the board, builds the case around it, and writes the firmware pin map and the web types from the same line.</w:t>
+        <w:t>One fact in four places. (a) Copied by hand: one copy changes and nothing notices. (b) Declared once: every copy is derived from it and checked on every commit.</w:t>
       </w:r>
     </w:p>
     <w:p>
@@ -339,7 +339,7 @@
         <w:keepNext/>
       </w:pPr>
       <w:r>
-        <w:t>System Overview and Implementation</w:t>
+        <w:t>The Idea</w:t>
       </w:r>
     </w:p>
     <w:p>
@@ -347,7 +347,116 @@
         <w:pStyle w:val="BodyText"/>
       </w:pPr>
       <w:r>
-        <w:t>Fiducial is a command-line tool, fid, written in Rust, together with 22 capabilities – packaged pipelines for hardware, firmware (RP2040 and STM32), web frameworks, translations, design systems, legal pages, deployment and more. A product turns on the capabilities it needs in its fiducial.toml file. The platform is organised in five layers, shown in Fig. 2.</w:t>
+        <w:t>A product is a set of facts – which pin a sensor is on, what a button says in each language, the brand colour, the size of the board – and a set of artifacts that use them: code, schematics, translations, web pages, case models. Most bugs between disciplines come from one fact being written in more than one artifact. Fiducial removes that with three rules.</w:t>
+      </w:r>
+    </w:p>
+    <w:p>
+      <w:pPr>
+        <w:pStyle w:val="BodyText"/>
+      </w:pPr>
+      <w:r>
+        <w:t>Declare once. Every fact has exactly one place where it is written, a typed text file that a person or an agent edits.</w:t>
+      </w:r>
+    </w:p>
+    <w:p>
+      <w:pPr>
+        <w:pStyle w:val="BodyText"/>
+      </w:pPr>
+      <w:r>
+        <w:t>Derive everything else. One deterministic command, fid derive, generates every artifact that depends on a fact. Generated files are never edited by hand.</w:t>
+      </w:r>
+    </w:p>
+    <w:p>
+      <w:pPr>
+        <w:pStyle w:val="BodyText"/>
+      </w:pPr>
+      <w:r>
+        <w:t>Check every change. On every commit, checks confirm that every artifact still follows from its declarations and that the declarations make sense. A failure names the declaration at fault.</w:t>
+      </w:r>
+    </w:p>
+    <w:p>
+      <w:pPr>
+        <w:pStyle w:val="BodyText"/>
+      </w:pPr>
+      <w:r>
+        <w:t>None of these rules is new on its own. Model-driven engineering generates code from models [5], and Nix identifies every build by a hash of its inputs [6]. What Fiducial adds is applying them across every discipline of one product at once, in plain files that coding agents read and write well, with the checks – not the agent’s good behaviour – as what makes the result reliable.</w:t>
+      </w:r>
+    </w:p>
+    <w:p>
+      <w:pPr>
+        <w:pStyle w:val="Heading1"/>
+        <w:keepNext/>
+      </w:pPr>
+      <w:r>
+        <w:t>How It Is Built</w:t>
+      </w:r>
+    </w:p>
+    <w:p>
+      <w:pPr>
+        <w:pStyle w:val="Heading2"/>
+        <w:keepNext/>
+      </w:pPr>
+      <w:r>
+        <w:t>One Structure for Every Product</w:t>
+      </w:r>
+    </w:p>
+    <w:p>
+      <w:pPr>
+        <w:pStyle w:val="BodyText"/>
+      </w:pPr>
+      <w:r>
+        <w:t>fid new creates a product repository with a fixed layout, and fid add turns on capabilities: packaged pipelines for web frameworks, translations, content, search metadata, legal pages, design systems, databases, deployment, device messages, firmware for two microcontroller families, and hardware – 23 in all. Two products built with Fiducial look the same, so knowing one means knowing the others, and a new product starts from working, checked parts instead of an empty folder. Every product also carries an AGENTS.md file [7] and one instruction file per capability, so any agent starts from the same context. A newer platform version comes in with one command, fid upgrade, which keeps the product’s own edits.</w:t>
+      </w:r>
+    </w:p>
+    <w:p>
+      <w:pPr>
+        <w:pStyle w:val="Heading2"/>
+        <w:keepNext/>
+      </w:pPr>
+      <w:r>
+        <w:t>Declarations</w:t>
+      </w:r>
+    </w:p>
+    <w:p>
+      <w:pPr>
+        <w:pStyle w:val="BodyText"/>
+      </w:pPr>
+      <w:r>
+        <w:t>Declarations are typed text files in version control: messages/&lt;language&gt;.json for every user-visible string, fiducial.toml for pages and brand, design-system.md for colours and the contrast they must reach, protocol.toml for the messages a device sends, and hardware/product.toml for the parts of a physical product and how they connect. Plain text was chosen over a modelling tool because it is what coding agents handle best, and because every change then goes through a normal code review. A declaration states a fact and nothing more. It does not say where the sitemap lists a page or which way a trace runs.</w:t>
+      </w:r>
+    </w:p>
+    <w:p>
+      <w:pPr>
+        <w:pStyle w:val="Heading2"/>
+        <w:keepNext/>
+      </w:pPr>
+      <w:r>
+        <w:t>Derivation</w:t>
+      </w:r>
+    </w:p>
+    <w:p>
+      <w:pPr>
+        <w:pStyle w:val="BodyText"/>
+      </w:pPr>
+      <w:r>
+        <w:t>fid derive runs every enabled pipeline. Each one reads the declarations it needs and writes its artifacts: a typed message module, a sitemap, a database migration, a firmware pin map, TypeScript types, a circuit board. Every pipeline lists the files it reads and writes, and the SHA-256 hash of each is stored in a lock file. Derivation is deterministic, so the same inputs always give the same bytes; without that, comparing hashes would mean nothing. This requirement decided more than one design choice: the placement solver, for example, runs on a single thread, because with several it gave different answers to the same problem.</w:t>
+      </w:r>
+    </w:p>
+    <w:p>
+      <w:pPr>
+        <w:pStyle w:val="Heading2"/>
+        <w:keepNext/>
+      </w:pPr>
+      <w:r>
+        <w:t>Checks</w:t>
+      </w:r>
+    </w:p>
+    <w:p>
+      <w:pPr>
+        <w:pStyle w:val="BodyText"/>
+      </w:pPr>
+      <w:r>
+        <w:t>The checks are of three kinds (Fig. 2). Freshness: fid derive --check fails when a declaration changed without its outputs being regenerated, or when an output was edited by hand. Rules inside derivation: every language must have every string, every page needs a title, every colour pair must reach its contrast, circuit voltages must fall inside their windows, the parts must cost less than a declared limit, and the board must fit its case. Consumers: compilers and type checkers read the derived files, so code that still uses a renamed fact stops compiling. All of them run in continuous integration on every commit. A failure names the file and the declaration at fault, which is the kind of signal an agent needs to fix its own mistake.</w:t>
       </w:r>
     </w:p>
     <w:p>
@@ -361,7 +470,7 @@
       <w:r>
         <w:drawing>
           <wp:inline xmlns:a="http://schemas.openxmlformats.org/drawingml/2006/main" xmlns:pic="http://schemas.openxmlformats.org/drawingml/2006/picture">
-            <wp:extent cx="2651760" cy="1855710"/>
+            <wp:extent cx="2651760" cy="1644091"/>
             <wp:docPr id="2" name="Picture 2"/>
             <wp:cNvGraphicFramePr>
               <a:graphicFrameLocks noChangeAspect="1"/>
@@ -370,7 +479,7 @@
               <a:graphicData uri="http://schemas.openxmlformats.org/drawingml/2006/picture">
                 <pic:pic>
                   <pic:nvPicPr>
-                    <pic:cNvPr id="0" name="fig2-layers.jpg"/>
+                    <pic:cNvPr id="0" name="fig2-loop.png"/>
                     <pic:cNvPicPr/>
                   </pic:nvPicPr>
                   <pic:blipFill>
@@ -382,7 +491,7 @@
                   <pic:spPr>
                     <a:xfrm>
                       <a:off x="0" y="0"/>
-                      <a:ext cx="2651760" cy="1855710"/>
+                      <a:ext cx="2651760" cy="1644091"/>
                     </a:xfrm>
                     <a:prstGeom prst="rect"/>
                   </pic:spPr>
@@ -398,7 +507,7 @@
         <w:pStyle w:val="Slika"/>
       </w:pPr>
       <w:r>
-        <w:t>The five layers of Fiducial. Agents read one shared context and edit declarations, capabilities derive the artifacts, engines solve the hard problems, and gates stop drift from being merged.</w:t>
+        <w:t>How a change moves through Fiducial. Declarations are edited, derivation produces the artifacts and hands hard problems to established engines, and the checks either let the change through or return a message naming the declaration at fault.</w:t>
       </w:r>
     </w:p>
     <w:p>
@@ -407,7 +516,7 @@
         <w:keepNext/>
       </w:pPr>
       <w:r>
-        <w:t>Declarations</w:t>
+        <w:t>Hard Problems Go to Engines</w:t>
       </w:r>
     </w:p>
     <w:p>
@@ -415,7 +524,7 @@
         <w:pStyle w:val="BodyText"/>
       </w:pPr>
       <w:r>
-        <w:t>A declaration is a typed text file kept in version control. Plain text was chosen over a modelling tool because it is what coding agents read and write best, and because every change then shows up in a normal code review. For hardware, the declaration is hardware/product.toml: the outline of the product, its case, and every part with an orderable LCSC number [5], a KiCad symbol and footprint [6], and the net each pin connects to. Placement intent is declared too – which zone a part belongs to, what it must be near or away from, and which part a vent seals over. Translations are declared once per language in messages/&lt;locale&gt;.json, and page metadata and colour contrast in the same way. A declaration only states facts. Nothing in it says where a resistor sits or how a trace runs.</w:t>
+        <w:t>Some derivations are real engineering problems: where to put the parts on a board, how to route it, how to build a case around it. The first version placed parts with a hand-written search, and every new product added another special rule. The rules began to interact, and the code grew faster than the products. So the structure changed: the platform writes the problem down in a fixed format and hands it to an established engine – the CP-SAT constraint solver [8] for placement, the OpenCascade kernel through build123d [9] for the case, and KiCad [10] for the board and its design-rule check. Every placement rule became one of eight generic kinds, and a new requirement became a new declaration instead of new code. When declarations contradict each other, the solver names the smallest set that cannot all hold.</w:t>
       </w:r>
     </w:p>
     <w:p>
@@ -424,7 +533,7 @@
         <w:keepNext/>
       </w:pPr>
       <w:r>
-        <w:t>Derivation and the Lock File</w:t>
+        <w:t>Mistakes Become Rules</w:t>
       </w:r>
     </w:p>
     <w:p>
@@ -432,16 +541,16 @@
         <w:pStyle w:val="BodyText"/>
       </w:pPr>
       <w:r>
-        <w:t>fid derive runs the pipeline of every enabled capability in order. Each one reads declarations and writes artifacts. The hardware pipeline alone writes the placement, the KiCad board and schematic, the bill of materials, the assembly order, a layout file that records why each position was chosen, the firmware pin map (board.rs) and the web types (interface.ts). The SHA-256 hash of every input and output is written to fiducial.lock, the same idea as a package manager’s lock file or Nix’s hashed builds [7]. Derivation is deterministic: run twice on the same inputs, it writes the same bytes. Without that, comparing hashes would mean nothing, so it was kept as a hard requirement throughout.</w:t>
-      </w:r>
-    </w:p>
-    <w:p>
-      <w:pPr>
-        <w:pStyle w:val="Heading2"/>
+        <w:t>Two habits keep the platform growing in the right direction. Agents fix a problem in the layer that owns the fact – a wrong pin in the declaration, a wrong derivation in the platform – and never in a generated file. And when a mistake gets past the checks, it is not patched for that one case; it becomes a general rule that holds for every product. Section V shows what that looks like.</w:t>
+      </w:r>
+    </w:p>
+    <w:p>
+      <w:pPr>
+        <w:pStyle w:val="Heading1"/>
         <w:keepNext/>
       </w:pPr>
       <w:r>
-        <w:t>Engines Behind Contracts</w:t>
+        <w:t>Example: A Sensor Stick</w:t>
       </w:r>
     </w:p>
     <w:p>
@@ -449,32 +558,7 @@
         <w:pStyle w:val="BodyText"/>
       </w:pPr>
       <w:r>
-        <w:t>The first version placed parts on the board with a hand-written search, and every new product requirement added another rule to it. The rules started to interact, and the code grew faster than the products. This was replaced: every hard problem now goes to an established engine, and Fiducial only owns the contract, the file that describes the problem. Part placement is a constraint model solved by CP-SAT from Google OR-Tools [8], and every placement rule is one of eight generic kinds (inside, no-overlap, fixed, flush, within, apart, near and net). The case is modelled in build123d on the OpenCascade kernel [9], which also checks that the board fits and the lid closes. KiCad lays out the board and runs its design-rule check (DRC), and Freerouting [10] routes it. A small nodal solver checks resistive set points against declared windows, such as the CC voltages of USB Type-C [11].</w:t>
-      </w:r>
-    </w:p>
-    <w:p>
-      <w:pPr>
-        <w:pStyle w:val="BodyText"/>
-      </w:pPr>
-      <w:r>
-        <w:t>When two declarations contradict each other, the placement model has no solution, and the solver reports the smallest set of declarations that cannot all hold, written in the product’s own terms (Fig. 3, case 3). The person then decides which one to relax.</w:t>
-      </w:r>
-    </w:p>
-    <w:p>
-      <w:pPr>
-        <w:pStyle w:val="Heading2"/>
-        <w:keepNext/>
-      </w:pPr>
-      <w:r>
-        <w:t>Gates</w:t>
-      </w:r>
-    </w:p>
-    <w:p>
-      <w:pPr>
-        <w:pStyle w:val="BodyText"/>
-      </w:pPr>
-      <w:r>
-        <w:t>fid derive --check recomputes the hashes and fails if an input changed since its outputs were derived, or if an output was edited by hand. It runs in continuous integration on every commit, so a stale artifact cannot be merged. Derivation also checks the product itself: the case must fit the board, the board must pass DRC with zero violations, the set points must be inside their windows, every language must have every string, and the parts must cost less than a declared ceiling. Finally, the firmware compiler and the web type checker read derived files, so renaming a fact breaks every place that still uses the old name. Fig. 3 shows three real failures from the example product.</w:t>
+        <w:t>To show the whole chain on something anyone can inspect, the repository contains a public example: a USB-C stick that reports temperature and humidity to a web page (Fig. 3). It is small on purpose, but it has every discipline: a printed case, a routed two-layer board with 23 parts, Rust firmware and a web page. The person writes the product declaration, an outline drawing, the firmware and the page. Fiducial derives the rest, including the files a board house needs to make it.</w:t>
       </w:r>
     </w:p>
     <w:p>
@@ -488,7 +572,7 @@
       <w:r>
         <w:drawing>
           <wp:inline xmlns:a="http://schemas.openxmlformats.org/drawingml/2006/main" xmlns:pic="http://schemas.openxmlformats.org/drawingml/2006/picture">
-            <wp:extent cx="3086100" cy="1907550"/>
+            <wp:extent cx="2880360" cy="1302675"/>
             <wp:docPr id="3" name="Picture 3"/>
             <wp:cNvGraphicFramePr>
               <a:graphicFrameLocks noChangeAspect="1"/>
@@ -497,7 +581,7 @@
               <a:graphicData uri="http://schemas.openxmlformats.org/drawingml/2006/picture">
                 <pic:pic>
                   <pic:nvPicPr>
-                    <pic:cNvPr id="0" name="fig3-gates.jpg"/>
+                    <pic:cNvPr id="0" name="fig3-sensor-stick.png"/>
                     <pic:cNvPicPr/>
                   </pic:nvPicPr>
                   <pic:blipFill>
@@ -509,7 +593,7 @@
                   <pic:spPr>
                     <a:xfrm>
                       <a:off x="0" y="0"/>
-                      <a:ext cx="3086100" cy="1907550"/>
+                      <a:ext cx="2880360" cy="1302675"/>
                     </a:xfrm>
                     <a:prstGeom prst="rect"/>
                   </pic:spPr>
@@ -525,7 +609,24 @@
         <w:pStyle w:val="Slika"/>
       </w:pPr>
       <w:r>
-        <w:t>Three gate failures on the example product: an edit whose outputs were not re-derived, a 22 kΩ resistor in place of 5.1 kΩ, and two placement declarations that contradict each other.</w:t>
+        <w:t>The sensor stick, derived from its declaration: (a) the closed case, 36 × 84 mm; (b) the routed board inside it, with the sensor at the far end under its vent.</w:t>
+      </w:r>
+    </w:p>
+    <w:p>
+      <w:pPr>
+        <w:pStyle w:val="BodyText"/>
+      </w:pPr>
+      <w:r>
+        <w:t>The message the stick sends is declared once as well, and both the firmware’s encoder and the page’s decoder are generated from it. That closes the exact gap met in Outreach, where the two sides were written separately. Moving the sensor’s data line to another pin is one changed line. Until the product is re-derived, the check fails; after fid derive, the board, the schematic, the firmware’s pin map and the page’s types all follow, and the firmware and the page need no edit. If the new pin is one the chip’s I²C bus cannot use, the firmware stops compiling, because in Embassy [11] every pin is its own type.</w:t>
+      </w:r>
+    </w:p>
+    <w:p>
+      <w:pPr>
+        <w:pStyle w:val="Heading1"/>
+        <w:keepNext/>
+      </w:pPr>
+      <w:r>
+        <w:t>Evaluation</w:t>
       </w:r>
     </w:p>
     <w:p>
@@ -534,7 +635,7 @@
         <w:keepNext/>
       </w:pPr>
       <w:r>
-        <w:t>Working with AI Agents</w:t>
+        <w:t>Development</w:t>
       </w:r>
     </w:p>
     <w:p>
@@ -542,117 +643,7 @@
         <w:pStyle w:val="BodyText"/>
       </w:pPr>
       <w:r>
-        <w:t>Every product has an AGENTS.md file [12] and one instruction file per capability, so any agent – Claude Code, Codex, Cursor or others – starts from the same context. fid dash --json gives an agent the current state of the product, and a hook that runs before every shell command stops an agent from editing a derived file. The rule given to agents is that a mistake is fixed in the layer that owns the fact: a wrong pin in the declaration, a wrong derivation in the platform, and never in the output. Fiducial itself was built this way.</w:t>
-      </w:r>
-    </w:p>
-    <w:p>
-      <w:pPr>
-        <w:pStyle w:val="Heading1"/>
-        <w:keepNext/>
-      </w:pPr>
-      <w:r>
-        <w:t>Worked Example: Sensor Stick</w:t>
-      </w:r>
-    </w:p>
-    <w:p>
-      <w:pPr>
-        <w:pStyle w:val="BodyText"/>
-      </w:pPr>
-      <w:r>
-        <w:t>The first product Fiducial was used on is private, so a public example was built in the repository to show the whole chain on something anyone can inspect: a USB-C stick that reports room temperature and humidity to a web page (Fig. 4). It was kept small and cheap on purpose, but it still has every discipline: an RP2040 microcontroller [13] with its crystal and QSPI flash, an AHT20 sensor [14], a WS2812B status LED behind a 5 V buffer, a 3.3 V regulator and a USB-C socket – 23 parts on the board, USD 4.74 per board at five boards.</w:t>
-      </w:r>
-    </w:p>
-    <w:p>
-      <w:pPr>
-        <w:pStyle w:val="BodyText"/>
-        <w:keepNext/>
-        <w:spacing w:line="240" w:lineRule="auto" w:before="0" w:after="0"/>
-        <w:ind w:firstLine="0"/>
-        <w:jc w:val="center"/>
-      </w:pPr>
-      <w:r>
-        <w:drawing>
-          <wp:inline xmlns:a="http://schemas.openxmlformats.org/drawingml/2006/main" xmlns:pic="http://schemas.openxmlformats.org/drawingml/2006/picture">
-            <wp:extent cx="3086100" cy="2754686"/>
-            <wp:docPr id="4" name="Picture 4"/>
-            <wp:cNvGraphicFramePr>
-              <a:graphicFrameLocks noChangeAspect="1"/>
-            </wp:cNvGraphicFramePr>
-            <a:graphic>
-              <a:graphicData uri="http://schemas.openxmlformats.org/drawingml/2006/picture">
-                <pic:pic>
-                  <pic:nvPicPr>
-                    <pic:cNvPr id="0" name="fig4-sensor-stick.jpg"/>
-                    <pic:cNvPicPr/>
-                  </pic:nvPicPr>
-                  <pic:blipFill>
-                    <a:blip r:embed="rId21"/>
-                    <a:stretch>
-                      <a:fillRect/>
-                    </a:stretch>
-                  </pic:blipFill>
-                  <pic:spPr>
-                    <a:xfrm>
-                      <a:off x="0" y="0"/>
-                      <a:ext cx="3086100" cy="2754686"/>
-                    </a:xfrm>
-                    <a:prstGeom prst="rect"/>
-                  </pic:spPr>
-                </pic:pic>
-              </a:graphicData>
-            </a:graphic>
-          </wp:inline>
-        </w:drawing>
-      </w:r>
-    </w:p>
-    <w:p>
-      <w:pPr>
-        <w:pStyle w:val="Slika"/>
-      </w:pPr>
-      <w:r>
-        <w:t>The sensor stick, derived from one declaration: (a) the routed board in its base, with the sensor alone at the far end, away from the regulator’s heat; (b) the closed case, 36 × 84 × 15.5 mm; (c) exploded view; (d) the routed copper.</w:t>
-      </w:r>
-    </w:p>
-    <w:p>
-      <w:pPr>
-        <w:pStyle w:val="BodyText"/>
-      </w:pPr>
-      <w:r>
-        <w:t>The person writes product.toml, an outline drawing, the firmware and the page, and Fiducial derives the rest. The board is sized from the area of its parts (26 × 79 mm, two layers), placed by CP-SAT from 80 constraint instances of six kinds, routed, and passes DRC. The case is built around the board, with a window where the socket meets the wall and a vent sealed over the sensor. The sensor sits at the far end, away from the regulator, because a humidity sensor next to a warm part measures the part and not the room.</w:t>
-      </w:r>
-    </w:p>
-    <w:p>
-      <w:pPr>
-        <w:pStyle w:val="BodyText"/>
-      </w:pPr>
-      <w:r>
-        <w:t>The firmware is written in Rust on Embassy [15] and takes every pin through the derived board.rs. Pins are given as macros rather than numbers, because in Embassy every pin is its own type: if a pin is moved to one the chip’s I²C cannot use, the firmware stops compiling instead of failing on the bench. The page reads the sensor over the Web Serial API [16] and imports the derived interface.ts. A fabrication pipeline writes the Gerber files, the assembly bill of materials and the placement file a board house needs.</w:t>
-      </w:r>
-    </w:p>
-    <w:p>
-      <w:pPr>
-        <w:pStyle w:val="Heading1"/>
-        <w:keepNext/>
-      </w:pPr>
-      <w:r>
-        <w:t>Results</w:t>
-      </w:r>
-    </w:p>
-    <w:p>
-      <w:pPr>
-        <w:pStyle w:val="Heading2"/>
-        <w:keepNext/>
-      </w:pPr>
-      <w:r>
-        <w:t>Measurements</w:t>
-      </w:r>
-    </w:p>
-    <w:p>
-      <w:pPr>
-        <w:pStyle w:val="BodyText"/>
-      </w:pPr>
-      <w:r>
-        <w:t>Fiducial was developed over four weeks (repository created on 6 September 2026, release 0.9.4 on 4 October 2026) by one person working with AI agents: 195 commits on the main branch through 55 merged pull requests, about 60,000 lines of Rust, 12,000 of TypeScript and 6,000 of Python. It was used on two products, the public sensor stick and a private one whose design is not shown. Table I summarises the measurements.</w:t>
+        <w:t>Fiducial was built over six weeks, from 6 September to 15 October 2026, by one person working with AI agents: about 240 commits and 68 merged pull requests, with about 65,000 lines of Rust, 9,000 of TypeScript and 6,000 of Python. It has been used on two products, the sensor stick and a private one. Table I lists measurements from both.</w:t>
       </w:r>
     </w:p>
     <w:p>
@@ -680,13 +671,13 @@
         </w:tblBorders>
       </w:tblPr>
       <w:tblGrid>
-        <w:gridCol w:w="1600"/>
-        <w:gridCol w:w="3180"/>
+        <w:gridCol w:w="1700"/>
+        <w:gridCol w:w="3080"/>
       </w:tblGrid>
       <w:tr>
         <w:tc>
           <w:tcPr>
-            <w:tcW w:type="dxa" w:w="1600"/>
+            <w:tcW w:type="dxa" w:w="1700"/>
           </w:tcPr>
           <w:p>
             <w:pPr>
@@ -700,7 +691,7 @@
         </w:tc>
         <w:tc>
           <w:tcPr>
-            <w:tcW w:type="dxa" w:w="3180"/>
+            <w:tcW w:type="dxa" w:w="3080"/>
           </w:tcPr>
           <w:p>
             <w:pPr>
@@ -716,7 +707,7 @@
       <w:tr>
         <w:tc>
           <w:tcPr>
-            <w:tcW w:type="dxa" w:w="1600"/>
+            <w:tcW w:type="dxa" w:w="1700"/>
           </w:tcPr>
           <w:p>
             <w:pPr>
@@ -730,15 +721,15 @@
         </w:tc>
         <w:tc>
           <w:tcPr>
-            <w:tcW w:type="dxa" w:w="3180"/>
-          </w:tcPr>
-          <w:p>
-            <w:pPr>
-              <w:pStyle w:val="tablecopy"/>
-              <w:jc w:val="left"/>
-            </w:pPr>
-            <w:r>
-              <w:t>8; none added for either product after the switch to the solver</w:t>
+            <w:tcW w:type="dxa" w:w="3080"/>
+          </w:tcPr>
+          <w:p>
+            <w:pPr>
+              <w:pStyle w:val="tablecopy"/>
+              <w:jc w:val="left"/>
+            </w:pPr>
+            <w:r>
+              <w:t>8; none added for either product</w:t>
             </w:r>
           </w:p>
         </w:tc>
@@ -746,29 +737,29 @@
       <w:tr>
         <w:tc>
           <w:tcPr>
-            <w:tcW w:type="dxa" w:w="1600"/>
-          </w:tcPr>
-          <w:p>
-            <w:pPr>
-              <w:pStyle w:val="tablecopy"/>
-              <w:jc w:val="left"/>
-            </w:pPr>
-            <w:r>
-              <w:t>Constraint instances</w:t>
-            </w:r>
-          </w:p>
-        </w:tc>
-        <w:tc>
-          <w:tcPr>
-            <w:tcW w:type="dxa" w:w="3180"/>
-          </w:tcPr>
-          <w:p>
-            <w:pPr>
-              <w:pStyle w:val="tablecopy"/>
-              <w:jc w:val="left"/>
-            </w:pPr>
-            <w:r>
-              <w:t>80 of 6 kinds (sensor stick); 78 of 7 kinds (private product)</w:t>
+            <w:tcW w:type="dxa" w:w="1700"/>
+          </w:tcPr>
+          <w:p>
+            <w:pPr>
+              <w:pStyle w:val="tablecopy"/>
+              <w:jc w:val="left"/>
+            </w:pPr>
+            <w:r>
+              <w:t>Sensor stick board</w:t>
+            </w:r>
+          </w:p>
+        </w:tc>
+        <w:tc>
+          <w:tcPr>
+            <w:tcW w:type="dxa" w:w="3080"/>
+          </w:tcPr>
+          <w:p>
+            <w:pPr>
+              <w:pStyle w:val="tablecopy"/>
+              <w:jc w:val="left"/>
+            </w:pPr>
+            <w:r>
+              <w:t>26 × 79 mm, 2 layers, 0 DRC errors</w:t>
             </w:r>
           </w:p>
         </w:tc>
@@ -776,29 +767,29 @@
       <w:tr>
         <w:tc>
           <w:tcPr>
-            <w:tcW w:type="dxa" w:w="1600"/>
-          </w:tcPr>
-          <w:p>
-            <w:pPr>
-              <w:pStyle w:val="tablecopy"/>
-              <w:jc w:val="left"/>
-            </w:pPr>
-            <w:r>
-              <w:t>Connection length (private)</w:t>
-            </w:r>
-          </w:p>
-        </w:tc>
-        <w:tc>
-          <w:tcPr>
-            <w:tcW w:type="dxa" w:w="3180"/>
-          </w:tcPr>
-          <w:p>
-            <w:pPr>
-              <w:pStyle w:val="tablecopy"/>
-              <w:jc w:val="left"/>
-            </w:pPr>
-            <w:r>
-              <w:t>−13 % vs. hand-written search; a further −10 % with a warm start</w:t>
+            <w:tcW w:type="dxa" w:w="1700"/>
+          </w:tcPr>
+          <w:p>
+            <w:pPr>
+              <w:pStyle w:val="tablecopy"/>
+              <w:jc w:val="left"/>
+            </w:pPr>
+            <w:r>
+              <w:t>Sensor stick parts</w:t>
+            </w:r>
+          </w:p>
+        </w:tc>
+        <w:tc>
+          <w:tcPr>
+            <w:tcW w:type="dxa" w:w="3080"/>
+          </w:tcPr>
+          <w:p>
+            <w:pPr>
+              <w:pStyle w:val="tablecopy"/>
+              <w:jc w:val="left"/>
+            </w:pPr>
+            <w:r>
+              <w:t>USD 4.74 per board at 5 (limit USD 15)</w:t>
             </w:r>
           </w:p>
         </w:tc>
@@ -806,29 +797,29 @@
       <w:tr>
         <w:tc>
           <w:tcPr>
-            <w:tcW w:type="dxa" w:w="1600"/>
-          </w:tcPr>
-          <w:p>
-            <w:pPr>
-              <w:pStyle w:val="tablecopy"/>
-              <w:jc w:val="left"/>
-            </w:pPr>
-            <w:r>
-              <w:t>Board, sensor stick</w:t>
-            </w:r>
-          </w:p>
-        </w:tc>
-        <w:tc>
-          <w:tcPr>
-            <w:tcW w:type="dxa" w:w="3180"/>
-          </w:tcPr>
-          <w:p>
-            <w:pPr>
-              <w:pStyle w:val="tablecopy"/>
-              <w:jc w:val="left"/>
-            </w:pPr>
-            <w:r>
-              <w:t>26 × 79 mm, 2 layers, 0 DRC violations</w:t>
+            <w:tcW w:type="dxa" w:w="1700"/>
+          </w:tcPr>
+          <w:p>
+            <w:pPr>
+              <w:pStyle w:val="tablecopy"/>
+              <w:jc w:val="left"/>
+            </w:pPr>
+            <w:r>
+              <w:t>One pin moved</w:t>
+            </w:r>
+          </w:p>
+        </w:tc>
+        <w:tc>
+          <w:tcPr>
+            <w:tcW w:type="dxa" w:w="3080"/>
+          </w:tcPr>
+          <w:p>
+            <w:pPr>
+              <w:pStyle w:val="tablecopy"/>
+              <w:jc w:val="left"/>
+            </w:pPr>
+            <w:r>
+              <w:t>8 generated files rewritten in 37 s</w:t>
             </w:r>
           </w:p>
         </w:tc>
@@ -836,29 +827,29 @@
       <w:tr>
         <w:tc>
           <w:tcPr>
-            <w:tcW w:type="dxa" w:w="1600"/>
-          </w:tcPr>
-          <w:p>
-            <w:pPr>
-              <w:pStyle w:val="tablecopy"/>
-              <w:jc w:val="left"/>
-            </w:pPr>
-            <w:r>
-              <w:t>Parts cost</w:t>
-            </w:r>
-          </w:p>
-        </w:tc>
-        <w:tc>
-          <w:tcPr>
-            <w:tcW w:type="dxa" w:w="3180"/>
-          </w:tcPr>
-          <w:p>
-            <w:pPr>
-              <w:pStyle w:val="tablecopy"/>
-              <w:jc w:val="left"/>
-            </w:pPr>
-            <w:r>
-              <w:t>USD 4.74 per board at 5; ceiling USD 15</w:t>
+            <w:tcW w:type="dxa" w:w="1700"/>
+          </w:tcPr>
+          <w:p>
+            <w:pPr>
+              <w:pStyle w:val="tablecopy"/>
+              <w:jc w:val="left"/>
+            </w:pPr>
+            <w:r>
+              <w:t>Placement, private product</w:t>
+            </w:r>
+          </w:p>
+        </w:tc>
+        <w:tc>
+          <w:tcPr>
+            <w:tcW w:type="dxa" w:w="3080"/>
+          </w:tcPr>
+          <w:p>
+            <w:pPr>
+              <w:pStyle w:val="tablecopy"/>
+              <w:jc w:val="left"/>
+            </w:pPr>
+            <w:r>
+              <w:t>13 % shorter connections than the hand-written search</w:t>
             </w:r>
           </w:p>
         </w:tc>
@@ -866,37 +857,7 @@
       <w:tr>
         <w:tc>
           <w:tcPr>
-            <w:tcW w:type="dxa" w:w="1600"/>
-          </w:tcPr>
-          <w:p>
-            <w:pPr>
-              <w:pStyle w:val="tablecopy"/>
-              <w:jc w:val="left"/>
-            </w:pPr>
-            <w:r>
-              <w:t>One-line pin move</w:t>
-            </w:r>
-          </w:p>
-        </w:tc>
-        <w:tc>
-          <w:tcPr>
-            <w:tcW w:type="dxa" w:w="3180"/>
-          </w:tcPr>
-          <w:p>
-            <w:pPr>
-              <w:pStyle w:val="tablecopy"/>
-              <w:jc w:val="left"/>
-            </w:pPr>
-            <w:r>
-              <w:t>8 derived files rewritten in 31 s</w:t>
-            </w:r>
-          </w:p>
-        </w:tc>
-      </w:tr>
-      <w:tr>
-        <w:tc>
-          <w:tcPr>
-            <w:tcW w:type="dxa" w:w="1600"/>
+            <w:tcW w:type="dxa" w:w="1700"/>
           </w:tcPr>
           <w:p>
             <w:pPr>
@@ -910,15 +871,15 @@
         </w:tc>
         <w:tc>
           <w:tcPr>
-            <w:tcW w:type="dxa" w:w="3180"/>
-          </w:tcPr>
-          <w:p>
-            <w:pPr>
-              <w:pStyle w:val="tablecopy"/>
-              <w:jc w:val="left"/>
-            </w:pPr>
-            <w:r>
-              <w:t>reported as a minimal set of named declarations</w:t>
+            <w:tcW w:type="dxa" w:w="3080"/>
+          </w:tcPr>
+          <w:p>
+            <w:pPr>
+              <w:pStyle w:val="tablecopy"/>
+              <w:jc w:val="left"/>
+            </w:pPr>
+            <w:r>
+              <w:t>named as the smallest conflicting set</w:t>
             </w:r>
           </w:p>
         </w:tc>
@@ -932,22 +893,6 @@
     </w:p>
     <w:p>
       <w:pPr>
-        <w:pStyle w:val="BodyText"/>
-      </w:pPr>
-      <w:r>
-        <w:t>To measure how a change spreads, the sensor’s data line was moved from GPIO4 to GPIO8, one line in the declaration. Before deriving, --check failed the build (Fig. 3, case 1). A single fid derive then rewrote eight derived files in 31 s on a cloud container, among them the board, the schematic, the firmware pin map and the web types. The firmware and the page needed no edit.</w:t>
-      </w:r>
-    </w:p>
-    <w:p>
-      <w:pPr>
-        <w:pStyle w:val="BodyText"/>
-      </w:pPr>
-      <w:r>
-        <w:t>Two findings changed the platform during this work. CP-SAT run with several worker threads gave different answers on the same input, even with deterministic time limits. Since every artifact is checked by hash, placement now runs on one worker with large-neighbourhood search, which repeats exactly and, starting from the previous answer, also found shorter connections. Freerouting is not deterministic either, so the routed board is checked (DRC passes and the nets match the declaration) rather than compared byte for byte, and a product can keep a hand-routed board that the build checks against its declaration.</w:t>
-      </w:r>
-    </w:p>
-    <w:p>
-      <w:pPr>
         <w:pStyle w:val="Heading2"/>
         <w:keepNext/>
       </w:pPr>
@@ -960,7 +905,15 @@
         <w:pStyle w:val="BodyText"/>
       </w:pPr>
       <w:r>
-        <w:t>The measurements show that derivation works when it is used correctly. To see what happens when a person or an agent makes the mistakes that cause drift, 20 realistic mistakes were injected into two products, one at a time, and the gates were run in the same order as in CI. The products were the sensor stick and a fresh test product in English and Serbian with ten software capabilities turned on. Three correct changes and two no-change controls checked that the gates do not fail without a reason. Everything ran on release 0.9.4. Table II lists the mistakes.</w:t>
+        <w:t>Checks are only worth having if they catch the mistakes people actually make. To measure that, the test follows the idea of mutation testing [12]: inject a realistic mistake, run the checks, and see whether they notice. Twenty mistakes were chosen to cover the eight kinds of drift met while building Fiducial and its products (Table II): ten in a fresh web product in English and Serbian with ten software capabilities, and ten in the sensor stick’s hardware, firmware and interface. Each is applied to a clean copy, the checks run in the same order as in CI – derive, --check, the firmware build and tests, the page’s test and type check – and the copy is reset. Three correct changes and two runs with no change test the other direction: that the checks do not fail without a reason. The test is a script in the repository and runs with one command.</w:t>
+      </w:r>
+    </w:p>
+    <w:p>
+      <w:pPr>
+        <w:pStyle w:val="BodyText"/>
+      </w:pPr>
+      <w:r>
+        <w:t>On release 0.9.4 the checks caught 15 of the 20. The five misses were not random: each was a fact the platform did not yet own. Two declarations edited without re-deriving went unnoticed, because only the hardware pipeline listed the files it read. Firmware that named a pin by its number kept compiling after the pin moved. A mistyped sensor address existed only in the firmware. A Serbian string left in English passed every structural check. And the firmware and the page disagreeing on a message layout was caught only by a hand-written test.</w:t>
       </w:r>
     </w:p>
     <w:p>
@@ -969,12 +922,12 @@
         <w:keepNext/>
       </w:pPr>
       <w:r>
-        <w:t>Injected Mistakes and Where They Were Caught</w:t>
+        <w:t>Injected Mistakes, by Kind of Drift</w:t>
       </w:r>
     </w:p>
     <w:tbl>
       <w:tblPr>
-        <w:tblW w:type="dxa" w:w="4780"/>
+        <w:tblW w:type="dxa" w:w="4760"/>
         <w:jc w:val="center"/>
         <w:tblLook w:firstColumn="1" w:firstRow="1" w:lastColumn="0" w:lastRow="0" w:noHBand="0" w:noVBand="1" w:val="04A0"/>
         <w:tblLayout w:type="fixed"/>
@@ -988,14 +941,14 @@
         </w:tblBorders>
       </w:tblPr>
       <w:tblGrid>
-        <w:gridCol w:w="1000"/>
-        <w:gridCol w:w="2220"/>
-        <w:gridCol w:w="1560"/>
+        <w:gridCol w:w="2560"/>
+        <w:gridCol w:w="1100"/>
+        <w:gridCol w:w="1100"/>
       </w:tblGrid>
       <w:tr>
         <w:tc>
           <w:tcPr>
-            <w:tcW w:type="dxa" w:w="1000"/>
+            <w:tcW w:type="dxa" w:w="2560"/>
           </w:tcPr>
           <w:p>
             <w:pPr>
@@ -1003,13 +956,13 @@
               <w:jc w:val="left"/>
             </w:pPr>
             <w:r>
-              <w:t>Area</w:t>
-            </w:r>
-          </w:p>
-        </w:tc>
-        <w:tc>
-          <w:tcPr>
-            <w:tcW w:type="dxa" w:w="2220"/>
+              <w:t>Mistake</w:t>
+            </w:r>
+          </w:p>
+        </w:tc>
+        <w:tc>
+          <w:tcPr>
+            <w:tcW w:type="dxa" w:w="1100"/>
           </w:tcPr>
           <w:p>
             <w:pPr>
@@ -1017,13 +970,13 @@
               <w:jc w:val="left"/>
             </w:pPr>
             <w:r>
-              <w:t>Mistake</w:t>
-            </w:r>
-          </w:p>
-        </w:tc>
-        <w:tc>
-          <w:tcPr>
-            <w:tcW w:type="dxa" w:w="1560"/>
+              <w:t>0.9.4</w:t>
+            </w:r>
+          </w:p>
+        </w:tc>
+        <w:tc>
+          <w:tcPr>
+            <w:tcW w:type="dxa" w:w="1100"/>
           </w:tcPr>
           <w:p>
             <w:pPr>
@@ -1031,7 +984,7 @@
               <w:jc w:val="left"/>
             </w:pPr>
             <w:r>
-              <w:t>Caught by</w:t>
+              <w:t>Now</w:t>
             </w:r>
           </w:p>
         </w:tc>
@@ -1039,43 +992,19 @@
       <w:tr>
         <w:tc>
           <w:tcPr>
-            <w:tcW w:type="dxa" w:w="1000"/>
-          </w:tcPr>
-          <w:p>
-            <w:pPr>
-              <w:pStyle w:val="tablecopy"/>
-              <w:jc w:val="left"/>
-            </w:pPr>
-            <w:r>
-              <w:t>i18n</w:t>
-            </w:r>
-          </w:p>
-        </w:tc>
-        <w:tc>
-          <w:tcPr>
-            <w:tcW w:type="dxa" w:w="2220"/>
-          </w:tcPr>
-          <w:p>
-            <w:pPr>
-              <w:pStyle w:val="tablecopy"/>
-              <w:jc w:val="left"/>
-            </w:pPr>
-            <w:r>
-              <w:t>String added in English only</w:t>
-            </w:r>
-          </w:p>
-        </w:tc>
-        <w:tc>
-          <w:tcPr>
-            <w:tcW w:type="dxa" w:w="1560"/>
-          </w:tcPr>
-          <w:p>
-            <w:pPr>
-              <w:pStyle w:val="tablecopy"/>
-              <w:jc w:val="left"/>
-            </w:pPr>
-            <w:r>
-              <w:t>derive: missing in sr</w:t>
+            <w:tcW w:type="dxa" w:w="10119"/>
+            <w:gridSpan w:val="3"/>
+          </w:tcPr>
+          <w:p>
+            <w:pPr>
+              <w:pStyle w:val="tablecopy"/>
+              <w:jc w:val="left"/>
+            </w:pPr>
+            <w:r>
+              <w:rPr>
+                <w:i/>
+              </w:rPr>
+              <w:t>Stale output</w:t>
             </w:r>
           </w:p>
         </w:tc>
@@ -1083,21 +1012,7 @@
       <w:tr>
         <w:tc>
           <w:tcPr>
-            <w:tcW w:type="dxa" w:w="1000"/>
-          </w:tcPr>
-          <w:p>
-            <w:pPr>
-              <w:pStyle w:val="tablecopy"/>
-              <w:jc w:val="left"/>
-            </w:pPr>
-            <w:r>
-              <w:t>i18n</w:t>
-            </w:r>
-          </w:p>
-        </w:tc>
-        <w:tc>
-          <w:tcPr>
-            <w:tcW w:type="dxa" w:w="2220"/>
+            <w:tcW w:type="dxa" w:w="2560"/>
           </w:tcPr>
           <w:p>
             <w:pPr>
@@ -1111,7 +1026,7 @@
         </w:tc>
         <w:tc>
           <w:tcPr>
-            <w:tcW w:type="dxa" w:w="1560"/>
+            <w:tcW w:type="dxa" w:w="1100"/>
           </w:tcPr>
           <w:p>
             <w:pPr>
@@ -1120,6 +1035,20 @@
             </w:pPr>
             <w:r>
               <w:t>not caught</w:t>
+            </w:r>
+          </w:p>
+        </w:tc>
+        <w:tc>
+          <w:tcPr>
+            <w:tcW w:type="dxa" w:w="1100"/>
+          </w:tcPr>
+          <w:p>
+            <w:pPr>
+              <w:pStyle w:val="tablecopy"/>
+              <w:jc w:val="left"/>
+            </w:pPr>
+            <w:r>
+              <w:t>‑‑check</w:t>
             </w:r>
           </w:p>
         </w:tc>
@@ -1127,43 +1056,43 @@
       <w:tr>
         <w:tc>
           <w:tcPr>
-            <w:tcW w:type="dxa" w:w="1000"/>
-          </w:tcPr>
-          <w:p>
-            <w:pPr>
-              <w:pStyle w:val="tablecopy"/>
-              <w:jc w:val="left"/>
-            </w:pPr>
-            <w:r>
-              <w:t>i18n</w:t>
-            </w:r>
-          </w:p>
-        </w:tc>
-        <w:tc>
-          <w:tcPr>
-            <w:tcW w:type="dxa" w:w="2220"/>
-          </w:tcPr>
-          <w:p>
-            <w:pPr>
-              <w:pStyle w:val="tablecopy"/>
-              <w:jc w:val="left"/>
-            </w:pPr>
-            <w:r>
-              <w:t>Derived message module edited by hand</w:t>
-            </w:r>
-          </w:p>
-        </w:tc>
-        <w:tc>
-          <w:tcPr>
-            <w:tcW w:type="dxa" w:w="1560"/>
-          </w:tcPr>
-          <w:p>
-            <w:pPr>
-              <w:pStyle w:val="tablecopy"/>
-              <w:jc w:val="left"/>
-            </w:pPr>
-            <w:r>
-              <w:t>--check</w:t>
+            <w:tcW w:type="dxa" w:w="2560"/>
+          </w:tcPr>
+          <w:p>
+            <w:pPr>
+              <w:pStyle w:val="tablecopy"/>
+              <w:jc w:val="left"/>
+            </w:pPr>
+            <w:r>
+              <w:t>Domain changed, not re-derived</w:t>
+            </w:r>
+          </w:p>
+        </w:tc>
+        <w:tc>
+          <w:tcPr>
+            <w:tcW w:type="dxa" w:w="1100"/>
+          </w:tcPr>
+          <w:p>
+            <w:pPr>
+              <w:pStyle w:val="tablecopy"/>
+              <w:jc w:val="left"/>
+            </w:pPr>
+            <w:r>
+              <w:t>not caught</w:t>
+            </w:r>
+          </w:p>
+        </w:tc>
+        <w:tc>
+          <w:tcPr>
+            <w:tcW w:type="dxa" w:w="1100"/>
+          </w:tcPr>
+          <w:p>
+            <w:pPr>
+              <w:pStyle w:val="tablecopy"/>
+              <w:jc w:val="left"/>
+            </w:pPr>
+            <w:r>
+              <w:t>‑‑check</w:t>
             </w:r>
           </w:p>
         </w:tc>
@@ -1171,43 +1100,43 @@
       <w:tr>
         <w:tc>
           <w:tcPr>
-            <w:tcW w:type="dxa" w:w="1000"/>
-          </w:tcPr>
-          <w:p>
-            <w:pPr>
-              <w:pStyle w:val="tablecopy"/>
-              <w:jc w:val="left"/>
-            </w:pPr>
-            <w:r>
-              <w:t>content</w:t>
-            </w:r>
-          </w:p>
-        </w:tc>
-        <w:tc>
-          <w:tcPr>
-            <w:tcW w:type="dxa" w:w="2220"/>
-          </w:tcPr>
-          <w:p>
-            <w:pPr>
-              <w:pStyle w:val="tablecopy"/>
-              <w:jc w:val="left"/>
-            </w:pPr>
-            <w:r>
-              <w:t>Post published in English only</w:t>
-            </w:r>
-          </w:p>
-        </w:tc>
-        <w:tc>
-          <w:tcPr>
-            <w:tcW w:type="dxa" w:w="1560"/>
-          </w:tcPr>
-          <w:p>
-            <w:pPr>
-              <w:pStyle w:val="tablecopy"/>
-              <w:jc w:val="left"/>
-            </w:pPr>
-            <w:r>
-              <w:t>derive: missing in sr</w:t>
+            <w:tcW w:type="dxa" w:w="2560"/>
+          </w:tcPr>
+          <w:p>
+            <w:pPr>
+              <w:pStyle w:val="tablecopy"/>
+              <w:jc w:val="left"/>
+            </w:pPr>
+            <w:r>
+              <w:t>Sensor pin moved, not re-derived</w:t>
+            </w:r>
+          </w:p>
+        </w:tc>
+        <w:tc>
+          <w:tcPr>
+            <w:tcW w:type="dxa" w:w="1100"/>
+          </w:tcPr>
+          <w:p>
+            <w:pPr>
+              <w:pStyle w:val="tablecopy"/>
+              <w:jc w:val="left"/>
+            </w:pPr>
+            <w:r>
+              <w:t>‑‑check</w:t>
+            </w:r>
+          </w:p>
+        </w:tc>
+        <w:tc>
+          <w:tcPr>
+            <w:tcW w:type="dxa" w:w="1100"/>
+          </w:tcPr>
+          <w:p>
+            <w:pPr>
+              <w:pStyle w:val="tablecopy"/>
+              <w:jc w:val="left"/>
+            </w:pPr>
+            <w:r>
+              <w:t>‑‑check</w:t>
             </w:r>
           </w:p>
         </w:tc>
@@ -1215,43 +1144,19 @@
       <w:tr>
         <w:tc>
           <w:tcPr>
-            <w:tcW w:type="dxa" w:w="1000"/>
-          </w:tcPr>
-          <w:p>
-            <w:pPr>
-              <w:pStyle w:val="tablecopy"/>
-              <w:jc w:val="left"/>
-            </w:pPr>
-            <w:r>
-              <w:t>SEO</w:t>
-            </w:r>
-          </w:p>
-        </w:tc>
-        <w:tc>
-          <w:tcPr>
-            <w:tcW w:type="dxa" w:w="2220"/>
-          </w:tcPr>
-          <w:p>
-            <w:pPr>
-              <w:pStyle w:val="tablecopy"/>
-              <w:jc w:val="left"/>
-            </w:pPr>
-            <w:r>
-              <w:t>Page without title or description</w:t>
-            </w:r>
-          </w:p>
-        </w:tc>
-        <w:tc>
-          <w:tcPr>
-            <w:tcW w:type="dxa" w:w="1560"/>
-          </w:tcPr>
-          <w:p>
-            <w:pPr>
-              <w:pStyle w:val="tablecopy"/>
-              <w:jc w:val="left"/>
-            </w:pPr>
-            <w:r>
-              <w:t>derive: no metadata</w:t>
+            <w:tcW w:type="dxa" w:w="10119"/>
+            <w:gridSpan w:val="3"/>
+          </w:tcPr>
+          <w:p>
+            <w:pPr>
+              <w:pStyle w:val="tablecopy"/>
+              <w:jc w:val="left"/>
+            </w:pPr>
+            <w:r>
+              <w:rPr>
+                <w:i/>
+              </w:rPr>
+              <w:t>Generated file edited</w:t>
             </w:r>
           </w:p>
         </w:tc>
@@ -1259,43 +1164,43 @@
       <w:tr>
         <w:tc>
           <w:tcPr>
-            <w:tcW w:type="dxa" w:w="1000"/>
-          </w:tcPr>
-          <w:p>
-            <w:pPr>
-              <w:pStyle w:val="tablecopy"/>
-              <w:jc w:val="left"/>
-            </w:pPr>
-            <w:r>
-              <w:t>brand</w:t>
-            </w:r>
-          </w:p>
-        </w:tc>
-        <w:tc>
-          <w:tcPr>
-            <w:tcW w:type="dxa" w:w="2220"/>
-          </w:tcPr>
-          <w:p>
-            <w:pPr>
-              <w:pStyle w:val="tablecopy"/>
-              <w:jc w:val="left"/>
-            </w:pPr>
-            <w:r>
-              <w:t>Domain changed, not re-derived</w:t>
-            </w:r>
-          </w:p>
-        </w:tc>
-        <w:tc>
-          <w:tcPr>
-            <w:tcW w:type="dxa" w:w="1560"/>
-          </w:tcPr>
-          <w:p>
-            <w:pPr>
-              <w:pStyle w:val="tablecopy"/>
-              <w:jc w:val="left"/>
-            </w:pPr>
-            <w:r>
-              <w:t>not caught</w:t>
+            <w:tcW w:type="dxa" w:w="2560"/>
+          </w:tcPr>
+          <w:p>
+            <w:pPr>
+              <w:pStyle w:val="tablecopy"/>
+              <w:jc w:val="left"/>
+            </w:pPr>
+            <w:r>
+              <w:t>Message module edited</w:t>
+            </w:r>
+          </w:p>
+        </w:tc>
+        <w:tc>
+          <w:tcPr>
+            <w:tcW w:type="dxa" w:w="1100"/>
+          </w:tcPr>
+          <w:p>
+            <w:pPr>
+              <w:pStyle w:val="tablecopy"/>
+              <w:jc w:val="left"/>
+            </w:pPr>
+            <w:r>
+              <w:t>‑‑check</w:t>
+            </w:r>
+          </w:p>
+        </w:tc>
+        <w:tc>
+          <w:tcPr>
+            <w:tcW w:type="dxa" w:w="1100"/>
+          </w:tcPr>
+          <w:p>
+            <w:pPr>
+              <w:pStyle w:val="tablecopy"/>
+              <w:jc w:val="left"/>
+            </w:pPr>
+            <w:r>
+              <w:t>‑‑check</w:t>
             </w:r>
           </w:p>
         </w:tc>
@@ -1303,43 +1208,43 @@
       <w:tr>
         <w:tc>
           <w:tcPr>
-            <w:tcW w:type="dxa" w:w="1000"/>
-          </w:tcPr>
-          <w:p>
-            <w:pPr>
-              <w:pStyle w:val="tablecopy"/>
-              <w:jc w:val="left"/>
-            </w:pPr>
-            <w:r>
-              <w:t>deploy</w:t>
-            </w:r>
-          </w:p>
-        </w:tc>
-        <w:tc>
-          <w:tcPr>
-            <w:tcW w:type="dxa" w:w="2220"/>
-          </w:tcPr>
-          <w:p>
-            <w:pPr>
-              <w:pStyle w:val="tablecopy"/>
-              <w:jc w:val="left"/>
-            </w:pPr>
-            <w:r>
-              <w:t>Derived Worker config edited by hand</w:t>
-            </w:r>
-          </w:p>
-        </w:tc>
-        <w:tc>
-          <w:tcPr>
-            <w:tcW w:type="dxa" w:w="1560"/>
-          </w:tcPr>
-          <w:p>
-            <w:pPr>
-              <w:pStyle w:val="tablecopy"/>
-              <w:jc w:val="left"/>
-            </w:pPr>
-            <w:r>
-              <w:t>--check</w:t>
+            <w:tcW w:type="dxa" w:w="2560"/>
+          </w:tcPr>
+          <w:p>
+            <w:pPr>
+              <w:pStyle w:val="tablecopy"/>
+              <w:jc w:val="left"/>
+            </w:pPr>
+            <w:r>
+              <w:t>Worker config edited</w:t>
+            </w:r>
+          </w:p>
+        </w:tc>
+        <w:tc>
+          <w:tcPr>
+            <w:tcW w:type="dxa" w:w="1100"/>
+          </w:tcPr>
+          <w:p>
+            <w:pPr>
+              <w:pStyle w:val="tablecopy"/>
+              <w:jc w:val="left"/>
+            </w:pPr>
+            <w:r>
+              <w:t>‑‑check</w:t>
+            </w:r>
+          </w:p>
+        </w:tc>
+        <w:tc>
+          <w:tcPr>
+            <w:tcW w:type="dxa" w:w="1100"/>
+          </w:tcPr>
+          <w:p>
+            <w:pPr>
+              <w:pStyle w:val="tablecopy"/>
+              <w:jc w:val="left"/>
+            </w:pPr>
+            <w:r>
+              <w:t>‑‑check</w:t>
             </w:r>
           </w:p>
         </w:tc>
@@ -1347,43 +1252,43 @@
       <w:tr>
         <w:tc>
           <w:tcPr>
-            <w:tcW w:type="dxa" w:w="1000"/>
-          </w:tcPr>
-          <w:p>
-            <w:pPr>
-              <w:pStyle w:val="tablecopy"/>
-              <w:jc w:val="left"/>
-            </w:pPr>
-            <w:r>
-              <w:t>design</w:t>
-            </w:r>
-          </w:p>
-        </w:tc>
-        <w:tc>
-          <w:tcPr>
-            <w:tcW w:type="dxa" w:w="2220"/>
-          </w:tcPr>
-          <w:p>
-            <w:pPr>
-              <w:pStyle w:val="tablecopy"/>
-              <w:jc w:val="left"/>
-            </w:pPr>
-            <w:r>
-              <w:t>Text below 4.5 : 1 contrast</w:t>
-            </w:r>
-          </w:p>
-        </w:tc>
-        <w:tc>
-          <w:tcPr>
-            <w:tcW w:type="dxa" w:w="1560"/>
-          </w:tcPr>
-          <w:p>
-            <w:pPr>
-              <w:pStyle w:val="tablecopy"/>
-              <w:jc w:val="left"/>
-            </w:pPr>
-            <w:r>
-              <w:t>derive: palette check</w:t>
+            <w:tcW w:type="dxa" w:w="2560"/>
+          </w:tcPr>
+          <w:p>
+            <w:pPr>
+              <w:pStyle w:val="tablecopy"/>
+              <w:jc w:val="left"/>
+            </w:pPr>
+            <w:r>
+              <w:t>Applied migration edited</w:t>
+            </w:r>
+          </w:p>
+        </w:tc>
+        <w:tc>
+          <w:tcPr>
+            <w:tcW w:type="dxa" w:w="1100"/>
+          </w:tcPr>
+          <w:p>
+            <w:pPr>
+              <w:pStyle w:val="tablecopy"/>
+              <w:jc w:val="left"/>
+            </w:pPr>
+            <w:r>
+              <w:t>‑‑check</w:t>
+            </w:r>
+          </w:p>
+        </w:tc>
+        <w:tc>
+          <w:tcPr>
+            <w:tcW w:type="dxa" w:w="1100"/>
+          </w:tcPr>
+          <w:p>
+            <w:pPr>
+              <w:pStyle w:val="tablecopy"/>
+              <w:jc w:val="left"/>
+            </w:pPr>
+            <w:r>
+              <w:t>‑‑check</w:t>
             </w:r>
           </w:p>
         </w:tc>
@@ -1391,43 +1296,43 @@
       <w:tr>
         <w:tc>
           <w:tcPr>
-            <w:tcW w:type="dxa" w:w="1000"/>
-          </w:tcPr>
-          <w:p>
-            <w:pPr>
-              <w:pStyle w:val="tablecopy"/>
-              <w:jc w:val="left"/>
-            </w:pPr>
-            <w:r>
-              <w:t>database</w:t>
-            </w:r>
-          </w:p>
-        </w:tc>
-        <w:tc>
-          <w:tcPr>
-            <w:tcW w:type="dxa" w:w="2220"/>
-          </w:tcPr>
-          <w:p>
-            <w:pPr>
-              <w:pStyle w:val="tablecopy"/>
-              <w:jc w:val="left"/>
-            </w:pPr>
-            <w:r>
-              <w:t>Applied migration edited</w:t>
-            </w:r>
-          </w:p>
-        </w:tc>
-        <w:tc>
-          <w:tcPr>
-            <w:tcW w:type="dxa" w:w="1560"/>
-          </w:tcPr>
-          <w:p>
-            <w:pPr>
-              <w:pStyle w:val="tablecopy"/>
-              <w:jc w:val="left"/>
-            </w:pPr>
-            <w:r>
-              <w:t>--check</w:t>
+            <w:tcW w:type="dxa" w:w="2560"/>
+          </w:tcPr>
+          <w:p>
+            <w:pPr>
+              <w:pStyle w:val="tablecopy"/>
+              <w:jc w:val="left"/>
+            </w:pPr>
+            <w:r>
+              <w:t>Firmware pin map edited</w:t>
+            </w:r>
+          </w:p>
+        </w:tc>
+        <w:tc>
+          <w:tcPr>
+            <w:tcW w:type="dxa" w:w="1100"/>
+          </w:tcPr>
+          <w:p>
+            <w:pPr>
+              <w:pStyle w:val="tablecopy"/>
+              <w:jc w:val="left"/>
+            </w:pPr>
+            <w:r>
+              <w:t>‑‑check</w:t>
+            </w:r>
+          </w:p>
+        </w:tc>
+        <w:tc>
+          <w:tcPr>
+            <w:tcW w:type="dxa" w:w="1100"/>
+          </w:tcPr>
+          <w:p>
+            <w:pPr>
+              <w:pStyle w:val="tablecopy"/>
+              <w:jc w:val="left"/>
+            </w:pPr>
+            <w:r>
+              <w:t>‑‑check</w:t>
             </w:r>
           </w:p>
         </w:tc>
@@ -1435,43 +1340,43 @@
       <w:tr>
         <w:tc>
           <w:tcPr>
-            <w:tcW w:type="dxa" w:w="1000"/>
-          </w:tcPr>
-          <w:p>
-            <w:pPr>
-              <w:pStyle w:val="tablecopy"/>
-              <w:jc w:val="left"/>
-            </w:pPr>
-            <w:r>
-              <w:t>i18n</w:t>
-            </w:r>
-          </w:p>
-        </w:tc>
-        <w:tc>
-          <w:tcPr>
-            <w:tcW w:type="dxa" w:w="2220"/>
-          </w:tcPr>
-          <w:p>
-            <w:pPr>
-              <w:pStyle w:val="tablecopy"/>
-              <w:jc w:val="left"/>
-            </w:pPr>
-            <w:r>
-              <w:t>Serbian string left in English</w:t>
-            </w:r>
-          </w:p>
-        </w:tc>
-        <w:tc>
-          <w:tcPr>
-            <w:tcW w:type="dxa" w:w="1560"/>
-          </w:tcPr>
-          <w:p>
-            <w:pPr>
-              <w:pStyle w:val="tablecopy"/>
-              <w:jc w:val="left"/>
-            </w:pPr>
-            <w:r>
-              <w:t>not caught</w:t>
+            <w:tcW w:type="dxa" w:w="2560"/>
+          </w:tcPr>
+          <w:p>
+            <w:pPr>
+              <w:pStyle w:val="tablecopy"/>
+              <w:jc w:val="left"/>
+            </w:pPr>
+            <w:r>
+              <w:t>Message layout changed in firmware</w:t>
+            </w:r>
+          </w:p>
+        </w:tc>
+        <w:tc>
+          <w:tcPr>
+            <w:tcW w:type="dxa" w:w="1100"/>
+          </w:tcPr>
+          <w:p>
+            <w:pPr>
+              <w:pStyle w:val="tablecopy"/>
+              <w:jc w:val="left"/>
+            </w:pPr>
+            <w:r>
+              <w:t>test only</w:t>
+            </w:r>
+          </w:p>
+        </w:tc>
+        <w:tc>
+          <w:tcPr>
+            <w:tcW w:type="dxa" w:w="1100"/>
+          </w:tcPr>
+          <w:p>
+            <w:pPr>
+              <w:pStyle w:val="tablecopy"/>
+              <w:jc w:val="left"/>
+            </w:pPr>
+            <w:r>
+              <w:t>‑‑check</w:t>
             </w:r>
           </w:p>
         </w:tc>
@@ -1479,43 +1384,19 @@
       <w:tr>
         <w:tc>
           <w:tcPr>
-            <w:tcW w:type="dxa" w:w="1000"/>
-          </w:tcPr>
-          <w:p>
-            <w:pPr>
-              <w:pStyle w:val="tablecopy"/>
-              <w:jc w:val="left"/>
-            </w:pPr>
-            <w:r>
-              <w:t>hardware</w:t>
-            </w:r>
-          </w:p>
-        </w:tc>
-        <w:tc>
-          <w:tcPr>
-            <w:tcW w:type="dxa" w:w="2220"/>
-          </w:tcPr>
-          <w:p>
-            <w:pPr>
-              <w:pStyle w:val="tablecopy"/>
-              <w:jc w:val="left"/>
-            </w:pPr>
-            <w:r>
-              <w:t>Sensor pin moved, not re-derived</w:t>
-            </w:r>
-          </w:p>
-        </w:tc>
-        <w:tc>
-          <w:tcPr>
-            <w:tcW w:type="dxa" w:w="1560"/>
-          </w:tcPr>
-          <w:p>
-            <w:pPr>
-              <w:pStyle w:val="tablecopy"/>
-              <w:jc w:val="left"/>
-            </w:pPr>
-            <w:r>
-              <w:t>--check</w:t>
+            <w:tcW w:type="dxa" w:w="10119"/>
+            <w:gridSpan w:val="3"/>
+          </w:tcPr>
+          <w:p>
+            <w:pPr>
+              <w:pStyle w:val="tablecopy"/>
+              <w:jc w:val="left"/>
+            </w:pPr>
+            <w:r>
+              <w:rPr>
+                <w:i/>
+              </w:rPr>
+              <w:t>Incomplete declaration</w:t>
             </w:r>
           </w:p>
         </w:tc>
@@ -1523,43 +1404,43 @@
       <w:tr>
         <w:tc>
           <w:tcPr>
-            <w:tcW w:type="dxa" w:w="1000"/>
-          </w:tcPr>
-          <w:p>
-            <w:pPr>
-              <w:pStyle w:val="tablecopy"/>
-              <w:jc w:val="left"/>
-            </w:pPr>
-            <w:r>
-              <w:t>firmware</w:t>
-            </w:r>
-          </w:p>
-        </w:tc>
-        <w:tc>
-          <w:tcPr>
-            <w:tcW w:type="dxa" w:w="2220"/>
-          </w:tcPr>
-          <w:p>
-            <w:pPr>
-              <w:pStyle w:val="tablecopy"/>
-              <w:jc w:val="left"/>
-            </w:pPr>
-            <w:r>
-              <w:t>Derived pin map edited by hand</w:t>
-            </w:r>
-          </w:p>
-        </w:tc>
-        <w:tc>
-          <w:tcPr>
-            <w:tcW w:type="dxa" w:w="1560"/>
-          </w:tcPr>
-          <w:p>
-            <w:pPr>
-              <w:pStyle w:val="tablecopy"/>
-              <w:jc w:val="left"/>
-            </w:pPr>
-            <w:r>
-              <w:t>--check, compiler</w:t>
+            <w:tcW w:type="dxa" w:w="2560"/>
+          </w:tcPr>
+          <w:p>
+            <w:pPr>
+              <w:pStyle w:val="tablecopy"/>
+              <w:jc w:val="left"/>
+            </w:pPr>
+            <w:r>
+              <w:t>String added in English only</w:t>
+            </w:r>
+          </w:p>
+        </w:tc>
+        <w:tc>
+          <w:tcPr>
+            <w:tcW w:type="dxa" w:w="1100"/>
+          </w:tcPr>
+          <w:p>
+            <w:pPr>
+              <w:pStyle w:val="tablecopy"/>
+              <w:jc w:val="left"/>
+            </w:pPr>
+            <w:r>
+              <w:t>derive</w:t>
+            </w:r>
+          </w:p>
+        </w:tc>
+        <w:tc>
+          <w:tcPr>
+            <w:tcW w:type="dxa" w:w="1100"/>
+          </w:tcPr>
+          <w:p>
+            <w:pPr>
+              <w:pStyle w:val="tablecopy"/>
+              <w:jc w:val="left"/>
+            </w:pPr>
+            <w:r>
+              <w:t>derive</w:t>
             </w:r>
           </w:p>
         </w:tc>
@@ -1567,43 +1448,43 @@
       <w:tr>
         <w:tc>
           <w:tcPr>
-            <w:tcW w:type="dxa" w:w="1000"/>
-          </w:tcPr>
-          <w:p>
-            <w:pPr>
-              <w:pStyle w:val="tablecopy"/>
-              <w:jc w:val="left"/>
-            </w:pPr>
-            <w:r>
-              <w:t>circuit</w:t>
-            </w:r>
-          </w:p>
-        </w:tc>
-        <w:tc>
-          <w:tcPr>
-            <w:tcW w:type="dxa" w:w="2220"/>
-          </w:tcPr>
-          <w:p>
-            <w:pPr>
-              <w:pStyle w:val="tablecopy"/>
-              <w:jc w:val="left"/>
-            </w:pPr>
-            <w:r>
-              <w:t>USB-C pull-down 5.1 kΩ → 22 kΩ</w:t>
-            </w:r>
-          </w:p>
-        </w:tc>
-        <w:tc>
-          <w:tcPr>
-            <w:tcW w:type="dxa" w:w="1560"/>
-          </w:tcPr>
-          <w:p>
-            <w:pPr>
-              <w:pStyle w:val="tablecopy"/>
-              <w:jc w:val="left"/>
-            </w:pPr>
-            <w:r>
-              <w:t>derive: set points</w:t>
+            <w:tcW w:type="dxa" w:w="2560"/>
+          </w:tcPr>
+          <w:p>
+            <w:pPr>
+              <w:pStyle w:val="tablecopy"/>
+              <w:jc w:val="left"/>
+            </w:pPr>
+            <w:r>
+              <w:t>Post published in English only</w:t>
+            </w:r>
+          </w:p>
+        </w:tc>
+        <w:tc>
+          <w:tcPr>
+            <w:tcW w:type="dxa" w:w="1100"/>
+          </w:tcPr>
+          <w:p>
+            <w:pPr>
+              <w:pStyle w:val="tablecopy"/>
+              <w:jc w:val="left"/>
+            </w:pPr>
+            <w:r>
+              <w:t>derive</w:t>
+            </w:r>
+          </w:p>
+        </w:tc>
+        <w:tc>
+          <w:tcPr>
+            <w:tcW w:type="dxa" w:w="1100"/>
+          </w:tcPr>
+          <w:p>
+            <w:pPr>
+              <w:pStyle w:val="tablecopy"/>
+              <w:jc w:val="left"/>
+            </w:pPr>
+            <w:r>
+              <w:t>derive</w:t>
             </w:r>
           </w:p>
         </w:tc>
@@ -1611,43 +1492,43 @@
       <w:tr>
         <w:tc>
           <w:tcPr>
-            <w:tcW w:type="dxa" w:w="1000"/>
-          </w:tcPr>
-          <w:p>
-            <w:pPr>
-              <w:pStyle w:val="tablecopy"/>
-              <w:jc w:val="left"/>
-            </w:pPr>
-            <w:r>
-              <w:t>placement</w:t>
-            </w:r>
-          </w:p>
-        </w:tc>
-        <w:tc>
-          <w:tcPr>
-            <w:tcW w:type="dxa" w:w="2220"/>
-          </w:tcPr>
-          <w:p>
-            <w:pPr>
-              <w:pStyle w:val="tablecopy"/>
-              <w:jc w:val="left"/>
-            </w:pPr>
-            <w:r>
-              <w:t>Sensor zone contradicts its vent</w:t>
-            </w:r>
-          </w:p>
-        </w:tc>
-        <w:tc>
-          <w:tcPr>
-            <w:tcW w:type="dxa" w:w="1560"/>
-          </w:tcPr>
-          <w:p>
-            <w:pPr>
-              <w:pStyle w:val="tablecopy"/>
-              <w:jc w:val="left"/>
-            </w:pPr>
-            <w:r>
-              <w:t>derive: conflict</w:t>
+            <w:tcW w:type="dxa" w:w="2560"/>
+          </w:tcPr>
+          <w:p>
+            <w:pPr>
+              <w:pStyle w:val="tablecopy"/>
+              <w:jc w:val="left"/>
+            </w:pPr>
+            <w:r>
+              <w:t>Page without a title</w:t>
+            </w:r>
+          </w:p>
+        </w:tc>
+        <w:tc>
+          <w:tcPr>
+            <w:tcW w:type="dxa" w:w="1100"/>
+          </w:tcPr>
+          <w:p>
+            <w:pPr>
+              <w:pStyle w:val="tablecopy"/>
+              <w:jc w:val="left"/>
+            </w:pPr>
+            <w:r>
+              <w:t>derive</w:t>
+            </w:r>
+          </w:p>
+        </w:tc>
+        <w:tc>
+          <w:tcPr>
+            <w:tcW w:type="dxa" w:w="1100"/>
+          </w:tcPr>
+          <w:p>
+            <w:pPr>
+              <w:pStyle w:val="tablecopy"/>
+              <w:jc w:val="left"/>
+            </w:pPr>
+            <w:r>
+              <w:t>derive</w:t>
             </w:r>
           </w:p>
         </w:tc>
@@ -1655,43 +1536,19 @@
       <w:tr>
         <w:tc>
           <w:tcPr>
-            <w:tcW w:type="dxa" w:w="1000"/>
-          </w:tcPr>
-          <w:p>
-            <w:pPr>
-              <w:pStyle w:val="tablecopy"/>
-              <w:jc w:val="left"/>
-            </w:pPr>
-            <w:r>
-              <w:t>cost</w:t>
-            </w:r>
-          </w:p>
-        </w:tc>
-        <w:tc>
-          <w:tcPr>
-            <w:tcW w:type="dxa" w:w="2220"/>
-          </w:tcPr>
-          <w:p>
-            <w:pPr>
-              <w:pStyle w:val="tablecopy"/>
-              <w:jc w:val="left"/>
-            </w:pPr>
-            <w:r>
-              <w:t>Ceiling lowered to USD 3</w:t>
-            </w:r>
-          </w:p>
-        </w:tc>
-        <w:tc>
-          <w:tcPr>
-            <w:tcW w:type="dxa" w:w="1560"/>
-          </w:tcPr>
-          <w:p>
-            <w:pPr>
-              <w:pStyle w:val="tablecopy"/>
-              <w:jc w:val="left"/>
-            </w:pPr>
-            <w:r>
-              <w:t>derive: cost ceiling</w:t>
+            <w:tcW w:type="dxa" w:w="10119"/>
+            <w:gridSpan w:val="3"/>
+          </w:tcPr>
+          <w:p>
+            <w:pPr>
+              <w:pStyle w:val="tablecopy"/>
+              <w:jc w:val="left"/>
+            </w:pPr>
+            <w:r>
+              <w:rPr>
+                <w:i/>
+              </w:rPr>
+              <w:t>Declaration breaks a rule</w:t>
             </w:r>
           </w:p>
         </w:tc>
@@ -1699,43 +1556,43 @@
       <w:tr>
         <w:tc>
           <w:tcPr>
-            <w:tcW w:type="dxa" w:w="1000"/>
-          </w:tcPr>
-          <w:p>
-            <w:pPr>
-              <w:pStyle w:val="tablecopy"/>
-              <w:jc w:val="left"/>
-            </w:pPr>
-            <w:r>
-              <w:t>interface</w:t>
-            </w:r>
-          </w:p>
-        </w:tc>
-        <w:tc>
-          <w:tcPr>
-            <w:tcW w:type="dxa" w:w="2220"/>
-          </w:tcPr>
-          <w:p>
-            <w:pPr>
-              <w:pStyle w:val="tablecopy"/>
-              <w:jc w:val="left"/>
-            </w:pPr>
-            <w:r>
-              <w:t>Net renamed, code not updated</w:t>
-            </w:r>
-          </w:p>
-        </w:tc>
-        <w:tc>
-          <w:tcPr>
-            <w:tcW w:type="dxa" w:w="1560"/>
-          </w:tcPr>
-          <w:p>
-            <w:pPr>
-              <w:pStyle w:val="tablecopy"/>
-              <w:jc w:val="left"/>
-            </w:pPr>
-            <w:r>
-              <w:t>compiler, type check</w:t>
+            <w:tcW w:type="dxa" w:w="2560"/>
+          </w:tcPr>
+          <w:p>
+            <w:pPr>
+              <w:pStyle w:val="tablecopy"/>
+              <w:jc w:val="left"/>
+            </w:pPr>
+            <w:r>
+              <w:t>Text below 4.5 : 1 contrast</w:t>
+            </w:r>
+          </w:p>
+        </w:tc>
+        <w:tc>
+          <w:tcPr>
+            <w:tcW w:type="dxa" w:w="1100"/>
+          </w:tcPr>
+          <w:p>
+            <w:pPr>
+              <w:pStyle w:val="tablecopy"/>
+              <w:jc w:val="left"/>
+            </w:pPr>
+            <w:r>
+              <w:t>derive</w:t>
+            </w:r>
+          </w:p>
+        </w:tc>
+        <w:tc>
+          <w:tcPr>
+            <w:tcW w:type="dxa" w:w="1100"/>
+          </w:tcPr>
+          <w:p>
+            <w:pPr>
+              <w:pStyle w:val="tablecopy"/>
+              <w:jc w:val="left"/>
+            </w:pPr>
+            <w:r>
+              <w:t>derive</w:t>
             </w:r>
           </w:p>
         </w:tc>
@@ -1743,43 +1600,43 @@
       <w:tr>
         <w:tc>
           <w:tcPr>
-            <w:tcW w:type="dxa" w:w="1000"/>
-          </w:tcPr>
-          <w:p>
-            <w:pPr>
-              <w:pStyle w:val="tablecopy"/>
-              <w:jc w:val="left"/>
-            </w:pPr>
-            <w:r>
-              <w:t>firmware</w:t>
-            </w:r>
-          </w:p>
-        </w:tc>
-        <w:tc>
-          <w:tcPr>
-            <w:tcW w:type="dxa" w:w="2220"/>
-          </w:tcPr>
-          <w:p>
-            <w:pPr>
-              <w:pStyle w:val="tablecopy"/>
-              <w:jc w:val="left"/>
-            </w:pPr>
-            <w:r>
-              <w:t>Pin used as a number, then moved</w:t>
-            </w:r>
-          </w:p>
-        </w:tc>
-        <w:tc>
-          <w:tcPr>
-            <w:tcW w:type="dxa" w:w="1560"/>
-          </w:tcPr>
-          <w:p>
-            <w:pPr>
-              <w:pStyle w:val="tablecopy"/>
-              <w:jc w:val="left"/>
-            </w:pPr>
-            <w:r>
-              <w:t>not caught</w:t>
+            <w:tcW w:type="dxa" w:w="2560"/>
+          </w:tcPr>
+          <w:p>
+            <w:pPr>
+              <w:pStyle w:val="tablecopy"/>
+              <w:jc w:val="left"/>
+            </w:pPr>
+            <w:r>
+              <w:t>USB-C pull-down 5.1 → 22 kΩ</w:t>
+            </w:r>
+          </w:p>
+        </w:tc>
+        <w:tc>
+          <w:tcPr>
+            <w:tcW w:type="dxa" w:w="1100"/>
+          </w:tcPr>
+          <w:p>
+            <w:pPr>
+              <w:pStyle w:val="tablecopy"/>
+              <w:jc w:val="left"/>
+            </w:pPr>
+            <w:r>
+              <w:t>derive</w:t>
+            </w:r>
+          </w:p>
+        </w:tc>
+        <w:tc>
+          <w:tcPr>
+            <w:tcW w:type="dxa" w:w="1100"/>
+          </w:tcPr>
+          <w:p>
+            <w:pPr>
+              <w:pStyle w:val="tablecopy"/>
+              <w:jc w:val="left"/>
+            </w:pPr>
+            <w:r>
+              <w:t>derive</w:t>
             </w:r>
           </w:p>
         </w:tc>
@@ -1787,43 +1644,43 @@
       <w:tr>
         <w:tc>
           <w:tcPr>
-            <w:tcW w:type="dxa" w:w="1000"/>
-          </w:tcPr>
-          <w:p>
-            <w:pPr>
-              <w:pStyle w:val="tablecopy"/>
-              <w:jc w:val="left"/>
-            </w:pPr>
-            <w:r>
-              <w:t>protocol</w:t>
-            </w:r>
-          </w:p>
-        </w:tc>
-        <w:tc>
-          <w:tcPr>
-            <w:tcW w:type="dxa" w:w="2220"/>
-          </w:tcPr>
-          <w:p>
-            <w:pPr>
-              <w:pStyle w:val="tablecopy"/>
-              <w:jc w:val="left"/>
-            </w:pPr>
-            <w:r>
-              <w:t>Reading fields swapped in firmware</w:t>
-            </w:r>
-          </w:p>
-        </w:tc>
-        <w:tc>
-          <w:tcPr>
-            <w:tcW w:type="dxa" w:w="1560"/>
-          </w:tcPr>
-          <w:p>
-            <w:pPr>
-              <w:pStyle w:val="tablecopy"/>
-              <w:jc w:val="left"/>
-            </w:pPr>
-            <w:r>
-              <w:t>hand-written test</w:t>
+            <w:tcW w:type="dxa" w:w="2560"/>
+          </w:tcPr>
+          <w:p>
+            <w:pPr>
+              <w:pStyle w:val="tablecopy"/>
+              <w:jc w:val="left"/>
+            </w:pPr>
+            <w:r>
+              <w:t>Cost limit lowered to USD 3</w:t>
+            </w:r>
+          </w:p>
+        </w:tc>
+        <w:tc>
+          <w:tcPr>
+            <w:tcW w:type="dxa" w:w="1100"/>
+          </w:tcPr>
+          <w:p>
+            <w:pPr>
+              <w:pStyle w:val="tablecopy"/>
+              <w:jc w:val="left"/>
+            </w:pPr>
+            <w:r>
+              <w:t>derive</w:t>
+            </w:r>
+          </w:p>
+        </w:tc>
+        <w:tc>
+          <w:tcPr>
+            <w:tcW w:type="dxa" w:w="1100"/>
+          </w:tcPr>
+          <w:p>
+            <w:pPr>
+              <w:pStyle w:val="tablecopy"/>
+              <w:jc w:val="left"/>
+            </w:pPr>
+            <w:r>
+              <w:t>derive</w:t>
             </w:r>
           </w:p>
         </w:tc>
@@ -1831,43 +1688,19 @@
       <w:tr>
         <w:tc>
           <w:tcPr>
-            <w:tcW w:type="dxa" w:w="1000"/>
-          </w:tcPr>
-          <w:p>
-            <w:pPr>
-              <w:pStyle w:val="tablecopy"/>
-              <w:jc w:val="left"/>
-            </w:pPr>
-            <w:r>
-              <w:t>firmware</w:t>
-            </w:r>
-          </w:p>
-        </w:tc>
-        <w:tc>
-          <w:tcPr>
-            <w:tcW w:type="dxa" w:w="2220"/>
-          </w:tcPr>
-          <w:p>
-            <w:pPr>
-              <w:pStyle w:val="tablecopy"/>
-              <w:jc w:val="left"/>
-            </w:pPr>
-            <w:r>
-              <w:t>Sensor I²C address mistyped</w:t>
-            </w:r>
-          </w:p>
-        </w:tc>
-        <w:tc>
-          <w:tcPr>
-            <w:tcW w:type="dxa" w:w="1560"/>
-          </w:tcPr>
-          <w:p>
-            <w:pPr>
-              <w:pStyle w:val="tablecopy"/>
-              <w:jc w:val="left"/>
-            </w:pPr>
-            <w:r>
-              <w:t>not caught</w:t>
+            <w:tcW w:type="dxa" w:w="10119"/>
+            <w:gridSpan w:val="3"/>
+          </w:tcPr>
+          <w:p>
+            <w:pPr>
+              <w:pStyle w:val="tablecopy"/>
+              <w:jc w:val="left"/>
+            </w:pPr>
+            <w:r>
+              <w:rPr>
+                <w:i/>
+              </w:rPr>
+              <w:t>Declarations conflict</w:t>
             </w:r>
           </w:p>
         </w:tc>
@@ -1875,21 +1708,51 @@
       <w:tr>
         <w:tc>
           <w:tcPr>
-            <w:tcW w:type="dxa" w:w="1000"/>
-          </w:tcPr>
-          <w:p>
-            <w:pPr>
-              <w:pStyle w:val="tablecopy"/>
-              <w:jc w:val="left"/>
-            </w:pPr>
-            <w:r>
-              <w:t>mechanical</w:t>
-            </w:r>
-          </w:p>
-        </w:tc>
-        <w:tc>
-          <w:tcPr>
-            <w:tcW w:type="dxa" w:w="2220"/>
+            <w:tcW w:type="dxa" w:w="2560"/>
+          </w:tcPr>
+          <w:p>
+            <w:pPr>
+              <w:pStyle w:val="tablecopy"/>
+              <w:jc w:val="left"/>
+            </w:pPr>
+            <w:r>
+              <w:t>Sensor zone contradicts its vent</w:t>
+            </w:r>
+          </w:p>
+        </w:tc>
+        <w:tc>
+          <w:tcPr>
+            <w:tcW w:type="dxa" w:w="1100"/>
+          </w:tcPr>
+          <w:p>
+            <w:pPr>
+              <w:pStyle w:val="tablecopy"/>
+              <w:jc w:val="left"/>
+            </w:pPr>
+            <w:r>
+              <w:t>derive</w:t>
+            </w:r>
+          </w:p>
+        </w:tc>
+        <w:tc>
+          <w:tcPr>
+            <w:tcW w:type="dxa" w:w="1100"/>
+          </w:tcPr>
+          <w:p>
+            <w:pPr>
+              <w:pStyle w:val="tablecopy"/>
+              <w:jc w:val="left"/>
+            </w:pPr>
+            <w:r>
+              <w:t>derive</w:t>
+            </w:r>
+          </w:p>
+        </w:tc>
+      </w:tr>
+      <w:tr>
+        <w:tc>
+          <w:tcPr>
+            <w:tcW w:type="dxa" w:w="2560"/>
           </w:tcPr>
           <w:p>
             <w:pPr>
@@ -1903,15 +1766,265 @@
         </w:tc>
         <w:tc>
           <w:tcPr>
-            <w:tcW w:type="dxa" w:w="1560"/>
-          </w:tcPr>
-          <w:p>
-            <w:pPr>
-              <w:pStyle w:val="tablecopy"/>
-              <w:jc w:val="left"/>
-            </w:pPr>
-            <w:r>
-              <w:t>derive: does not fit</w:t>
+            <w:tcW w:type="dxa" w:w="1100"/>
+          </w:tcPr>
+          <w:p>
+            <w:pPr>
+              <w:pStyle w:val="tablecopy"/>
+              <w:jc w:val="left"/>
+            </w:pPr>
+            <w:r>
+              <w:t>derive</w:t>
+            </w:r>
+          </w:p>
+        </w:tc>
+        <w:tc>
+          <w:tcPr>
+            <w:tcW w:type="dxa" w:w="1100"/>
+          </w:tcPr>
+          <w:p>
+            <w:pPr>
+              <w:pStyle w:val="tablecopy"/>
+              <w:jc w:val="left"/>
+            </w:pPr>
+            <w:r>
+              <w:t>derive</w:t>
+            </w:r>
+          </w:p>
+        </w:tc>
+      </w:tr>
+      <w:tr>
+        <w:tc>
+          <w:tcPr>
+            <w:tcW w:type="dxa" w:w="10119"/>
+            <w:gridSpan w:val="3"/>
+          </w:tcPr>
+          <w:p>
+            <w:pPr>
+              <w:pStyle w:val="tablecopy"/>
+              <w:jc w:val="left"/>
+            </w:pPr>
+            <w:r>
+              <w:rPr>
+                <w:i/>
+              </w:rPr>
+              <w:t>Code out of date</w:t>
+            </w:r>
+          </w:p>
+        </w:tc>
+      </w:tr>
+      <w:tr>
+        <w:tc>
+          <w:tcPr>
+            <w:tcW w:type="dxa" w:w="2560"/>
+          </w:tcPr>
+          <w:p>
+            <w:pPr>
+              <w:pStyle w:val="tablecopy"/>
+              <w:jc w:val="left"/>
+            </w:pPr>
+            <w:r>
+              <w:t>Net renamed, code not updated</w:t>
+            </w:r>
+          </w:p>
+        </w:tc>
+        <w:tc>
+          <w:tcPr>
+            <w:tcW w:type="dxa" w:w="1100"/>
+          </w:tcPr>
+          <w:p>
+            <w:pPr>
+              <w:pStyle w:val="tablecopy"/>
+              <w:jc w:val="left"/>
+            </w:pPr>
+            <w:r>
+              <w:t>compiler</w:t>
+            </w:r>
+          </w:p>
+        </w:tc>
+        <w:tc>
+          <w:tcPr>
+            <w:tcW w:type="dxa" w:w="1100"/>
+          </w:tcPr>
+          <w:p>
+            <w:pPr>
+              <w:pStyle w:val="tablecopy"/>
+              <w:jc w:val="left"/>
+            </w:pPr>
+            <w:r>
+              <w:t>compiler</w:t>
+            </w:r>
+          </w:p>
+        </w:tc>
+      </w:tr>
+      <w:tr>
+        <w:tc>
+          <w:tcPr>
+            <w:tcW w:type="dxa" w:w="10119"/>
+            <w:gridSpan w:val="3"/>
+          </w:tcPr>
+          <w:p>
+            <w:pPr>
+              <w:pStyle w:val="tablecopy"/>
+              <w:jc w:val="left"/>
+            </w:pPr>
+            <w:r>
+              <w:rPr>
+                <w:i/>
+              </w:rPr>
+              <w:t>Declaration bypassed</w:t>
+            </w:r>
+          </w:p>
+        </w:tc>
+      </w:tr>
+      <w:tr>
+        <w:tc>
+          <w:tcPr>
+            <w:tcW w:type="dxa" w:w="2560"/>
+          </w:tcPr>
+          <w:p>
+            <w:pPr>
+              <w:pStyle w:val="tablecopy"/>
+              <w:jc w:val="left"/>
+            </w:pPr>
+            <w:r>
+              <w:t>Pin named by number, then moved</w:t>
+            </w:r>
+          </w:p>
+        </w:tc>
+        <w:tc>
+          <w:tcPr>
+            <w:tcW w:type="dxa" w:w="1100"/>
+          </w:tcPr>
+          <w:p>
+            <w:pPr>
+              <w:pStyle w:val="tablecopy"/>
+              <w:jc w:val="left"/>
+            </w:pPr>
+            <w:r>
+              <w:t>not caught</w:t>
+            </w:r>
+          </w:p>
+        </w:tc>
+        <w:tc>
+          <w:tcPr>
+            <w:tcW w:type="dxa" w:w="1100"/>
+          </w:tcPr>
+          <w:p>
+            <w:pPr>
+              <w:pStyle w:val="tablecopy"/>
+              <w:jc w:val="left"/>
+            </w:pPr>
+            <w:r>
+              <w:t>derive</w:t>
+            </w:r>
+          </w:p>
+        </w:tc>
+      </w:tr>
+      <w:tr>
+        <w:tc>
+          <w:tcPr>
+            <w:tcW w:type="dxa" w:w="2560"/>
+          </w:tcPr>
+          <w:p>
+            <w:pPr>
+              <w:pStyle w:val="tablecopy"/>
+              <w:jc w:val="left"/>
+            </w:pPr>
+            <w:r>
+              <w:t>Sensor address typed in firmware</w:t>
+            </w:r>
+          </w:p>
+        </w:tc>
+        <w:tc>
+          <w:tcPr>
+            <w:tcW w:type="dxa" w:w="1100"/>
+          </w:tcPr>
+          <w:p>
+            <w:pPr>
+              <w:pStyle w:val="tablecopy"/>
+              <w:jc w:val="left"/>
+            </w:pPr>
+            <w:r>
+              <w:t>not caught</w:t>
+            </w:r>
+          </w:p>
+        </w:tc>
+        <w:tc>
+          <w:tcPr>
+            <w:tcW w:type="dxa" w:w="1100"/>
+          </w:tcPr>
+          <w:p>
+            <w:pPr>
+              <w:pStyle w:val="tablecopy"/>
+              <w:jc w:val="left"/>
+            </w:pPr>
+            <w:r>
+              <w:t>derive</w:t>
+            </w:r>
+          </w:p>
+        </w:tc>
+      </w:tr>
+      <w:tr>
+        <w:tc>
+          <w:tcPr>
+            <w:tcW w:type="dxa" w:w="10119"/>
+            <w:gridSpan w:val="3"/>
+          </w:tcPr>
+          <w:p>
+            <w:pPr>
+              <w:pStyle w:val="tablecopy"/>
+              <w:jc w:val="left"/>
+            </w:pPr>
+            <w:r>
+              <w:rPr>
+                <w:i/>
+              </w:rPr>
+              <w:t>Copied, not translated</w:t>
+            </w:r>
+          </w:p>
+        </w:tc>
+      </w:tr>
+      <w:tr>
+        <w:tc>
+          <w:tcPr>
+            <w:tcW w:type="dxa" w:w="2560"/>
+          </w:tcPr>
+          <w:p>
+            <w:pPr>
+              <w:pStyle w:val="tablecopy"/>
+              <w:jc w:val="left"/>
+            </w:pPr>
+            <w:r>
+              <w:t>Serbian string left in English</w:t>
+            </w:r>
+          </w:p>
+        </w:tc>
+        <w:tc>
+          <w:tcPr>
+            <w:tcW w:type="dxa" w:w="1100"/>
+          </w:tcPr>
+          <w:p>
+            <w:pPr>
+              <w:pStyle w:val="tablecopy"/>
+              <w:jc w:val="left"/>
+            </w:pPr>
+            <w:r>
+              <w:t>not caught</w:t>
+            </w:r>
+          </w:p>
+        </w:tc>
+        <w:tc>
+          <w:tcPr>
+            <w:tcW w:type="dxa" w:w="1100"/>
+          </w:tcPr>
+          <w:p>
+            <w:pPr>
+              <w:pStyle w:val="tablecopy"/>
+              <w:jc w:val="left"/>
+            </w:pPr>
+            <w:r>
+              <w:t>‑‑check</w:t>
             </w:r>
           </w:p>
         </w:tc>
@@ -1928,15 +2041,66 @@
         <w:pStyle w:val="BodyText"/>
       </w:pPr>
       <w:r>
-        <w:t>Fifteen of the twenty were caught before merge: eight by checks during derivation, five by --check, and two by the compiler, the type checker or a test. Every message named the file and the declaration at fault, as in Fig. 3. Every gate answered in under a second, except the placement contradiction, which took 15 s because the solver has to prove that no placement exists. The correct changes passed every gate and the controls changed nothing.</w:t>
+        <w:t>Each miss became a general rule: every pipeline lists its inputs; firmware that names a pin or an I²C address directly is refused; the sensor’s address is declared with the part and derived into the firmware; a translation identical to the default language fails unless it is declared the same on purpose; and every message is declared once, with both sides’ code generated. On the current version, all twenty mistakes are caught: ten during derivation, nine by --check and one by the compiler. Every correct change passes and the runs with no change leave every file as it was. Every failure names the file and the declaration at fault (Fig. 4).</w:t>
       </w:r>
     </w:p>
     <w:p>
       <w:pPr>
         <w:pStyle w:val="BodyText"/>
-      </w:pPr>
-      <w:r>
-        <w:t>The five misses are as useful as the catches. Two of them, a string and a domain edited without re-deriving, came from a gap in Fiducial itself: the software pipelines do not list the files they read, so --check compared the outputs with the lock but did not notice the changed input. The hardware pipeline lists its inputs, which is why the same mistake there was caught. This gap was found by the test and is still open. Another miss was firmware that uses a pin number directly instead of board.rs: it compiles before and after the pin moves, because derivation only protects the code that uses it. The last two were facts that were never declared or that need judgment: a mistyped sensor address exists only in the firmware, and a Serbian string that is really English passes every structural check. The swapped reading fields were caught only by a hand-written test, because the message layout is still written twice, in the firmware and in the page – the same mistake that started this work in Outreach.</w:t>
+        <w:keepNext/>
+        <w:spacing w:line="240" w:lineRule="auto" w:before="0" w:after="0"/>
+        <w:ind w:firstLine="0"/>
+        <w:jc w:val="center"/>
+      </w:pPr>
+      <w:r>
+        <w:drawing>
+          <wp:inline xmlns:a="http://schemas.openxmlformats.org/drawingml/2006/main" xmlns:pic="http://schemas.openxmlformats.org/drawingml/2006/picture">
+            <wp:extent cx="2880360" cy="1625003"/>
+            <wp:docPr id="4" name="Picture 4"/>
+            <wp:cNvGraphicFramePr>
+              <a:graphicFrameLocks noChangeAspect="1"/>
+            </wp:cNvGraphicFramePr>
+            <a:graphic>
+              <a:graphicData uri="http://schemas.openxmlformats.org/drawingml/2006/picture">
+                <pic:pic>
+                  <pic:nvPicPr>
+                    <pic:cNvPr id="0" name="fig4-failures.png"/>
+                    <pic:cNvPicPr/>
+                  </pic:nvPicPr>
+                  <pic:blipFill>
+                    <a:blip r:embed="rId21"/>
+                    <a:stretch>
+                      <a:fillRect/>
+                    </a:stretch>
+                  </pic:blipFill>
+                  <pic:spPr>
+                    <a:xfrm>
+                      <a:off x="0" y="0"/>
+                      <a:ext cx="2880360" cy="1625003"/>
+                    </a:xfrm>
+                    <a:prstGeom prst="rect"/>
+                  </pic:spPr>
+                </pic:pic>
+              </a:graphicData>
+            </a:graphic>
+          </wp:inline>
+        </w:drawing>
+      </w:r>
+    </w:p>
+    <w:p>
+      <w:pPr>
+        <w:pStyle w:val="Slika"/>
+      </w:pPr>
+      <w:r>
+        <w:t>Two failures from the test, as the person or agent sees them: (a) a string added in English only; (b) firmware that names a pin directly instead of taking it from the declaration.</w:t>
+      </w:r>
+    </w:p>
+    <w:p>
+      <w:pPr>
+        <w:pStyle w:val="BodyText"/>
+      </w:pPr>
+      <w:r>
+        <w:t>The twenty were written by the author, who also wrote the platform, so they may favour what it was built to catch. Later rounds of mistakes, written separately from the platform’s code, found further gaps – among them a unit mismatch between firmware and page, an I²C line with no pull-up resistor, and cookie consent that started with a choice already made – and each was again turned into a rule.</w:t>
       </w:r>
     </w:p>
     <w:p>
@@ -1953,7 +2117,7 @@
         <w:pStyle w:val="BodyText"/>
       </w:pPr>
       <w:r>
-        <w:t>Better models move the line between what a person has to check and what can be left to the agent, but they do not remove it. A probabilistic system cannot be guaranteed to be correct, or to match what the product needs, and even a deterministic tool is only right about what it was told. Fiducial is the layer that keeps that randomness bounded: the declarations are the constraints, derivation is repeatable, and the gates refuse drift. During this work the gates caught every disagreement between artifacts, and the person still had to judge what no gate could: a parts catalogue that changed its format overnight, a text match that read “±0.1 %” as “1 %”, a sensor that had to be moved away from the board’s heat, and a case that its board did not fit until the board was cut to the case.</w:t>
+        <w:t>Better models move the line between what a person must check and what can be left to an agent, but they do not remove it. A probabilistic system cannot be guaranteed to be correct, and even a deterministic tool is only right about what it was told. Fiducial bounds that uncertainty: declarations are the constraints, derivation is repeatable, and the checks refuse drift. The person still judges what no check can. During this work that meant a parts catalogue that changed format overnight, a text match that read “±0.1 %” as “1 %”, and a sensor that had to be moved away from the board’s heat.</w:t>
       </w:r>
     </w:p>
     <w:p>
@@ -1961,7 +2125,7 @@
         <w:pStyle w:val="BodyText"/>
       </w:pPr>
       <w:r>
-        <w:t>The approach is built around the product rather than around one codebase. Separate repositories, each with an agent that knows only its own part, give separate designs. One declaration read by every agent gives one product.</w:t>
+        <w:t>The main lesson is about structure more than any one tool. Keeping every discipline in one repository with one shape made the product something an agent can see whole, and turning each escaped mistake into a rule made the checks stronger with use.</w:t>
       </w:r>
     </w:p>
     <w:p>
@@ -1969,7 +2133,7 @@
         <w:pStyle w:val="BodyText"/>
       </w:pPr>
       <w:r>
-        <w:t>The evidence has clear limits. Only two products were built, one of them public. The injected mistakes were chosen by the author, who also wrote the platform. Set points are checked at DC only, and nothing is simulated in time. Autorouting is not deterministic. Most importantly, neither product has been manufactured and tested yet: everything here is designed and checked, not built.</w:t>
+        <w:t>The evidence has clear limits. Only two products were built, one of them public, and neither has been manufactured and tested yet. The test measures the checks, not whether agents working with Fiducial make fewer mistakes than agents working without it. Circuit checks are DC only, and autorouting is not deterministic, so a routed board is checked rather than compared byte for byte.</w:t>
       </w:r>
     </w:p>
     <w:p>
@@ -1986,7 +2150,7 @@
         <w:pStyle w:val="BodyText"/>
       </w:pPr>
       <w:r>
-        <w:t>Fiducial shows that declaring each fact once, deriving every artifact from it and gating the result lets one person working with AI agents keep a case, a board, firmware and a web application in agreement. Handing hard problems to proven engines kept the platform small, since new requirements became new declarations instead of new rules. Of 20 injected mistakes, 15 were caught before merge, and the five that were not point to the next steps: track the inputs of every pipeline, declare message layouts once for firmware and web, and stop code from using pin numbers directly. Next, the sensor stick will be manufactured and tested on a bench, and the approach will be tried on products built by people other than the author. The platform and the example are open source [4].</w:t>
+        <w:t>Fiducial gives a product one structure across software and hardware: each fact declared once, everything else derived, and every change checked. That makes development quicker, because a new product starts from working parts and a change is made in one place, and more reliable, because a mistake is caught with a message that names its cause. Twenty injected mistakes found five gaps in the first run; once each became a general rule, all twenty are caught. The next steps are to manufacture the sensor stick and to compare agents working with and without the platform on the same tasks. The platform and the example are open source [4].</w:t>
       </w:r>
     </w:p>
     <w:p>
@@ -2027,7 +2191,7 @@
         <w:pStyle w:val="references"/>
       </w:pPr>
       <w:r>
-        <w:t>A. Zdravković, Fiducial, release 0.9.4, 2026. Available at: https://github.com/AleksaZCodes/fiducial/releases/tag/v0.9.4</w:t>
+        <w:t>A. Zdravković, Fiducial, release 0.9.11, 2026. Available at: https://github.com/AleksaZCodes/fiducial</w:t>
       </w:r>
     </w:p>
     <w:p>
@@ -2035,7 +2199,7 @@
         <w:pStyle w:val="references"/>
       </w:pPr>
       <w:r>
-        <w:t>LCSC Electronics component catalogue. Available at: https://www.lcsc.com/</w:t>
+        <w:t>D. C. Schmidt, “Guest editor’s introduction: Model-driven engineering,” Computer, vol. 39, no. 2, pp. 25–31, 2006.</w:t>
       </w:r>
     </w:p>
     <w:p>
@@ -2043,6 +2207,38 @@
         <w:pStyle w:val="references"/>
       </w:pPr>
       <w:r>
+        <w:t>E. Dolstra, M. de Jonge and E. Visser, “Nix: A safe and policy-free system for software deployment,” in Proc. LISA, 2004, pp. 79–92.</w:t>
+      </w:r>
+    </w:p>
+    <w:p>
+      <w:pPr>
+        <w:pStyle w:val="references"/>
+      </w:pPr>
+      <w:r>
+        <w:t>AGENTS.md, a format for guiding coding agents. Available at: https://agents.md/</w:t>
+      </w:r>
+    </w:p>
+    <w:p>
+      <w:pPr>
+        <w:pStyle w:val="references"/>
+      </w:pPr>
+      <w:r>
+        <w:t>L. Perron and F. Didier, CP-SAT, Google OR-Tools. Available at: https://developers.google.com/optimization/cp/cp_solver</w:t>
+      </w:r>
+    </w:p>
+    <w:p>
+      <w:pPr>
+        <w:pStyle w:val="references"/>
+      </w:pPr>
+      <w:r>
+        <w:t>build123d, a Python CAD library on the OpenCascade kernel. Available at: https://github.com/gumyr/build123d</w:t>
+      </w:r>
+    </w:p>
+    <w:p>
+      <w:pPr>
+        <w:pStyle w:val="references"/>
+      </w:pPr>
+      <w:r>
         <w:t>KiCad EDA. Available at: https://www.kicad.org/</w:t>
       </w:r>
     </w:p>
@@ -2051,7 +2247,7 @@
         <w:pStyle w:val="references"/>
       </w:pPr>
       <w:r>
-        <w:t>E. Dolstra, M. de Jonge and E. Visser, “Nix: A safe and policy-free system for software deployment,” in Proc. LISA, 2004, pp. 79–92.</w:t>
+        <w:t>Embassy, an async framework for embedded Rust. Available at: https://embassy.dev/</w:t>
       </w:r>
     </w:p>
     <w:p>
@@ -2059,71 +2255,7 @@
         <w:pStyle w:val="references"/>
       </w:pPr>
       <w:r>
-        <w:t>L. Perron and F. Didier, CP-SAT, Google OR-Tools. Available at: https://developers.google.com/optimization/cp/cp_solver</w:t>
-      </w:r>
-    </w:p>
-    <w:p>
-      <w:pPr>
-        <w:pStyle w:val="references"/>
-      </w:pPr>
-      <w:r>
-        <w:t>build123d, a Python CAD library on the OpenCascade kernel. Available at: https://github.com/gumyr/build123d</w:t>
-      </w:r>
-    </w:p>
-    <w:p>
-      <w:pPr>
-        <w:pStyle w:val="references"/>
-      </w:pPr>
-      <w:r>
-        <w:t>Freerouting, an open-source PCB autorouter. Available at: https://github.com/freerouting/freerouting</w:t>
-      </w:r>
-    </w:p>
-    <w:p>
-      <w:pPr>
-        <w:pStyle w:val="references"/>
-      </w:pPr>
-      <w:r>
-        <w:t>USB Type-C Cable and Connector Specification, USB Implementers Forum. Available at: https://www.usb.org/usb-type-cr-cable-and-connector-specification</w:t>
-      </w:r>
-    </w:p>
-    <w:p>
-      <w:pPr>
-        <w:pStyle w:val="references"/>
-      </w:pPr>
-      <w:r>
-        <w:t>AGENTS.md, a format for guiding coding agents. Available at: https://agents.md/</w:t>
-      </w:r>
-    </w:p>
-    <w:p>
-      <w:pPr>
-        <w:pStyle w:val="references"/>
-      </w:pPr>
-      <w:r>
-        <w:t>RP2040 datasheet, Raspberry Pi Ltd. Available at: https://datasheets.raspberrypi.com/rp2040/rp2040-datasheet.pdf</w:t>
-      </w:r>
-    </w:p>
-    <w:p>
-      <w:pPr>
-        <w:pStyle w:val="references"/>
-      </w:pPr>
-      <w:r>
-        <w:t>AHT20 humidity and temperature sensor datasheet, Aosong. Available at: https://asairsensors.com/wp-content/uploads/2021/09/Data-Sheet-AHT20-Humidity-and-Temperature-Sensor-ASAIR-V1.0.03.pdf</w:t>
-      </w:r>
-    </w:p>
-    <w:p>
-      <w:pPr>
-        <w:pStyle w:val="references"/>
-      </w:pPr>
-      <w:r>
-        <w:t>Embassy, an async framework for embedded Rust. Available at: https://embassy.dev/</w:t>
-      </w:r>
-    </w:p>
-    <w:p>
-      <w:pPr>
-        <w:pStyle w:val="references"/>
-      </w:pPr>
-      <w:r>
-        <w:t>Web Serial API reference. Available at: https://developer.mozilla.org/en-US/docs/Web/API/Web_Serial_API</w:t>
+        <w:t>R. A. DeMillo, R. J. Lipton and F. G. Sayward, “Hints on test data selection: Help for the practicing programmer,” Computer, vol. 11, no. 4, pp. 34–41, 1978.</w:t>
       </w:r>
     </w:p>
     <w:p>

</xml_diff>

<commit_message>
docs(paper): cut to the Outreach paper's shape
Four sections instead of seven: the idea moves into the introduction,
the worked example into the system overview, discussion and limits
into results and the conclusion. The three rules are said once, not
five times. Table I now counts the twenty mistakes by kind of drift;
the full list stays in markers/results.md. Gone: the capability list,
file names, code line counts, solver threading, parts cost, the private
product's numbers and the anecdotes. 3 pages, about 1,500 words.

Co-Authored-By: Claude Opus 5.5 <noreply@anthropic.com>
Claude-Session: https://claude.ai/code/session_0185NnNkfrVmB6KpyPa4GJCQ
</commit_message>
<xml_diff>
--- a/docs/paper/Fiducial_Zdravkovic_Aleksa.docx
+++ b/docs/paper/Fiducial_Zdravkovic_Aleksa.docx
@@ -232,7 +232,7 @@
         <w:t>Abstract—</w:t>
       </w:r>
       <w:r>
-        <w:t>This paper presents Fiducial, an open-source platform for building products that span software and hardware – a web application, firmware, a circuit board and a printed case – with AI coding agents. It gives every product the same structure: each fact is declared once in typed files, every artifact that depends on it is derived by one command, and checks on every commit refuse anything that no longer follows from its declaration. Hard problems such as part placement and solid modelling are handed to established engines, so the platform grows by declarations rather than by special cases. To test it, 20 realistic mistakes were injected into two products. The first run caught 15. Each miss was turned into a general rule, and the current version catches 20 of the 20 while letting every correct change through.</w:t>
+        <w:t>This paper presents Fiducial, an open-source platform for building products that combine software and hardware with AI coding agents. Every fact about a product is declared once in typed text files, every artifact that uses it – code, translations, circuit board, case – is derived from it by one command, and checks on every commit refuse anything that no longer matches its declaration. In a test of 20 realistic mistakes in a web product and a USB-C sensor stick, the first version caught 15. Each miss was turned into a general rule, and the current version catches all 20.</w:t>
       </w:r>
     </w:p>
     <w:p>
@@ -263,7 +263,7 @@
         <w:pStyle w:val="BodyText"/>
       </w:pPr>
       <w:r>
-        <w:t>While building Outreach [1], an off-grid messaging system made of radios, gateways, a companion app and printed cases, the author ran into the same problem more than once. The firmware and the app disagreed on the layout of a message, and a printed case did not fit the board it was made for. Neither part was wrong on its own. The facts they shared were copied by hand between different tools, one copy changed, and the mistake showed up only when the parts were put together.</w:t>
+        <w:t>While building Outreach [1], an off-grid messaging system made of radios, gateways, a companion app and printed cases, the author met the same problem more than once. The firmware and the app disagreed on the layout of a message, and a printed case did not fit the board it was made for. Neither part was wrong on its own. The facts they shared had been copied by hand between different tools, one copy changed, and the mistake showed up only when the parts were put together.</w:t>
       </w:r>
     </w:p>
     <w:p>
@@ -271,7 +271,7 @@
         <w:pStyle w:val="BodyText"/>
       </w:pPr>
       <w:r>
-        <w:t>This is how most products are built, and AI coding agents [2], [3] make it faster without making it safer. An agent is quick inside one codebase but knows nothing about the others: the agent writing the firmware does not know the board changed, and the one writing the web page does not know the firmware did. Every project also invents its own layout, scripts and habits, so each new product starts from scratch and every agent has to learn it again.</w:t>
+        <w:t>AI coding agents [2], [3] now write much of this work, but they make the problem faster rather than smaller: an agent that knows one codebase does not know what changed in the others. Every project also has its own layout and habits, so each new product starts from scratch.</w:t>
       </w:r>
     </w:p>
     <w:p>
@@ -279,7 +279,7 @@
         <w:pStyle w:val="BodyText"/>
       </w:pPr>
       <w:r>
-        <w:t>Fiducial [4] takes the opposite approach. Every product is built the same way, in one repository, around one rule: each fact is declared once, and everything that needs it is derived from it and checked (Fig. 1). People and agents edit the declarations, never the outputs. This paper explains the idea, how the platform is put together and why, and how its checks hold up against mistakes made on purpose.</w:t>
+        <w:t>Fiducial [4] gives every product the same structure, built on one rule: each fact is declared once, everything that uses it is derived from it, and every change is checked (Fig. 1). People and agents edit the declarations, never the outputs. The idea builds on model-driven engineering [5] and on build systems that track their inputs by hash [6], applied to every discipline of one product at once, in plain files that agents read and write well.</w:t>
       </w:r>
     </w:p>
     <w:p>
@@ -330,7 +330,7 @@
         <w:pStyle w:val="Slika"/>
       </w:pPr>
       <w:r>
-        <w:t>One fact in four places. (a) Copied by hand: one copy changes and nothing notices. (b) Declared once: every copy is derived from it and checked on every commit.</w:t>
+        <w:t>One fact in four places: (a) copied by hand, one copy changes and nothing notices; (b) declared once, every copy is derived and checked.</w:t>
       </w:r>
     </w:p>
     <w:p>
@@ -339,7 +339,7 @@
         <w:keepNext/>
       </w:pPr>
       <w:r>
-        <w:t>The Idea</w:t>
+        <w:t>System Overview and Implementation</w:t>
       </w:r>
     </w:p>
     <w:p>
@@ -347,116 +347,7 @@
         <w:pStyle w:val="BodyText"/>
       </w:pPr>
       <w:r>
-        <w:t>A product is a set of facts – which pin a sensor is on, what a button says in each language, the brand colour, the size of the board – and a set of artifacts that use them: code, schematics, translations, web pages, case models. Most bugs between disciplines come from one fact being written in more than one artifact. Fiducial removes that with three rules.</w:t>
-      </w:r>
-    </w:p>
-    <w:p>
-      <w:pPr>
-        <w:pStyle w:val="BodyText"/>
-      </w:pPr>
-      <w:r>
-        <w:t>Declare once. Every fact has exactly one place where it is written, a typed text file that a person or an agent edits.</w:t>
-      </w:r>
-    </w:p>
-    <w:p>
-      <w:pPr>
-        <w:pStyle w:val="BodyText"/>
-      </w:pPr>
-      <w:r>
-        <w:t>Derive everything else. One deterministic command, fid derive, generates every artifact that depends on a fact. Generated files are never edited by hand.</w:t>
-      </w:r>
-    </w:p>
-    <w:p>
-      <w:pPr>
-        <w:pStyle w:val="BodyText"/>
-      </w:pPr>
-      <w:r>
-        <w:t>Check every change. On every commit, checks confirm that every artifact still follows from its declarations and that the declarations make sense. A failure names the declaration at fault.</w:t>
-      </w:r>
-    </w:p>
-    <w:p>
-      <w:pPr>
-        <w:pStyle w:val="BodyText"/>
-      </w:pPr>
-      <w:r>
-        <w:t>None of these rules is new on its own. Model-driven engineering generates code from models [5], and Nix identifies every build by a hash of its inputs [6]. What Fiducial adds is applying them across every discipline of one product at once, in plain files that coding agents read and write well, with the checks – not the agent’s good behaviour – as what makes the result reliable.</w:t>
-      </w:r>
-    </w:p>
-    <w:p>
-      <w:pPr>
-        <w:pStyle w:val="Heading1"/>
-        <w:keepNext/>
-      </w:pPr>
-      <w:r>
-        <w:t>How It Is Built</w:t>
-      </w:r>
-    </w:p>
-    <w:p>
-      <w:pPr>
-        <w:pStyle w:val="Heading2"/>
-        <w:keepNext/>
-      </w:pPr>
-      <w:r>
-        <w:t>One Structure for Every Product</w:t>
-      </w:r>
-    </w:p>
-    <w:p>
-      <w:pPr>
-        <w:pStyle w:val="BodyText"/>
-      </w:pPr>
-      <w:r>
-        <w:t>fid new creates a product repository with a fixed layout, and fid add turns on capabilities: packaged pipelines for web frameworks, translations, content, search metadata, legal pages, design systems, databases, deployment, device messages, firmware for two microcontroller families, and hardware – 23 in all. Two products built with Fiducial look the same, so knowing one means knowing the others, and a new product starts from working, checked parts instead of an empty folder. Every product also carries an AGENTS.md file [7] and one instruction file per capability, so any agent starts from the same context. A newer platform version comes in with one command, fid upgrade, which keeps the product’s own edits.</w:t>
-      </w:r>
-    </w:p>
-    <w:p>
-      <w:pPr>
-        <w:pStyle w:val="Heading2"/>
-        <w:keepNext/>
-      </w:pPr>
-      <w:r>
-        <w:t>Declarations</w:t>
-      </w:r>
-    </w:p>
-    <w:p>
-      <w:pPr>
-        <w:pStyle w:val="BodyText"/>
-      </w:pPr>
-      <w:r>
-        <w:t>Declarations are typed text files in version control: messages/&lt;language&gt;.json for every user-visible string, fiducial.toml for pages and brand, design-system.md for colours and the contrast they must reach, protocol.toml for the messages a device sends, and hardware/product.toml for the parts of a physical product and how they connect. Plain text was chosen over a modelling tool because it is what coding agents handle best, and because every change then goes through a normal code review. A declaration states a fact and nothing more. It does not say where the sitemap lists a page or which way a trace runs.</w:t>
-      </w:r>
-    </w:p>
-    <w:p>
-      <w:pPr>
-        <w:pStyle w:val="Heading2"/>
-        <w:keepNext/>
-      </w:pPr>
-      <w:r>
-        <w:t>Derivation</w:t>
-      </w:r>
-    </w:p>
-    <w:p>
-      <w:pPr>
-        <w:pStyle w:val="BodyText"/>
-      </w:pPr>
-      <w:r>
-        <w:t>fid derive runs every enabled pipeline. Each one reads the declarations it needs and writes its artifacts: a typed message module, a sitemap, a database migration, a firmware pin map, TypeScript types, a circuit board. Every pipeline lists the files it reads and writes, and the SHA-256 hash of each is stored in a lock file. Derivation is deterministic, so the same inputs always give the same bytes; without that, comparing hashes would mean nothing. This requirement decided more than one design choice: the placement solver, for example, runs on a single thread, because with several it gave different answers to the same problem.</w:t>
-      </w:r>
-    </w:p>
-    <w:p>
-      <w:pPr>
-        <w:pStyle w:val="Heading2"/>
-        <w:keepNext/>
-      </w:pPr>
-      <w:r>
-        <w:t>Checks</w:t>
-      </w:r>
-    </w:p>
-    <w:p>
-      <w:pPr>
-        <w:pStyle w:val="BodyText"/>
-      </w:pPr>
-      <w:r>
-        <w:t>The checks are of three kinds (Fig. 2). Freshness: fid derive --check fails when a declaration changed without its outputs being regenerated, or when an output was edited by hand. Rules inside derivation: every language must have every string, every page needs a title, every colour pair must reach its contrast, circuit voltages must fall inside their windows, the parts must cost less than a declared limit, and the board must fit its case. Consumers: compilers and type checkers read the derived files, so code that still uses a renamed fact stops compiling. All of them run in continuous integration on every commit. A failure names the file and the declaration at fault, which is the kind of signal an agent needs to fix its own mistake.</w:t>
+        <w:t>Fiducial is a command-line tool, fid, written in Rust. fid new creates a product repository with a fixed layout, and fid add enables capabilities – packaged pipelines for web applications, translations, legal pages, design systems, databases, firmware, hardware and more. Because every product shares one structure, a new one starts from working, checked parts. Fig. 2 shows how a change moves through it.</w:t>
       </w:r>
     </w:p>
     <w:p>
@@ -507,7 +398,7 @@
         <w:pStyle w:val="Slika"/>
       </w:pPr>
       <w:r>
-        <w:t>How a change moves through Fiducial. Declarations are edited, derivation produces the artifacts and hands hard problems to established engines, and the checks either let the change through or return a message naming the declaration at fault.</w:t>
+        <w:t>A change in Fiducial: declarations are edited, derivation produces the artifacts with help from established engines, and the checks either accept the change or name the declaration at fault.</w:t>
       </w:r>
     </w:p>
     <w:p>
@@ -516,7 +407,7 @@
         <w:keepNext/>
       </w:pPr>
       <w:r>
-        <w:t>Hard Problems Go to Engines</w:t>
+        <w:t>Declarations</w:t>
       </w:r>
     </w:p>
     <w:p>
@@ -524,7 +415,7 @@
         <w:pStyle w:val="BodyText"/>
       </w:pPr>
       <w:r>
-        <w:t>Some derivations are real engineering problems: where to put the parts on a board, how to route it, how to build a case around it. The first version placed parts with a hand-written search, and every new product added another special rule. The rules began to interact, and the code grew faster than the products. So the structure changed: the platform writes the problem down in a fixed format and hands it to an established engine – the CP-SAT constraint solver [8] for placement, the OpenCascade kernel through build123d [9] for the case, and KiCad [10] for the board and its design-rule check. Every placement rule became one of eight generic kinds, and a new requirement became a new declaration instead of new code. When declarations contradict each other, the solver names the smallest set that cannot all hold.</w:t>
+        <w:t>A declaration is a typed text file in version control: the strings of each language, the brand and pages, the colour palette, the messages a device sends, and the parts of a physical product with what each pin connects to. Text files were chosen over a modelling tool because coding agents read and write them well, and every change goes through a normal code review. A declaration holds facts only; nothing in it says where a part sits on the board or how a page is laid out.</w:t>
       </w:r>
     </w:p>
     <w:p>
@@ -533,7 +424,7 @@
         <w:keepNext/>
       </w:pPr>
       <w:r>
-        <w:t>Mistakes Become Rules</w:t>
+        <w:t>Derivation</w:t>
       </w:r>
     </w:p>
     <w:p>
@@ -541,16 +432,16 @@
         <w:pStyle w:val="BodyText"/>
       </w:pPr>
       <w:r>
-        <w:t>Two habits keep the platform growing in the right direction. Agents fix a problem in the layer that owns the fact – a wrong pin in the declaration, a wrong derivation in the platform – and never in a generated file. And when a mistake gets past the checks, it is not patched for that one case; it becomes a general rule that holds for every product. Section V shows what that looks like.</w:t>
-      </w:r>
-    </w:p>
-    <w:p>
-      <w:pPr>
-        <w:pStyle w:val="Heading1"/>
+        <w:t>fid derive runs every pipeline. Each one reads the declarations it needs and writes its artifacts, such as a typed translation module, a sitemap, a firmware pin map, TypeScript types or a KiCad board [7]. The hash of every input and output is stored in a lock file. Derivation is deterministic: the same inputs always give the same bytes, so a changed hash always means a real change.</w:t>
+      </w:r>
+    </w:p>
+    <w:p>
+      <w:pPr>
+        <w:pStyle w:val="Heading2"/>
         <w:keepNext/>
       </w:pPr>
       <w:r>
-        <w:t>Example: A Sensor Stick</w:t>
+        <w:t>Engines for Hard Problems</w:t>
       </w:r>
     </w:p>
     <w:p>
@@ -558,7 +449,58 @@
         <w:pStyle w:val="BodyText"/>
       </w:pPr>
       <w:r>
-        <w:t>To show the whole chain on something anyone can inspect, the repository contains a public example: a USB-C stick that reports temperature and humidity to a web page (Fig. 3). It is small on purpose, but it has every discipline: a printed case, a routed two-layer board with 23 parts, Rust firmware and a web page. The person writes the product declaration, an outline drawing, the firmware and the page. Fiducial derives the rest, including the files a board house needs to make it.</w:t>
+        <w:t>Some derivations are real engineering problems. The first version placed board parts with a hand-written search, and each product added special rules until they began to interact. Now the platform only writes the problem down and hands it to an established engine: the CP-SAT solver [8] places the parts, build123d on the OpenCascade kernel [9] builds the case, and KiCad routes and checks the board. Every placement rule is one of eight generic kinds, so a new requirement is a new declaration, not new code.</w:t>
+      </w:r>
+    </w:p>
+    <w:p>
+      <w:pPr>
+        <w:pStyle w:val="Heading2"/>
+        <w:keepNext/>
+      </w:pPr>
+      <w:r>
+        <w:t>Checks</w:t>
+      </w:r>
+    </w:p>
+    <w:p>
+      <w:pPr>
+        <w:pStyle w:val="BodyText"/>
+      </w:pPr>
+      <w:r>
+        <w:t>Three kinds of check run on every commit. fid derive --check fails when a declaration changed without its outputs being re-derived, or when an output was edited by hand. Derivation refuses declarations that break a rule: a missing translation, too little colour contrast, parts over the cost limit, a board that does not fit its case. Compilers and type checkers read the derived files, so code that still uses a renamed fact stops compiling. Each failure names the file and the declaration at fault, which is the signal an agent needs to correct itself.</w:t>
+      </w:r>
+    </w:p>
+    <w:p>
+      <w:pPr>
+        <w:pStyle w:val="Heading2"/>
+        <w:keepNext/>
+      </w:pPr>
+      <w:r>
+        <w:t>Working with AI Agents</w:t>
+      </w:r>
+    </w:p>
+    <w:p>
+      <w:pPr>
+        <w:pStyle w:val="BodyText"/>
+      </w:pPr>
+      <w:r>
+        <w:t>Every product carries an AGENTS.md file [10] and one instruction file per capability, so any agent starts from the same context. Agents are told to fix a problem where the fact is declared, never in a generated file. When a mistake gets past the checks, it is not patched for that one product; it becomes a general rule for all of them.</w:t>
+      </w:r>
+    </w:p>
+    <w:p>
+      <w:pPr>
+        <w:pStyle w:val="Heading2"/>
+        <w:keepNext/>
+      </w:pPr>
+      <w:r>
+        <w:t>Worked Example: Sensor Stick</w:t>
+      </w:r>
+    </w:p>
+    <w:p>
+      <w:pPr>
+        <w:pStyle w:val="BodyText"/>
+      </w:pPr>
+      <w:r>
+        <w:t>The repository includes a public example: a USB-C stick that reports temperature and humidity to a web page (Fig. 3). It has a printed case, a two-layer board with 23 parts, Rust firmware and a web page. The person writes the product declaration, an outline drawing, the firmware and the page. Fiducial derives the board, the case, the manufacturing files, and the code both sides use to read the sensor’s messages.</w:t>
       </w:r>
     </w:p>
     <w:p>
@@ -609,15 +551,7 @@
         <w:pStyle w:val="Slika"/>
       </w:pPr>
       <w:r>
-        <w:t>The sensor stick, derived from its declaration: (a) the closed case, 36 × 84 mm; (b) the routed board inside it, with the sensor at the far end under its vent.</w:t>
-      </w:r>
-    </w:p>
-    <w:p>
-      <w:pPr>
-        <w:pStyle w:val="BodyText"/>
-      </w:pPr>
-      <w:r>
-        <w:t>The message the stick sends is declared once as well, and both the firmware’s encoder and the page’s decoder are generated from it. That closes the exact gap met in Outreach, where the two sides were written separately. Moving the sensor’s data line to another pin is one changed line. Until the product is re-derived, the check fails; after fid derive, the board, the schematic, the firmware’s pin map and the page’s types all follow, and the firmware and the page need no edit. If the new pin is one the chip’s I²C bus cannot use, the firmware stops compiling, because in Embassy [11] every pin is its own type.</w:t>
+        <w:t>The sensor stick, derived from its declaration: (a) the closed case; (b) the routed board inside it, with the sensor under its vent.</w:t>
       </w:r>
     </w:p>
     <w:p>
@@ -626,16 +560,7 @@
         <w:keepNext/>
       </w:pPr>
       <w:r>
-        <w:t>Evaluation</w:t>
-      </w:r>
-    </w:p>
-    <w:p>
-      <w:pPr>
-        <w:pStyle w:val="Heading2"/>
-        <w:keepNext/>
-      </w:pPr>
-      <w:r>
-        <w:t>Development</w:t>
+        <w:t>Results</w:t>
       </w:r>
     </w:p>
     <w:p>
@@ -643,7 +568,15 @@
         <w:pStyle w:val="BodyText"/>
       </w:pPr>
       <w:r>
-        <w:t>Fiducial was built over six weeks, from 6 September to 15 October 2026, by one person working with AI agents: about 240 commits and 68 merged pull requests, with about 65,000 lines of Rust, 9,000 of TypeScript and 6,000 of Python. It has been used on two products, the sensor stick and a private one. Table I lists measurements from both.</w:t>
+        <w:t>Fiducial was built in six weeks by one person working with AI agents and used on two products, the sensor stick and a private one. The sensor stick’s board passes KiCad’s design-rule check with no errors. Moving its sensor to another pin is one changed line: fid derive then rewrites 8 generated files in 37 s, including the board, the firmware’s pin map and the page’s types, and neither the firmware nor the page needs an edit.</w:t>
+      </w:r>
+    </w:p>
+    <w:p>
+      <w:pPr>
+        <w:pStyle w:val="BodyText"/>
+      </w:pPr>
+      <w:r>
+        <w:t>To test whether the checks catch the mistakes people actually make, 20 realistic mistakes were injected one at a time, in the manner of mutation testing [11]: ten in a fresh web product in English and Serbian, and ten in the sensor stick’s hardware, firmware and interface. They cover eight kinds of drift (Table I). After each one the checks ran as in continuous integration, and the product was reset. Three correct changes and two runs with no change confirmed that the checks do not fail without a reason. The test is a script in the repository.</w:t>
       </w:r>
     </w:p>
     <w:p>
@@ -652,12 +585,12 @@
         <w:keepNext/>
       </w:pPr>
       <w:r>
-        <w:t>Measured Results</w:t>
+        <w:t>Injected Mistakes, by Kind of Drift</w:t>
       </w:r>
     </w:p>
     <w:tbl>
       <w:tblPr>
-        <w:tblW w:type="dxa" w:w="4780"/>
+        <w:tblW w:type="dxa" w:w="4500"/>
         <w:jc w:val="center"/>
         <w:tblLook w:firstColumn="1" w:firstRow="1" w:lastColumn="0" w:lastRow="0" w:noHBand="0" w:noVBand="1" w:val="04A0"/>
         <w:tblLayout w:type="fixed"/>
@@ -671,215 +604,651 @@
         </w:tblBorders>
       </w:tblPr>
       <w:tblGrid>
-        <w:gridCol w:w="1700"/>
-        <w:gridCol w:w="3080"/>
+        <w:gridCol w:w="1400"/>
+        <w:gridCol w:w="1900"/>
+        <w:gridCol w:w="600"/>
+        <w:gridCol w:w="600"/>
       </w:tblGrid>
       <w:tr>
-        <w:tc>
-          <w:tcPr>
-            <w:tcW w:type="dxa" w:w="1700"/>
+        <w:trPr>
+          <w:cantSplit/>
+        </w:trPr>
+        <w:tc>
+          <w:tcPr>
+            <w:tcW w:type="dxa" w:w="1400"/>
           </w:tcPr>
           <w:p>
             <w:pPr>
               <w:pStyle w:val="tablecolhead"/>
-              <w:jc w:val="left"/>
-            </w:pPr>
-            <w:r>
-              <w:t>Measure</w:t>
-            </w:r>
-          </w:p>
-        </w:tc>
-        <w:tc>
-          <w:tcPr>
-            <w:tcW w:type="dxa" w:w="3080"/>
+              <w:keepNext/>
+              <w:jc w:val="left"/>
+            </w:pPr>
+            <w:r>
+              <w:t>Kind of drift</w:t>
+            </w:r>
+          </w:p>
+        </w:tc>
+        <w:tc>
+          <w:tcPr>
+            <w:tcW w:type="dxa" w:w="1900"/>
           </w:tcPr>
           <w:p>
             <w:pPr>
               <w:pStyle w:val="tablecolhead"/>
-              <w:jc w:val="left"/>
-            </w:pPr>
-            <w:r>
-              <w:t>Result</w:t>
+              <w:keepNext/>
+              <w:jc w:val="left"/>
+            </w:pPr>
+            <w:r>
+              <w:t>Example</w:t>
+            </w:r>
+          </w:p>
+        </w:tc>
+        <w:tc>
+          <w:tcPr>
+            <w:tcW w:type="dxa" w:w="600"/>
+          </w:tcPr>
+          <w:p>
+            <w:pPr>
+              <w:pStyle w:val="tablecolhead"/>
+              <w:keepNext/>
+              <w:jc w:val="left"/>
+            </w:pPr>
+            <w:r>
+              <w:t>0.9.4</w:t>
+            </w:r>
+          </w:p>
+        </w:tc>
+        <w:tc>
+          <w:tcPr>
+            <w:tcW w:type="dxa" w:w="600"/>
+          </w:tcPr>
+          <w:p>
+            <w:pPr>
+              <w:pStyle w:val="tablecolhead"/>
+              <w:keepNext/>
+              <w:jc w:val="left"/>
+            </w:pPr>
+            <w:r>
+              <w:t>Now</w:t>
             </w:r>
           </w:p>
         </w:tc>
       </w:tr>
       <w:tr>
-        <w:tc>
-          <w:tcPr>
-            <w:tcW w:type="dxa" w:w="1700"/>
-          </w:tcPr>
-          <w:p>
-            <w:pPr>
-              <w:pStyle w:val="tablecopy"/>
-              <w:jc w:val="left"/>
-            </w:pPr>
-            <w:r>
-              <w:t>Placement rule kinds</w:t>
-            </w:r>
-          </w:p>
-        </w:tc>
-        <w:tc>
-          <w:tcPr>
-            <w:tcW w:type="dxa" w:w="3080"/>
-          </w:tcPr>
-          <w:p>
-            <w:pPr>
-              <w:pStyle w:val="tablecopy"/>
-              <w:jc w:val="left"/>
-            </w:pPr>
-            <w:r>
-              <w:t>8; none added for either product</w:t>
+        <w:trPr>
+          <w:cantSplit/>
+        </w:trPr>
+        <w:tc>
+          <w:tcPr>
+            <w:tcW w:type="dxa" w:w="1400"/>
+          </w:tcPr>
+          <w:p>
+            <w:pPr>
+              <w:pStyle w:val="tablecopy"/>
+              <w:keepNext/>
+              <w:jc w:val="left"/>
+            </w:pPr>
+            <w:r>
+              <w:t>Stale output</w:t>
+            </w:r>
+          </w:p>
+        </w:tc>
+        <w:tc>
+          <w:tcPr>
+            <w:tcW w:type="dxa" w:w="1900"/>
+          </w:tcPr>
+          <w:p>
+            <w:pPr>
+              <w:pStyle w:val="tablecopy"/>
+              <w:keepNext/>
+              <w:jc w:val="left"/>
+            </w:pPr>
+            <w:r>
+              <w:t>Domain edited, not re-derived</w:t>
+            </w:r>
+          </w:p>
+        </w:tc>
+        <w:tc>
+          <w:tcPr>
+            <w:tcW w:type="dxa" w:w="600"/>
+          </w:tcPr>
+          <w:p>
+            <w:pPr>
+              <w:pStyle w:val="tablecopy"/>
+              <w:keepNext/>
+              <w:jc w:val="left"/>
+            </w:pPr>
+            <w:r>
+              <w:t>1/3</w:t>
+            </w:r>
+          </w:p>
+        </w:tc>
+        <w:tc>
+          <w:tcPr>
+            <w:tcW w:type="dxa" w:w="600"/>
+          </w:tcPr>
+          <w:p>
+            <w:pPr>
+              <w:pStyle w:val="tablecopy"/>
+              <w:keepNext/>
+              <w:jc w:val="left"/>
+            </w:pPr>
+            <w:r>
+              <w:t>3/3</w:t>
             </w:r>
           </w:p>
         </w:tc>
       </w:tr>
       <w:tr>
-        <w:tc>
-          <w:tcPr>
-            <w:tcW w:type="dxa" w:w="1700"/>
-          </w:tcPr>
-          <w:p>
-            <w:pPr>
-              <w:pStyle w:val="tablecopy"/>
-              <w:jc w:val="left"/>
-            </w:pPr>
-            <w:r>
-              <w:t>Sensor stick board</w:t>
-            </w:r>
-          </w:p>
-        </w:tc>
-        <w:tc>
-          <w:tcPr>
-            <w:tcW w:type="dxa" w:w="3080"/>
-          </w:tcPr>
-          <w:p>
-            <w:pPr>
-              <w:pStyle w:val="tablecopy"/>
-              <w:jc w:val="left"/>
-            </w:pPr>
-            <w:r>
-              <w:t>26 × 79 mm, 2 layers, 0 DRC errors</w:t>
+        <w:trPr>
+          <w:cantSplit/>
+        </w:trPr>
+        <w:tc>
+          <w:tcPr>
+            <w:tcW w:type="dxa" w:w="1400"/>
+          </w:tcPr>
+          <w:p>
+            <w:pPr>
+              <w:pStyle w:val="tablecopy"/>
+              <w:keepNext/>
+              <w:jc w:val="left"/>
+            </w:pPr>
+            <w:r>
+              <w:t>Generated file edited</w:t>
+            </w:r>
+          </w:p>
+        </w:tc>
+        <w:tc>
+          <w:tcPr>
+            <w:tcW w:type="dxa" w:w="1900"/>
+          </w:tcPr>
+          <w:p>
+            <w:pPr>
+              <w:pStyle w:val="tablecopy"/>
+              <w:keepNext/>
+              <w:jc w:val="left"/>
+            </w:pPr>
+            <w:r>
+              <w:t>Pin map edited by hand</w:t>
+            </w:r>
+          </w:p>
+        </w:tc>
+        <w:tc>
+          <w:tcPr>
+            <w:tcW w:type="dxa" w:w="600"/>
+          </w:tcPr>
+          <w:p>
+            <w:pPr>
+              <w:pStyle w:val="tablecopy"/>
+              <w:keepNext/>
+              <w:jc w:val="left"/>
+            </w:pPr>
+            <w:r>
+              <w:t>5/5</w:t>
+            </w:r>
+          </w:p>
+        </w:tc>
+        <w:tc>
+          <w:tcPr>
+            <w:tcW w:type="dxa" w:w="600"/>
+          </w:tcPr>
+          <w:p>
+            <w:pPr>
+              <w:pStyle w:val="tablecopy"/>
+              <w:keepNext/>
+              <w:jc w:val="left"/>
+            </w:pPr>
+            <w:r>
+              <w:t>5/5</w:t>
             </w:r>
           </w:p>
         </w:tc>
       </w:tr>
       <w:tr>
-        <w:tc>
-          <w:tcPr>
-            <w:tcW w:type="dxa" w:w="1700"/>
-          </w:tcPr>
-          <w:p>
-            <w:pPr>
-              <w:pStyle w:val="tablecopy"/>
-              <w:jc w:val="left"/>
-            </w:pPr>
-            <w:r>
-              <w:t>Sensor stick parts</w:t>
-            </w:r>
-          </w:p>
-        </w:tc>
-        <w:tc>
-          <w:tcPr>
-            <w:tcW w:type="dxa" w:w="3080"/>
-          </w:tcPr>
-          <w:p>
-            <w:pPr>
-              <w:pStyle w:val="tablecopy"/>
-              <w:jc w:val="left"/>
-            </w:pPr>
-            <w:r>
-              <w:t>USD 4.74 per board at 5 (limit USD 15)</w:t>
+        <w:trPr>
+          <w:cantSplit/>
+        </w:trPr>
+        <w:tc>
+          <w:tcPr>
+            <w:tcW w:type="dxa" w:w="1400"/>
+          </w:tcPr>
+          <w:p>
+            <w:pPr>
+              <w:pStyle w:val="tablecopy"/>
+              <w:keepNext/>
+              <w:jc w:val="left"/>
+            </w:pPr>
+            <w:r>
+              <w:t>Missing declaration</w:t>
+            </w:r>
+          </w:p>
+        </w:tc>
+        <w:tc>
+          <w:tcPr>
+            <w:tcW w:type="dxa" w:w="1900"/>
+          </w:tcPr>
+          <w:p>
+            <w:pPr>
+              <w:pStyle w:val="tablecopy"/>
+              <w:keepNext/>
+              <w:jc w:val="left"/>
+            </w:pPr>
+            <w:r>
+              <w:t>String in English only</w:t>
+            </w:r>
+          </w:p>
+        </w:tc>
+        <w:tc>
+          <w:tcPr>
+            <w:tcW w:type="dxa" w:w="600"/>
+          </w:tcPr>
+          <w:p>
+            <w:pPr>
+              <w:pStyle w:val="tablecopy"/>
+              <w:keepNext/>
+              <w:jc w:val="left"/>
+            </w:pPr>
+            <w:r>
+              <w:t>3/3</w:t>
+            </w:r>
+          </w:p>
+        </w:tc>
+        <w:tc>
+          <w:tcPr>
+            <w:tcW w:type="dxa" w:w="600"/>
+          </w:tcPr>
+          <w:p>
+            <w:pPr>
+              <w:pStyle w:val="tablecopy"/>
+              <w:keepNext/>
+              <w:jc w:val="left"/>
+            </w:pPr>
+            <w:r>
+              <w:t>3/3</w:t>
             </w:r>
           </w:p>
         </w:tc>
       </w:tr>
       <w:tr>
-        <w:tc>
-          <w:tcPr>
-            <w:tcW w:type="dxa" w:w="1700"/>
-          </w:tcPr>
-          <w:p>
-            <w:pPr>
-              <w:pStyle w:val="tablecopy"/>
-              <w:jc w:val="left"/>
-            </w:pPr>
-            <w:r>
-              <w:t>One pin moved</w:t>
-            </w:r>
-          </w:p>
-        </w:tc>
-        <w:tc>
-          <w:tcPr>
-            <w:tcW w:type="dxa" w:w="3080"/>
-          </w:tcPr>
-          <w:p>
-            <w:pPr>
-              <w:pStyle w:val="tablecopy"/>
-              <w:jc w:val="left"/>
-            </w:pPr>
-            <w:r>
-              <w:t>8 generated files rewritten in 37 s</w:t>
+        <w:trPr>
+          <w:cantSplit/>
+        </w:trPr>
+        <w:tc>
+          <w:tcPr>
+            <w:tcW w:type="dxa" w:w="1400"/>
+          </w:tcPr>
+          <w:p>
+            <w:pPr>
+              <w:pStyle w:val="tablecopy"/>
+              <w:keepNext/>
+              <w:jc w:val="left"/>
+            </w:pPr>
+            <w:r>
+              <w:t>Rule broken</w:t>
+            </w:r>
+          </w:p>
+        </w:tc>
+        <w:tc>
+          <w:tcPr>
+            <w:tcW w:type="dxa" w:w="1900"/>
+          </w:tcPr>
+          <w:p>
+            <w:pPr>
+              <w:pStyle w:val="tablecopy"/>
+              <w:keepNext/>
+              <w:jc w:val="left"/>
+            </w:pPr>
+            <w:r>
+              <w:t>Contrast below 4.5 : 1</w:t>
+            </w:r>
+          </w:p>
+        </w:tc>
+        <w:tc>
+          <w:tcPr>
+            <w:tcW w:type="dxa" w:w="600"/>
+          </w:tcPr>
+          <w:p>
+            <w:pPr>
+              <w:pStyle w:val="tablecopy"/>
+              <w:keepNext/>
+              <w:jc w:val="left"/>
+            </w:pPr>
+            <w:r>
+              <w:t>3/3</w:t>
+            </w:r>
+          </w:p>
+        </w:tc>
+        <w:tc>
+          <w:tcPr>
+            <w:tcW w:type="dxa" w:w="600"/>
+          </w:tcPr>
+          <w:p>
+            <w:pPr>
+              <w:pStyle w:val="tablecopy"/>
+              <w:keepNext/>
+              <w:jc w:val="left"/>
+            </w:pPr>
+            <w:r>
+              <w:t>3/3</w:t>
             </w:r>
           </w:p>
         </w:tc>
       </w:tr>
       <w:tr>
-        <w:tc>
-          <w:tcPr>
-            <w:tcW w:type="dxa" w:w="1700"/>
-          </w:tcPr>
-          <w:p>
-            <w:pPr>
-              <w:pStyle w:val="tablecopy"/>
-              <w:jc w:val="left"/>
-            </w:pPr>
-            <w:r>
-              <w:t>Placement, private product</w:t>
-            </w:r>
-          </w:p>
-        </w:tc>
-        <w:tc>
-          <w:tcPr>
-            <w:tcW w:type="dxa" w:w="3080"/>
-          </w:tcPr>
-          <w:p>
-            <w:pPr>
-              <w:pStyle w:val="tablecopy"/>
-              <w:jc w:val="left"/>
-            </w:pPr>
-            <w:r>
-              <w:t>13 % shorter connections than the hand-written search</w:t>
+        <w:trPr>
+          <w:cantSplit/>
+        </w:trPr>
+        <w:tc>
+          <w:tcPr>
+            <w:tcW w:type="dxa" w:w="1400"/>
+          </w:tcPr>
+          <w:p>
+            <w:pPr>
+              <w:pStyle w:val="tablecopy"/>
+              <w:keepNext/>
+              <w:jc w:val="left"/>
+            </w:pPr>
+            <w:r>
+              <w:t>Declarations conflict</w:t>
+            </w:r>
+          </w:p>
+        </w:tc>
+        <w:tc>
+          <w:tcPr>
+            <w:tcW w:type="dxa" w:w="1900"/>
+          </w:tcPr>
+          <w:p>
+            <w:pPr>
+              <w:pStyle w:val="tablecopy"/>
+              <w:keepNext/>
+              <w:jc w:val="left"/>
+            </w:pPr>
+            <w:r>
+              <w:t>Case too narrow for board</w:t>
+            </w:r>
+          </w:p>
+        </w:tc>
+        <w:tc>
+          <w:tcPr>
+            <w:tcW w:type="dxa" w:w="600"/>
+          </w:tcPr>
+          <w:p>
+            <w:pPr>
+              <w:pStyle w:val="tablecopy"/>
+              <w:keepNext/>
+              <w:jc w:val="left"/>
+            </w:pPr>
+            <w:r>
+              <w:t>2/2</w:t>
+            </w:r>
+          </w:p>
+        </w:tc>
+        <w:tc>
+          <w:tcPr>
+            <w:tcW w:type="dxa" w:w="600"/>
+          </w:tcPr>
+          <w:p>
+            <w:pPr>
+              <w:pStyle w:val="tablecopy"/>
+              <w:keepNext/>
+              <w:jc w:val="left"/>
+            </w:pPr>
+            <w:r>
+              <w:t>2/2</w:t>
             </w:r>
           </w:p>
         </w:tc>
       </w:tr>
       <w:tr>
-        <w:tc>
-          <w:tcPr>
-            <w:tcW w:type="dxa" w:w="1700"/>
-          </w:tcPr>
-          <w:p>
-            <w:pPr>
-              <w:pStyle w:val="tablecopy"/>
-              <w:jc w:val="left"/>
-            </w:pPr>
-            <w:r>
-              <w:t>Contradictions</w:t>
-            </w:r>
-          </w:p>
-        </w:tc>
-        <w:tc>
-          <w:tcPr>
-            <w:tcW w:type="dxa" w:w="3080"/>
-          </w:tcPr>
-          <w:p>
-            <w:pPr>
-              <w:pStyle w:val="tablecopy"/>
-              <w:jc w:val="left"/>
-            </w:pPr>
-            <w:r>
-              <w:t>named as the smallest conflicting set</w:t>
+        <w:trPr>
+          <w:cantSplit/>
+        </w:trPr>
+        <w:tc>
+          <w:tcPr>
+            <w:tcW w:type="dxa" w:w="1400"/>
+          </w:tcPr>
+          <w:p>
+            <w:pPr>
+              <w:pStyle w:val="tablecopy"/>
+              <w:keepNext/>
+              <w:jc w:val="left"/>
+            </w:pPr>
+            <w:r>
+              <w:t>Code out of date</w:t>
+            </w:r>
+          </w:p>
+        </w:tc>
+        <w:tc>
+          <w:tcPr>
+            <w:tcW w:type="dxa" w:w="1900"/>
+          </w:tcPr>
+          <w:p>
+            <w:pPr>
+              <w:pStyle w:val="tablecopy"/>
+              <w:keepNext/>
+              <w:jc w:val="left"/>
+            </w:pPr>
+            <w:r>
+              <w:t>Net renamed, old name used</w:t>
+            </w:r>
+          </w:p>
+        </w:tc>
+        <w:tc>
+          <w:tcPr>
+            <w:tcW w:type="dxa" w:w="600"/>
+          </w:tcPr>
+          <w:p>
+            <w:pPr>
+              <w:pStyle w:val="tablecopy"/>
+              <w:keepNext/>
+              <w:jc w:val="left"/>
+            </w:pPr>
+            <w:r>
+              <w:t>1/1</w:t>
+            </w:r>
+          </w:p>
+        </w:tc>
+        <w:tc>
+          <w:tcPr>
+            <w:tcW w:type="dxa" w:w="600"/>
+          </w:tcPr>
+          <w:p>
+            <w:pPr>
+              <w:pStyle w:val="tablecopy"/>
+              <w:keepNext/>
+              <w:jc w:val="left"/>
+            </w:pPr>
+            <w:r>
+              <w:t>1/1</w:t>
+            </w:r>
+          </w:p>
+        </w:tc>
+      </w:tr>
+      <w:tr>
+        <w:trPr>
+          <w:cantSplit/>
+        </w:trPr>
+        <w:tc>
+          <w:tcPr>
+            <w:tcW w:type="dxa" w:w="1400"/>
+          </w:tcPr>
+          <w:p>
+            <w:pPr>
+              <w:pStyle w:val="tablecopy"/>
+              <w:keepNext/>
+              <w:jc w:val="left"/>
+            </w:pPr>
+            <w:r>
+              <w:t>Declaration bypassed</w:t>
+            </w:r>
+          </w:p>
+        </w:tc>
+        <w:tc>
+          <w:tcPr>
+            <w:tcW w:type="dxa" w:w="1900"/>
+          </w:tcPr>
+          <w:p>
+            <w:pPr>
+              <w:pStyle w:val="tablecopy"/>
+              <w:keepNext/>
+              <w:jc w:val="left"/>
+            </w:pPr>
+            <w:r>
+              <w:t>Pin typed as a number</w:t>
+            </w:r>
+          </w:p>
+        </w:tc>
+        <w:tc>
+          <w:tcPr>
+            <w:tcW w:type="dxa" w:w="600"/>
+          </w:tcPr>
+          <w:p>
+            <w:pPr>
+              <w:pStyle w:val="tablecopy"/>
+              <w:keepNext/>
+              <w:jc w:val="left"/>
+            </w:pPr>
+            <w:r>
+              <w:t>0/2</w:t>
+            </w:r>
+          </w:p>
+        </w:tc>
+        <w:tc>
+          <w:tcPr>
+            <w:tcW w:type="dxa" w:w="600"/>
+          </w:tcPr>
+          <w:p>
+            <w:pPr>
+              <w:pStyle w:val="tablecopy"/>
+              <w:keepNext/>
+              <w:jc w:val="left"/>
+            </w:pPr>
+            <w:r>
+              <w:t>2/2</w:t>
+            </w:r>
+          </w:p>
+        </w:tc>
+      </w:tr>
+      <w:tr>
+        <w:trPr>
+          <w:cantSplit/>
+        </w:trPr>
+        <w:tc>
+          <w:tcPr>
+            <w:tcW w:type="dxa" w:w="1400"/>
+          </w:tcPr>
+          <w:p>
+            <w:pPr>
+              <w:pStyle w:val="tablecopy"/>
+              <w:keepNext/>
+              <w:jc w:val="left"/>
+            </w:pPr>
+            <w:r>
+              <w:t>Not translated</w:t>
+            </w:r>
+          </w:p>
+        </w:tc>
+        <w:tc>
+          <w:tcPr>
+            <w:tcW w:type="dxa" w:w="1900"/>
+          </w:tcPr>
+          <w:p>
+            <w:pPr>
+              <w:pStyle w:val="tablecopy"/>
+              <w:keepNext/>
+              <w:jc w:val="left"/>
+            </w:pPr>
+            <w:r>
+              <w:t>Serbian left in English</w:t>
+            </w:r>
+          </w:p>
+        </w:tc>
+        <w:tc>
+          <w:tcPr>
+            <w:tcW w:type="dxa" w:w="600"/>
+          </w:tcPr>
+          <w:p>
+            <w:pPr>
+              <w:pStyle w:val="tablecopy"/>
+              <w:keepNext/>
+              <w:jc w:val="left"/>
+            </w:pPr>
+            <w:r>
+              <w:t>0/1</w:t>
+            </w:r>
+          </w:p>
+        </w:tc>
+        <w:tc>
+          <w:tcPr>
+            <w:tcW w:type="dxa" w:w="600"/>
+          </w:tcPr>
+          <w:p>
+            <w:pPr>
+              <w:pStyle w:val="tablecopy"/>
+              <w:keepNext/>
+              <w:jc w:val="left"/>
+            </w:pPr>
+            <w:r>
+              <w:t>1/1</w:t>
+            </w:r>
+          </w:p>
+        </w:tc>
+      </w:tr>
+      <w:tr>
+        <w:trPr>
+          <w:cantSplit/>
+        </w:trPr>
+        <w:tc>
+          <w:tcPr>
+            <w:tcW w:type="dxa" w:w="1400"/>
+          </w:tcPr>
+          <w:p>
+            <w:pPr>
+              <w:pStyle w:val="tablecopy"/>
+              <w:jc w:val="left"/>
+            </w:pPr>
+            <w:r>
+              <w:t>Total</w:t>
+            </w:r>
+          </w:p>
+        </w:tc>
+        <w:tc>
+          <w:tcPr>
+            <w:tcW w:type="dxa" w:w="1900"/>
+          </w:tcPr>
+          <w:p>
+            <w:pPr>
+              <w:pStyle w:val="tablecopy"/>
+              <w:jc w:val="left"/>
+            </w:pPr>
+            <w:r/>
+          </w:p>
+        </w:tc>
+        <w:tc>
+          <w:tcPr>
+            <w:tcW w:type="dxa" w:w="600"/>
+          </w:tcPr>
+          <w:p>
+            <w:pPr>
+              <w:pStyle w:val="tablecopy"/>
+              <w:jc w:val="left"/>
+            </w:pPr>
+            <w:r>
+              <w:t>15/20</w:t>
+            </w:r>
+          </w:p>
+        </w:tc>
+        <w:tc>
+          <w:tcPr>
+            <w:tcW w:type="dxa" w:w="600"/>
+          </w:tcPr>
+          <w:p>
+            <w:pPr>
+              <w:pStyle w:val="tablecopy"/>
+              <w:jc w:val="left"/>
+            </w:pPr>
+            <w:r>
+              <w:t>20/20</w:t>
             </w:r>
           </w:p>
         </w:tc>
@@ -893,1155 +1262,10 @@
     </w:p>
     <w:p>
       <w:pPr>
-        <w:pStyle w:val="Heading2"/>
-        <w:keepNext/>
-      </w:pPr>
-      <w:r>
-        <w:t>Injected Mistakes</w:t>
-      </w:r>
-    </w:p>
-    <w:p>
-      <w:pPr>
         <w:pStyle w:val="BodyText"/>
       </w:pPr>
       <w:r>
-        <w:t>Checks are only worth having if they catch the mistakes people actually make. To measure that, the test follows the idea of mutation testing [12]: inject a realistic mistake, run the checks, and see whether they notice. Twenty mistakes were chosen to cover the eight kinds of drift met while building Fiducial and its products (Table II): ten in a fresh web product in English and Serbian with ten software capabilities, and ten in the sensor stick’s hardware, firmware and interface. Each is applied to a clean copy, the checks run in the same order as in CI – derive, --check, the firmware build and tests, the page’s test and type check – and the copy is reset. Three correct changes and two runs with no change test the other direction: that the checks do not fail without a reason. The test is a script in the repository and runs with one command.</w:t>
-      </w:r>
-    </w:p>
-    <w:p>
-      <w:pPr>
-        <w:pStyle w:val="BodyText"/>
-      </w:pPr>
-      <w:r>
-        <w:t>On release 0.9.4 the checks caught 15 of the 20. The five misses were not random: each was a fact the platform did not yet own. Two declarations edited without re-deriving went unnoticed, because only the hardware pipeline listed the files it read. Firmware that named a pin by its number kept compiling after the pin moved. A mistyped sensor address existed only in the firmware. A Serbian string left in English passed every structural check. And the firmware and the page disagreeing on a message layout was caught only by a hand-written test.</w:t>
-      </w:r>
-    </w:p>
-    <w:p>
-      <w:pPr>
-        <w:pStyle w:val="tablehead"/>
-        <w:keepNext/>
-      </w:pPr>
-      <w:r>
-        <w:t>Injected Mistakes, by Kind of Drift</w:t>
-      </w:r>
-    </w:p>
-    <w:tbl>
-      <w:tblPr>
-        <w:tblW w:type="dxa" w:w="4760"/>
-        <w:jc w:val="center"/>
-        <w:tblLook w:firstColumn="1" w:firstRow="1" w:lastColumn="0" w:lastRow="0" w:noHBand="0" w:noVBand="1" w:val="04A0"/>
-        <w:tblLayout w:type="fixed"/>
-        <w:tblBorders>
-          <w:top w:val="single" w:sz="4" w:space="0" w:color="000000"/>
-          <w:left w:val="single" w:sz="4" w:space="0" w:color="000000"/>
-          <w:bottom w:val="single" w:sz="4" w:space="0" w:color="000000"/>
-          <w:right w:val="single" w:sz="4" w:space="0" w:color="000000"/>
-          <w:insideH w:val="single" w:sz="4" w:space="0" w:color="000000"/>
-          <w:insideV w:val="single" w:sz="4" w:space="0" w:color="000000"/>
-        </w:tblBorders>
-      </w:tblPr>
-      <w:tblGrid>
-        <w:gridCol w:w="2560"/>
-        <w:gridCol w:w="1100"/>
-        <w:gridCol w:w="1100"/>
-      </w:tblGrid>
-      <w:tr>
-        <w:tc>
-          <w:tcPr>
-            <w:tcW w:type="dxa" w:w="2560"/>
-          </w:tcPr>
-          <w:p>
-            <w:pPr>
-              <w:pStyle w:val="tablecolhead"/>
-              <w:jc w:val="left"/>
-            </w:pPr>
-            <w:r>
-              <w:t>Mistake</w:t>
-            </w:r>
-          </w:p>
-        </w:tc>
-        <w:tc>
-          <w:tcPr>
-            <w:tcW w:type="dxa" w:w="1100"/>
-          </w:tcPr>
-          <w:p>
-            <w:pPr>
-              <w:pStyle w:val="tablecolhead"/>
-              <w:jc w:val="left"/>
-            </w:pPr>
-            <w:r>
-              <w:t>0.9.4</w:t>
-            </w:r>
-          </w:p>
-        </w:tc>
-        <w:tc>
-          <w:tcPr>
-            <w:tcW w:type="dxa" w:w="1100"/>
-          </w:tcPr>
-          <w:p>
-            <w:pPr>
-              <w:pStyle w:val="tablecolhead"/>
-              <w:jc w:val="left"/>
-            </w:pPr>
-            <w:r>
-              <w:t>Now</w:t>
-            </w:r>
-          </w:p>
-        </w:tc>
-      </w:tr>
-      <w:tr>
-        <w:tc>
-          <w:tcPr>
-            <w:tcW w:type="dxa" w:w="10119"/>
-            <w:gridSpan w:val="3"/>
-          </w:tcPr>
-          <w:p>
-            <w:pPr>
-              <w:pStyle w:val="tablecopy"/>
-              <w:jc w:val="left"/>
-            </w:pPr>
-            <w:r>
-              <w:rPr>
-                <w:i/>
-              </w:rPr>
-              <w:t>Stale output</w:t>
-            </w:r>
-          </w:p>
-        </w:tc>
-      </w:tr>
-      <w:tr>
-        <w:tc>
-          <w:tcPr>
-            <w:tcW w:type="dxa" w:w="2560"/>
-          </w:tcPr>
-          <w:p>
-            <w:pPr>
-              <w:pStyle w:val="tablecopy"/>
-              <w:jc w:val="left"/>
-            </w:pPr>
-            <w:r>
-              <w:t>English string edited, not re-derived</w:t>
-            </w:r>
-          </w:p>
-        </w:tc>
-        <w:tc>
-          <w:tcPr>
-            <w:tcW w:type="dxa" w:w="1100"/>
-          </w:tcPr>
-          <w:p>
-            <w:pPr>
-              <w:pStyle w:val="tablecopy"/>
-              <w:jc w:val="left"/>
-            </w:pPr>
-            <w:r>
-              <w:t>not caught</w:t>
-            </w:r>
-          </w:p>
-        </w:tc>
-        <w:tc>
-          <w:tcPr>
-            <w:tcW w:type="dxa" w:w="1100"/>
-          </w:tcPr>
-          <w:p>
-            <w:pPr>
-              <w:pStyle w:val="tablecopy"/>
-              <w:jc w:val="left"/>
-            </w:pPr>
-            <w:r>
-              <w:t>‑‑check</w:t>
-            </w:r>
-          </w:p>
-        </w:tc>
-      </w:tr>
-      <w:tr>
-        <w:tc>
-          <w:tcPr>
-            <w:tcW w:type="dxa" w:w="2560"/>
-          </w:tcPr>
-          <w:p>
-            <w:pPr>
-              <w:pStyle w:val="tablecopy"/>
-              <w:jc w:val="left"/>
-            </w:pPr>
-            <w:r>
-              <w:t>Domain changed, not re-derived</w:t>
-            </w:r>
-          </w:p>
-        </w:tc>
-        <w:tc>
-          <w:tcPr>
-            <w:tcW w:type="dxa" w:w="1100"/>
-          </w:tcPr>
-          <w:p>
-            <w:pPr>
-              <w:pStyle w:val="tablecopy"/>
-              <w:jc w:val="left"/>
-            </w:pPr>
-            <w:r>
-              <w:t>not caught</w:t>
-            </w:r>
-          </w:p>
-        </w:tc>
-        <w:tc>
-          <w:tcPr>
-            <w:tcW w:type="dxa" w:w="1100"/>
-          </w:tcPr>
-          <w:p>
-            <w:pPr>
-              <w:pStyle w:val="tablecopy"/>
-              <w:jc w:val="left"/>
-            </w:pPr>
-            <w:r>
-              <w:t>‑‑check</w:t>
-            </w:r>
-          </w:p>
-        </w:tc>
-      </w:tr>
-      <w:tr>
-        <w:tc>
-          <w:tcPr>
-            <w:tcW w:type="dxa" w:w="2560"/>
-          </w:tcPr>
-          <w:p>
-            <w:pPr>
-              <w:pStyle w:val="tablecopy"/>
-              <w:jc w:val="left"/>
-            </w:pPr>
-            <w:r>
-              <w:t>Sensor pin moved, not re-derived</w:t>
-            </w:r>
-          </w:p>
-        </w:tc>
-        <w:tc>
-          <w:tcPr>
-            <w:tcW w:type="dxa" w:w="1100"/>
-          </w:tcPr>
-          <w:p>
-            <w:pPr>
-              <w:pStyle w:val="tablecopy"/>
-              <w:jc w:val="left"/>
-            </w:pPr>
-            <w:r>
-              <w:t>‑‑check</w:t>
-            </w:r>
-          </w:p>
-        </w:tc>
-        <w:tc>
-          <w:tcPr>
-            <w:tcW w:type="dxa" w:w="1100"/>
-          </w:tcPr>
-          <w:p>
-            <w:pPr>
-              <w:pStyle w:val="tablecopy"/>
-              <w:jc w:val="left"/>
-            </w:pPr>
-            <w:r>
-              <w:t>‑‑check</w:t>
-            </w:r>
-          </w:p>
-        </w:tc>
-      </w:tr>
-      <w:tr>
-        <w:tc>
-          <w:tcPr>
-            <w:tcW w:type="dxa" w:w="10119"/>
-            <w:gridSpan w:val="3"/>
-          </w:tcPr>
-          <w:p>
-            <w:pPr>
-              <w:pStyle w:val="tablecopy"/>
-              <w:jc w:val="left"/>
-            </w:pPr>
-            <w:r>
-              <w:rPr>
-                <w:i/>
-              </w:rPr>
-              <w:t>Generated file edited</w:t>
-            </w:r>
-          </w:p>
-        </w:tc>
-      </w:tr>
-      <w:tr>
-        <w:tc>
-          <w:tcPr>
-            <w:tcW w:type="dxa" w:w="2560"/>
-          </w:tcPr>
-          <w:p>
-            <w:pPr>
-              <w:pStyle w:val="tablecopy"/>
-              <w:jc w:val="left"/>
-            </w:pPr>
-            <w:r>
-              <w:t>Message module edited</w:t>
-            </w:r>
-          </w:p>
-        </w:tc>
-        <w:tc>
-          <w:tcPr>
-            <w:tcW w:type="dxa" w:w="1100"/>
-          </w:tcPr>
-          <w:p>
-            <w:pPr>
-              <w:pStyle w:val="tablecopy"/>
-              <w:jc w:val="left"/>
-            </w:pPr>
-            <w:r>
-              <w:t>‑‑check</w:t>
-            </w:r>
-          </w:p>
-        </w:tc>
-        <w:tc>
-          <w:tcPr>
-            <w:tcW w:type="dxa" w:w="1100"/>
-          </w:tcPr>
-          <w:p>
-            <w:pPr>
-              <w:pStyle w:val="tablecopy"/>
-              <w:jc w:val="left"/>
-            </w:pPr>
-            <w:r>
-              <w:t>‑‑check</w:t>
-            </w:r>
-          </w:p>
-        </w:tc>
-      </w:tr>
-      <w:tr>
-        <w:tc>
-          <w:tcPr>
-            <w:tcW w:type="dxa" w:w="2560"/>
-          </w:tcPr>
-          <w:p>
-            <w:pPr>
-              <w:pStyle w:val="tablecopy"/>
-              <w:jc w:val="left"/>
-            </w:pPr>
-            <w:r>
-              <w:t>Worker config edited</w:t>
-            </w:r>
-          </w:p>
-        </w:tc>
-        <w:tc>
-          <w:tcPr>
-            <w:tcW w:type="dxa" w:w="1100"/>
-          </w:tcPr>
-          <w:p>
-            <w:pPr>
-              <w:pStyle w:val="tablecopy"/>
-              <w:jc w:val="left"/>
-            </w:pPr>
-            <w:r>
-              <w:t>‑‑check</w:t>
-            </w:r>
-          </w:p>
-        </w:tc>
-        <w:tc>
-          <w:tcPr>
-            <w:tcW w:type="dxa" w:w="1100"/>
-          </w:tcPr>
-          <w:p>
-            <w:pPr>
-              <w:pStyle w:val="tablecopy"/>
-              <w:jc w:val="left"/>
-            </w:pPr>
-            <w:r>
-              <w:t>‑‑check</w:t>
-            </w:r>
-          </w:p>
-        </w:tc>
-      </w:tr>
-      <w:tr>
-        <w:tc>
-          <w:tcPr>
-            <w:tcW w:type="dxa" w:w="2560"/>
-          </w:tcPr>
-          <w:p>
-            <w:pPr>
-              <w:pStyle w:val="tablecopy"/>
-              <w:jc w:val="left"/>
-            </w:pPr>
-            <w:r>
-              <w:t>Applied migration edited</w:t>
-            </w:r>
-          </w:p>
-        </w:tc>
-        <w:tc>
-          <w:tcPr>
-            <w:tcW w:type="dxa" w:w="1100"/>
-          </w:tcPr>
-          <w:p>
-            <w:pPr>
-              <w:pStyle w:val="tablecopy"/>
-              <w:jc w:val="left"/>
-            </w:pPr>
-            <w:r>
-              <w:t>‑‑check</w:t>
-            </w:r>
-          </w:p>
-        </w:tc>
-        <w:tc>
-          <w:tcPr>
-            <w:tcW w:type="dxa" w:w="1100"/>
-          </w:tcPr>
-          <w:p>
-            <w:pPr>
-              <w:pStyle w:val="tablecopy"/>
-              <w:jc w:val="left"/>
-            </w:pPr>
-            <w:r>
-              <w:t>‑‑check</w:t>
-            </w:r>
-          </w:p>
-        </w:tc>
-      </w:tr>
-      <w:tr>
-        <w:tc>
-          <w:tcPr>
-            <w:tcW w:type="dxa" w:w="2560"/>
-          </w:tcPr>
-          <w:p>
-            <w:pPr>
-              <w:pStyle w:val="tablecopy"/>
-              <w:jc w:val="left"/>
-            </w:pPr>
-            <w:r>
-              <w:t>Firmware pin map edited</w:t>
-            </w:r>
-          </w:p>
-        </w:tc>
-        <w:tc>
-          <w:tcPr>
-            <w:tcW w:type="dxa" w:w="1100"/>
-          </w:tcPr>
-          <w:p>
-            <w:pPr>
-              <w:pStyle w:val="tablecopy"/>
-              <w:jc w:val="left"/>
-            </w:pPr>
-            <w:r>
-              <w:t>‑‑check</w:t>
-            </w:r>
-          </w:p>
-        </w:tc>
-        <w:tc>
-          <w:tcPr>
-            <w:tcW w:type="dxa" w:w="1100"/>
-          </w:tcPr>
-          <w:p>
-            <w:pPr>
-              <w:pStyle w:val="tablecopy"/>
-              <w:jc w:val="left"/>
-            </w:pPr>
-            <w:r>
-              <w:t>‑‑check</w:t>
-            </w:r>
-          </w:p>
-        </w:tc>
-      </w:tr>
-      <w:tr>
-        <w:tc>
-          <w:tcPr>
-            <w:tcW w:type="dxa" w:w="2560"/>
-          </w:tcPr>
-          <w:p>
-            <w:pPr>
-              <w:pStyle w:val="tablecopy"/>
-              <w:jc w:val="left"/>
-            </w:pPr>
-            <w:r>
-              <w:t>Message layout changed in firmware</w:t>
-            </w:r>
-          </w:p>
-        </w:tc>
-        <w:tc>
-          <w:tcPr>
-            <w:tcW w:type="dxa" w:w="1100"/>
-          </w:tcPr>
-          <w:p>
-            <w:pPr>
-              <w:pStyle w:val="tablecopy"/>
-              <w:jc w:val="left"/>
-            </w:pPr>
-            <w:r>
-              <w:t>test only</w:t>
-            </w:r>
-          </w:p>
-        </w:tc>
-        <w:tc>
-          <w:tcPr>
-            <w:tcW w:type="dxa" w:w="1100"/>
-          </w:tcPr>
-          <w:p>
-            <w:pPr>
-              <w:pStyle w:val="tablecopy"/>
-              <w:jc w:val="left"/>
-            </w:pPr>
-            <w:r>
-              <w:t>‑‑check</w:t>
-            </w:r>
-          </w:p>
-        </w:tc>
-      </w:tr>
-      <w:tr>
-        <w:tc>
-          <w:tcPr>
-            <w:tcW w:type="dxa" w:w="10119"/>
-            <w:gridSpan w:val="3"/>
-          </w:tcPr>
-          <w:p>
-            <w:pPr>
-              <w:pStyle w:val="tablecopy"/>
-              <w:jc w:val="left"/>
-            </w:pPr>
-            <w:r>
-              <w:rPr>
-                <w:i/>
-              </w:rPr>
-              <w:t>Incomplete declaration</w:t>
-            </w:r>
-          </w:p>
-        </w:tc>
-      </w:tr>
-      <w:tr>
-        <w:tc>
-          <w:tcPr>
-            <w:tcW w:type="dxa" w:w="2560"/>
-          </w:tcPr>
-          <w:p>
-            <w:pPr>
-              <w:pStyle w:val="tablecopy"/>
-              <w:jc w:val="left"/>
-            </w:pPr>
-            <w:r>
-              <w:t>String added in English only</w:t>
-            </w:r>
-          </w:p>
-        </w:tc>
-        <w:tc>
-          <w:tcPr>
-            <w:tcW w:type="dxa" w:w="1100"/>
-          </w:tcPr>
-          <w:p>
-            <w:pPr>
-              <w:pStyle w:val="tablecopy"/>
-              <w:jc w:val="left"/>
-            </w:pPr>
-            <w:r>
-              <w:t>derive</w:t>
-            </w:r>
-          </w:p>
-        </w:tc>
-        <w:tc>
-          <w:tcPr>
-            <w:tcW w:type="dxa" w:w="1100"/>
-          </w:tcPr>
-          <w:p>
-            <w:pPr>
-              <w:pStyle w:val="tablecopy"/>
-              <w:jc w:val="left"/>
-            </w:pPr>
-            <w:r>
-              <w:t>derive</w:t>
-            </w:r>
-          </w:p>
-        </w:tc>
-      </w:tr>
-      <w:tr>
-        <w:tc>
-          <w:tcPr>
-            <w:tcW w:type="dxa" w:w="2560"/>
-          </w:tcPr>
-          <w:p>
-            <w:pPr>
-              <w:pStyle w:val="tablecopy"/>
-              <w:jc w:val="left"/>
-            </w:pPr>
-            <w:r>
-              <w:t>Post published in English only</w:t>
-            </w:r>
-          </w:p>
-        </w:tc>
-        <w:tc>
-          <w:tcPr>
-            <w:tcW w:type="dxa" w:w="1100"/>
-          </w:tcPr>
-          <w:p>
-            <w:pPr>
-              <w:pStyle w:val="tablecopy"/>
-              <w:jc w:val="left"/>
-            </w:pPr>
-            <w:r>
-              <w:t>derive</w:t>
-            </w:r>
-          </w:p>
-        </w:tc>
-        <w:tc>
-          <w:tcPr>
-            <w:tcW w:type="dxa" w:w="1100"/>
-          </w:tcPr>
-          <w:p>
-            <w:pPr>
-              <w:pStyle w:val="tablecopy"/>
-              <w:jc w:val="left"/>
-            </w:pPr>
-            <w:r>
-              <w:t>derive</w:t>
-            </w:r>
-          </w:p>
-        </w:tc>
-      </w:tr>
-      <w:tr>
-        <w:tc>
-          <w:tcPr>
-            <w:tcW w:type="dxa" w:w="2560"/>
-          </w:tcPr>
-          <w:p>
-            <w:pPr>
-              <w:pStyle w:val="tablecopy"/>
-              <w:jc w:val="left"/>
-            </w:pPr>
-            <w:r>
-              <w:t>Page without a title</w:t>
-            </w:r>
-          </w:p>
-        </w:tc>
-        <w:tc>
-          <w:tcPr>
-            <w:tcW w:type="dxa" w:w="1100"/>
-          </w:tcPr>
-          <w:p>
-            <w:pPr>
-              <w:pStyle w:val="tablecopy"/>
-              <w:jc w:val="left"/>
-            </w:pPr>
-            <w:r>
-              <w:t>derive</w:t>
-            </w:r>
-          </w:p>
-        </w:tc>
-        <w:tc>
-          <w:tcPr>
-            <w:tcW w:type="dxa" w:w="1100"/>
-          </w:tcPr>
-          <w:p>
-            <w:pPr>
-              <w:pStyle w:val="tablecopy"/>
-              <w:jc w:val="left"/>
-            </w:pPr>
-            <w:r>
-              <w:t>derive</w:t>
-            </w:r>
-          </w:p>
-        </w:tc>
-      </w:tr>
-      <w:tr>
-        <w:tc>
-          <w:tcPr>
-            <w:tcW w:type="dxa" w:w="10119"/>
-            <w:gridSpan w:val="3"/>
-          </w:tcPr>
-          <w:p>
-            <w:pPr>
-              <w:pStyle w:val="tablecopy"/>
-              <w:jc w:val="left"/>
-            </w:pPr>
-            <w:r>
-              <w:rPr>
-                <w:i/>
-              </w:rPr>
-              <w:t>Declaration breaks a rule</w:t>
-            </w:r>
-          </w:p>
-        </w:tc>
-      </w:tr>
-      <w:tr>
-        <w:tc>
-          <w:tcPr>
-            <w:tcW w:type="dxa" w:w="2560"/>
-          </w:tcPr>
-          <w:p>
-            <w:pPr>
-              <w:pStyle w:val="tablecopy"/>
-              <w:jc w:val="left"/>
-            </w:pPr>
-            <w:r>
-              <w:t>Text below 4.5 : 1 contrast</w:t>
-            </w:r>
-          </w:p>
-        </w:tc>
-        <w:tc>
-          <w:tcPr>
-            <w:tcW w:type="dxa" w:w="1100"/>
-          </w:tcPr>
-          <w:p>
-            <w:pPr>
-              <w:pStyle w:val="tablecopy"/>
-              <w:jc w:val="left"/>
-            </w:pPr>
-            <w:r>
-              <w:t>derive</w:t>
-            </w:r>
-          </w:p>
-        </w:tc>
-        <w:tc>
-          <w:tcPr>
-            <w:tcW w:type="dxa" w:w="1100"/>
-          </w:tcPr>
-          <w:p>
-            <w:pPr>
-              <w:pStyle w:val="tablecopy"/>
-              <w:jc w:val="left"/>
-            </w:pPr>
-            <w:r>
-              <w:t>derive</w:t>
-            </w:r>
-          </w:p>
-        </w:tc>
-      </w:tr>
-      <w:tr>
-        <w:tc>
-          <w:tcPr>
-            <w:tcW w:type="dxa" w:w="2560"/>
-          </w:tcPr>
-          <w:p>
-            <w:pPr>
-              <w:pStyle w:val="tablecopy"/>
-              <w:jc w:val="left"/>
-            </w:pPr>
-            <w:r>
-              <w:t>USB-C pull-down 5.1 → 22 kΩ</w:t>
-            </w:r>
-          </w:p>
-        </w:tc>
-        <w:tc>
-          <w:tcPr>
-            <w:tcW w:type="dxa" w:w="1100"/>
-          </w:tcPr>
-          <w:p>
-            <w:pPr>
-              <w:pStyle w:val="tablecopy"/>
-              <w:jc w:val="left"/>
-            </w:pPr>
-            <w:r>
-              <w:t>derive</w:t>
-            </w:r>
-          </w:p>
-        </w:tc>
-        <w:tc>
-          <w:tcPr>
-            <w:tcW w:type="dxa" w:w="1100"/>
-          </w:tcPr>
-          <w:p>
-            <w:pPr>
-              <w:pStyle w:val="tablecopy"/>
-              <w:jc w:val="left"/>
-            </w:pPr>
-            <w:r>
-              <w:t>derive</w:t>
-            </w:r>
-          </w:p>
-        </w:tc>
-      </w:tr>
-      <w:tr>
-        <w:tc>
-          <w:tcPr>
-            <w:tcW w:type="dxa" w:w="2560"/>
-          </w:tcPr>
-          <w:p>
-            <w:pPr>
-              <w:pStyle w:val="tablecopy"/>
-              <w:jc w:val="left"/>
-            </w:pPr>
-            <w:r>
-              <w:t>Cost limit lowered to USD 3</w:t>
-            </w:r>
-          </w:p>
-        </w:tc>
-        <w:tc>
-          <w:tcPr>
-            <w:tcW w:type="dxa" w:w="1100"/>
-          </w:tcPr>
-          <w:p>
-            <w:pPr>
-              <w:pStyle w:val="tablecopy"/>
-              <w:jc w:val="left"/>
-            </w:pPr>
-            <w:r>
-              <w:t>derive</w:t>
-            </w:r>
-          </w:p>
-        </w:tc>
-        <w:tc>
-          <w:tcPr>
-            <w:tcW w:type="dxa" w:w="1100"/>
-          </w:tcPr>
-          <w:p>
-            <w:pPr>
-              <w:pStyle w:val="tablecopy"/>
-              <w:jc w:val="left"/>
-            </w:pPr>
-            <w:r>
-              <w:t>derive</w:t>
-            </w:r>
-          </w:p>
-        </w:tc>
-      </w:tr>
-      <w:tr>
-        <w:tc>
-          <w:tcPr>
-            <w:tcW w:type="dxa" w:w="10119"/>
-            <w:gridSpan w:val="3"/>
-          </w:tcPr>
-          <w:p>
-            <w:pPr>
-              <w:pStyle w:val="tablecopy"/>
-              <w:jc w:val="left"/>
-            </w:pPr>
-            <w:r>
-              <w:rPr>
-                <w:i/>
-              </w:rPr>
-              <w:t>Declarations conflict</w:t>
-            </w:r>
-          </w:p>
-        </w:tc>
-      </w:tr>
-      <w:tr>
-        <w:tc>
-          <w:tcPr>
-            <w:tcW w:type="dxa" w:w="2560"/>
-          </w:tcPr>
-          <w:p>
-            <w:pPr>
-              <w:pStyle w:val="tablecopy"/>
-              <w:jc w:val="left"/>
-            </w:pPr>
-            <w:r>
-              <w:t>Sensor zone contradicts its vent</w:t>
-            </w:r>
-          </w:p>
-        </w:tc>
-        <w:tc>
-          <w:tcPr>
-            <w:tcW w:type="dxa" w:w="1100"/>
-          </w:tcPr>
-          <w:p>
-            <w:pPr>
-              <w:pStyle w:val="tablecopy"/>
-              <w:jc w:val="left"/>
-            </w:pPr>
-            <w:r>
-              <w:t>derive</w:t>
-            </w:r>
-          </w:p>
-        </w:tc>
-        <w:tc>
-          <w:tcPr>
-            <w:tcW w:type="dxa" w:w="1100"/>
-          </w:tcPr>
-          <w:p>
-            <w:pPr>
-              <w:pStyle w:val="tablecopy"/>
-              <w:jc w:val="left"/>
-            </w:pPr>
-            <w:r>
-              <w:t>derive</w:t>
-            </w:r>
-          </w:p>
-        </w:tc>
-      </w:tr>
-      <w:tr>
-        <w:tc>
-          <w:tcPr>
-            <w:tcW w:type="dxa" w:w="2560"/>
-          </w:tcPr>
-          <w:p>
-            <w:pPr>
-              <w:pStyle w:val="tablecopy"/>
-              <w:jc w:val="left"/>
-            </w:pPr>
-            <w:r>
-              <w:t>Case narrowed 36 → 28 mm</w:t>
-            </w:r>
-          </w:p>
-        </w:tc>
-        <w:tc>
-          <w:tcPr>
-            <w:tcW w:type="dxa" w:w="1100"/>
-          </w:tcPr>
-          <w:p>
-            <w:pPr>
-              <w:pStyle w:val="tablecopy"/>
-              <w:jc w:val="left"/>
-            </w:pPr>
-            <w:r>
-              <w:t>derive</w:t>
-            </w:r>
-          </w:p>
-        </w:tc>
-        <w:tc>
-          <w:tcPr>
-            <w:tcW w:type="dxa" w:w="1100"/>
-          </w:tcPr>
-          <w:p>
-            <w:pPr>
-              <w:pStyle w:val="tablecopy"/>
-              <w:jc w:val="left"/>
-            </w:pPr>
-            <w:r>
-              <w:t>derive</w:t>
-            </w:r>
-          </w:p>
-        </w:tc>
-      </w:tr>
-      <w:tr>
-        <w:tc>
-          <w:tcPr>
-            <w:tcW w:type="dxa" w:w="10119"/>
-            <w:gridSpan w:val="3"/>
-          </w:tcPr>
-          <w:p>
-            <w:pPr>
-              <w:pStyle w:val="tablecopy"/>
-              <w:jc w:val="left"/>
-            </w:pPr>
-            <w:r>
-              <w:rPr>
-                <w:i/>
-              </w:rPr>
-              <w:t>Code out of date</w:t>
-            </w:r>
-          </w:p>
-        </w:tc>
-      </w:tr>
-      <w:tr>
-        <w:tc>
-          <w:tcPr>
-            <w:tcW w:type="dxa" w:w="2560"/>
-          </w:tcPr>
-          <w:p>
-            <w:pPr>
-              <w:pStyle w:val="tablecopy"/>
-              <w:jc w:val="left"/>
-            </w:pPr>
-            <w:r>
-              <w:t>Net renamed, code not updated</w:t>
-            </w:r>
-          </w:p>
-        </w:tc>
-        <w:tc>
-          <w:tcPr>
-            <w:tcW w:type="dxa" w:w="1100"/>
-          </w:tcPr>
-          <w:p>
-            <w:pPr>
-              <w:pStyle w:val="tablecopy"/>
-              <w:jc w:val="left"/>
-            </w:pPr>
-            <w:r>
-              <w:t>compiler</w:t>
-            </w:r>
-          </w:p>
-        </w:tc>
-        <w:tc>
-          <w:tcPr>
-            <w:tcW w:type="dxa" w:w="1100"/>
-          </w:tcPr>
-          <w:p>
-            <w:pPr>
-              <w:pStyle w:val="tablecopy"/>
-              <w:jc w:val="left"/>
-            </w:pPr>
-            <w:r>
-              <w:t>compiler</w:t>
-            </w:r>
-          </w:p>
-        </w:tc>
-      </w:tr>
-      <w:tr>
-        <w:tc>
-          <w:tcPr>
-            <w:tcW w:type="dxa" w:w="10119"/>
-            <w:gridSpan w:val="3"/>
-          </w:tcPr>
-          <w:p>
-            <w:pPr>
-              <w:pStyle w:val="tablecopy"/>
-              <w:jc w:val="left"/>
-            </w:pPr>
-            <w:r>
-              <w:rPr>
-                <w:i/>
-              </w:rPr>
-              <w:t>Declaration bypassed</w:t>
-            </w:r>
-          </w:p>
-        </w:tc>
-      </w:tr>
-      <w:tr>
-        <w:tc>
-          <w:tcPr>
-            <w:tcW w:type="dxa" w:w="2560"/>
-          </w:tcPr>
-          <w:p>
-            <w:pPr>
-              <w:pStyle w:val="tablecopy"/>
-              <w:jc w:val="left"/>
-            </w:pPr>
-            <w:r>
-              <w:t>Pin named by number, then moved</w:t>
-            </w:r>
-          </w:p>
-        </w:tc>
-        <w:tc>
-          <w:tcPr>
-            <w:tcW w:type="dxa" w:w="1100"/>
-          </w:tcPr>
-          <w:p>
-            <w:pPr>
-              <w:pStyle w:val="tablecopy"/>
-              <w:jc w:val="left"/>
-            </w:pPr>
-            <w:r>
-              <w:t>not caught</w:t>
-            </w:r>
-          </w:p>
-        </w:tc>
-        <w:tc>
-          <w:tcPr>
-            <w:tcW w:type="dxa" w:w="1100"/>
-          </w:tcPr>
-          <w:p>
-            <w:pPr>
-              <w:pStyle w:val="tablecopy"/>
-              <w:jc w:val="left"/>
-            </w:pPr>
-            <w:r>
-              <w:t>derive</w:t>
-            </w:r>
-          </w:p>
-        </w:tc>
-      </w:tr>
-      <w:tr>
-        <w:tc>
-          <w:tcPr>
-            <w:tcW w:type="dxa" w:w="2560"/>
-          </w:tcPr>
-          <w:p>
-            <w:pPr>
-              <w:pStyle w:val="tablecopy"/>
-              <w:jc w:val="left"/>
-            </w:pPr>
-            <w:r>
-              <w:t>Sensor address typed in firmware</w:t>
-            </w:r>
-          </w:p>
-        </w:tc>
-        <w:tc>
-          <w:tcPr>
-            <w:tcW w:type="dxa" w:w="1100"/>
-          </w:tcPr>
-          <w:p>
-            <w:pPr>
-              <w:pStyle w:val="tablecopy"/>
-              <w:jc w:val="left"/>
-            </w:pPr>
-            <w:r>
-              <w:t>not caught</w:t>
-            </w:r>
-          </w:p>
-        </w:tc>
-        <w:tc>
-          <w:tcPr>
-            <w:tcW w:type="dxa" w:w="1100"/>
-          </w:tcPr>
-          <w:p>
-            <w:pPr>
-              <w:pStyle w:val="tablecopy"/>
-              <w:jc w:val="left"/>
-            </w:pPr>
-            <w:r>
-              <w:t>derive</w:t>
-            </w:r>
-          </w:p>
-        </w:tc>
-      </w:tr>
-      <w:tr>
-        <w:tc>
-          <w:tcPr>
-            <w:tcW w:type="dxa" w:w="10119"/>
-            <w:gridSpan w:val="3"/>
-          </w:tcPr>
-          <w:p>
-            <w:pPr>
-              <w:pStyle w:val="tablecopy"/>
-              <w:jc w:val="left"/>
-            </w:pPr>
-            <w:r>
-              <w:rPr>
-                <w:i/>
-              </w:rPr>
-              <w:t>Copied, not translated</w:t>
-            </w:r>
-          </w:p>
-        </w:tc>
-      </w:tr>
-      <w:tr>
-        <w:tc>
-          <w:tcPr>
-            <w:tcW w:type="dxa" w:w="2560"/>
-          </w:tcPr>
-          <w:p>
-            <w:pPr>
-              <w:pStyle w:val="tablecopy"/>
-              <w:jc w:val="left"/>
-            </w:pPr>
-            <w:r>
-              <w:t>Serbian string left in English</w:t>
-            </w:r>
-          </w:p>
-        </w:tc>
-        <w:tc>
-          <w:tcPr>
-            <w:tcW w:type="dxa" w:w="1100"/>
-          </w:tcPr>
-          <w:p>
-            <w:pPr>
-              <w:pStyle w:val="tablecopy"/>
-              <w:jc w:val="left"/>
-            </w:pPr>
-            <w:r>
-              <w:t>not caught</w:t>
-            </w:r>
-          </w:p>
-        </w:tc>
-        <w:tc>
-          <w:tcPr>
-            <w:tcW w:type="dxa" w:w="1100"/>
-          </w:tcPr>
-          <w:p>
-            <w:pPr>
-              <w:pStyle w:val="tablecopy"/>
-              <w:jc w:val="left"/>
-            </w:pPr>
-            <w:r>
-              <w:t>‑‑check</w:t>
-            </w:r>
-          </w:p>
-        </w:tc>
-      </w:tr>
-    </w:tbl>
-    <w:p>
-      <w:pPr>
-        <w:pStyle w:val="BodyText"/>
-      </w:pPr>
-      <w:r/>
-    </w:p>
-    <w:p>
-      <w:pPr>
-        <w:pStyle w:val="BodyText"/>
-      </w:pPr>
-      <w:r>
-        <w:t>Each miss became a general rule: every pipeline lists its inputs; firmware that names a pin or an I²C address directly is refused; the sensor’s address is declared with the part and derived into the firmware; a translation identical to the default language fails unless it is declared the same on purpose; and every message is declared once, with both sides’ code generated. On the current version, all twenty mistakes are caught: ten during derivation, nine by --check and one by the compiler. Every correct change passes and the runs with no change leave every file as it was. Every failure names the file and the declaration at fault (Fig. 4).</w:t>
+        <w:t>On release 0.9.4 the checks caught 15 of the 20. Each miss was a fact the platform did not yet own: two declarations edited without re-deriving went unnoticed, because only the hardware pipeline tracked its inputs; firmware could name a pin or a sensor address directly; and a Serbian string left in English passed every structural check. Each miss became a general rule. On release 0.9.11, all 20 are caught – 10 during derivation, 9 by --check and 1 by the compiler – and every correct change passes. Fig. 4 shows two of the messages.</w:t>
       </w:r>
     </w:p>
     <w:p>
@@ -2092,7 +1316,7 @@
         <w:pStyle w:val="Slika"/>
       </w:pPr>
       <w:r>
-        <w:t>Two failures from the test, as the person or agent sees them: (a) a string added in English only; (b) firmware that names a pin directly instead of taking it from the declaration.</w:t>
+        <w:t>Two failures as the person or agent sees them: (a) a string added in English only; (b) firmware naming a pin directly.</w:t>
       </w:r>
     </w:p>
     <w:p>
@@ -2100,7 +1324,7 @@
         <w:pStyle w:val="BodyText"/>
       </w:pPr>
       <w:r>
-        <w:t>The twenty were written by the author, who also wrote the platform, so they may favour what it was built to catch. Later rounds of mistakes, written separately from the platform’s code, found further gaps – among them a unit mismatch between firmware and page, an I²C line with no pull-up resistor, and cookie consent that started with a choice already made – and each was again turned into a rule.</w:t>
+        <w:t>The mistakes were chosen by the author of the platform, only two products were built, and neither has been manufactured yet. The test measures the checks, not whether agents make fewer mistakes with Fiducial than without it.</w:t>
       </w:r>
     </w:p>
     <w:p>
@@ -2109,7 +1333,7 @@
         <w:keepNext/>
       </w:pPr>
       <w:r>
-        <w:t>Discussion</w:t>
+        <w:t>Conclusion</w:t>
       </w:r>
     </w:p>
     <w:p>
@@ -2117,23 +1341,7 @@
         <w:pStyle w:val="BodyText"/>
       </w:pPr>
       <w:r>
-        <w:t>Better models move the line between what a person must check and what can be left to an agent, but they do not remove it. A probabilistic system cannot be guaranteed to be correct, and even a deterministic tool is only right about what it was told. Fiducial bounds that uncertainty: declarations are the constraints, derivation is repeatable, and the checks refuse drift. The person still judges what no check can. During this work that meant a parts catalogue that changed format overnight, a text match that read “±0.1 %” as “1 %”, and a sensor that had to be moved away from the board’s heat.</w:t>
-      </w:r>
-    </w:p>
-    <w:p>
-      <w:pPr>
-        <w:pStyle w:val="BodyText"/>
-      </w:pPr>
-      <w:r>
-        <w:t>The main lesson is about structure more than any one tool. Keeping every discipline in one repository with one shape made the product something an agent can see whole, and turning each escaped mistake into a rule made the checks stronger with use.</w:t>
-      </w:r>
-    </w:p>
-    <w:p>
-      <w:pPr>
-        <w:pStyle w:val="BodyText"/>
-      </w:pPr>
-      <w:r>
-        <w:t>The evidence has clear limits. Only two products were built, one of them public, and neither has been manufactured and tested yet. The test measures the checks, not whether agents working with Fiducial make fewer mistakes than agents working without it. Circuit checks are DC only, and autorouting is not deterministic, so a routed board is checked rather than compared byte for byte.</w:t>
+        <w:t>Better models will move the line between what a person checks and what is left to agents, but a probabilistic system cannot guarantee its own output. Fiducial keeps that output bounded: each fact is declared once, everything else is derived, and every change is checked. With it, one person working with AI agents kept a product’s code, board and case in agreement, and mistakes were caught early by messages that name their cause. Future work will manufacture and test the sensor stick and compare agents working with and without the platform on the same tasks. Fiducial and the example are open source [4].</w:t>
       </w:r>
     </w:p>
     <w:p>
@@ -2142,23 +1350,6 @@
         <w:keepNext/>
       </w:pPr>
       <w:r>
-        <w:t>Conclusion</w:t>
-      </w:r>
-    </w:p>
-    <w:p>
-      <w:pPr>
-        <w:pStyle w:val="BodyText"/>
-      </w:pPr>
-      <w:r>
-        <w:t>Fiducial gives a product one structure across software and hardware: each fact declared once, everything else derived, and every change checked. That makes development quicker, because a new product starts from working parts and a change is made in one place, and more reliable, because a mistake is caught with a message that names its cause. Twenty injected mistakes found five gaps in the first run; once each became a general rule, all twenty are caught. The next steps are to manufacture the sensor stick and to compare agents working with and without the platform on the same tasks. The platform and the example are open source [4].</w:t>
-      </w:r>
-    </w:p>
-    <w:p>
-      <w:pPr>
-        <w:pStyle w:val="Heading1"/>
-        <w:keepNext/>
-      </w:pPr>
-      <w:r>
         <w:t>References</w:t>
       </w:r>
     </w:p>
@@ -2215,39 +1406,31 @@
         <w:pStyle w:val="references"/>
       </w:pPr>
       <w:r>
+        <w:t>KiCad EDA. Available at: https://www.kicad.org/</w:t>
+      </w:r>
+    </w:p>
+    <w:p>
+      <w:pPr>
+        <w:pStyle w:val="references"/>
+      </w:pPr>
+      <w:r>
+        <w:t>L. Perron and F. Didier, CP-SAT, Google OR-Tools. Available at: https://developers.google.com/optimization/cp/cp_solver</w:t>
+      </w:r>
+    </w:p>
+    <w:p>
+      <w:pPr>
+        <w:pStyle w:val="references"/>
+      </w:pPr>
+      <w:r>
+        <w:t>build123d, a Python CAD library on the OpenCascade kernel. Available at: https://github.com/gumyr/build123d</w:t>
+      </w:r>
+    </w:p>
+    <w:p>
+      <w:pPr>
+        <w:pStyle w:val="references"/>
+      </w:pPr>
+      <w:r>
         <w:t>AGENTS.md, a format for guiding coding agents. Available at: https://agents.md/</w:t>
-      </w:r>
-    </w:p>
-    <w:p>
-      <w:pPr>
-        <w:pStyle w:val="references"/>
-      </w:pPr>
-      <w:r>
-        <w:t>L. Perron and F. Didier, CP-SAT, Google OR-Tools. Available at: https://developers.google.com/optimization/cp/cp_solver</w:t>
-      </w:r>
-    </w:p>
-    <w:p>
-      <w:pPr>
-        <w:pStyle w:val="references"/>
-      </w:pPr>
-      <w:r>
-        <w:t>build123d, a Python CAD library on the OpenCascade kernel. Available at: https://github.com/gumyr/build123d</w:t>
-      </w:r>
-    </w:p>
-    <w:p>
-      <w:pPr>
-        <w:pStyle w:val="references"/>
-      </w:pPr>
-      <w:r>
-        <w:t>KiCad EDA. Available at: https://www.kicad.org/</w:t>
-      </w:r>
-    </w:p>
-    <w:p>
-      <w:pPr>
-        <w:pStyle w:val="references"/>
-      </w:pPr>
-      <w:r>
-        <w:t>Embassy, an async framework for embedded Rust. Available at: https://embassy.dev/</w:t>
       </w:r>
     </w:p>
     <w:p>

</xml_diff>

<commit_message>
docs(paper): rewrite for a first-time reader, four pages
The paper now tells the story it exists for: agents made writing each
part of a product fast and moved the hard problem to keeping the parts
in agreement; nothing gives a whole product one checked context. It
places Fiducial among model-driven engineering, build systems and
agent context files, explains each term as it is introduced (fact,
artifact, drift, declaration, hash, continuous integration, capability,
constraint solver), and keeps Outreach and the sensor stick as parts of
that story rather than its subject. Four pages, as IEEESTEC requires.

Co-Authored-By: Claude Opus 5.5 <noreply@anthropic.com>
Claude-Session: https://claude.ai/code/session_0185NnNkfrVmB6KpyPa4GJCQ
</commit_message>
<xml_diff>
--- a/docs/paper/Fiducial_Zdravkovic_Aleksa.docx
+++ b/docs/paper/Fiducial_Zdravkovic_Aleksa.docx
@@ -232,7 +232,7 @@
         <w:t>Abstract—</w:t>
       </w:r>
       <w:r>
-        <w:t>This paper presents Fiducial, an open-source platform for building products that combine software and hardware with AI coding agents. Every fact about a product is declared once in typed text files, every artifact that uses it – code, translations, circuit board, case – is derived from it by one command, and checks on every commit refuse anything that no longer matches its declaration. In a test of 20 realistic mistakes in a web product and a USB-C sensor stick, the first version caught 15. Each miss was turned into a general rule, and the current version catches all 20.</w:t>
+        <w:t>AI coding agents can now write firmware, web applications and even circuit-board and enclosure code, which lets one person attempt products that used to need a team. Building such products showed the author where this falls short: each part can be written quickly, but the facts the parts share are copied between them, and nothing keeps the copies in agreement. This paper presents Fiducial, an open-source platform that gives a whole product, software and hardware alike, one structure. Every fact is declared once, every artifact that uses it is generated from that declaration, and checks on every change refuse anything that no longer agrees with it, so AI agents work inside the checks instead of being trusted. When 20 realistic mistakes were injected into two products, the first version of the checks caught 15; each miss became a general rule, and the current version catches all 20.</w:t>
       </w:r>
     </w:p>
     <w:p>
@@ -263,7 +263,7 @@
         <w:pStyle w:val="BodyText"/>
       </w:pPr>
       <w:r>
-        <w:t>While building Outreach [1], an off-grid messaging system made of radios, gateways, a companion app and printed cases, the author met the same problem more than once. The firmware and the app disagreed on the layout of a message, and a printed case did not fit the board it was made for. Neither part was wrong on its own. The facts they shared had been copied by hand between different tools, one copy changed, and the mistake showed up only when the parts were put together.</w:t>
+        <w:t>Building a product used to take a team: someone for the circuit board, someone for the firmware, others for the app, the website and the enclosure. AI coding agents such as Claude Code [1] and Codex [2] are changing that. An agent can write a firmware driver, a web page, a database migration or a script that models a case in minutes, so one person can now attempt a whole product.</w:t>
       </w:r>
     </w:p>
     <w:p>
@@ -271,7 +271,7 @@
         <w:pStyle w:val="BodyText"/>
       </w:pPr>
       <w:r>
-        <w:t>AI coding agents [2], [3] now write much of this work, but they make the problem faster rather than smaller: an agent that knows one codebase does not know what changed in the others. Every project also has its own layout and habits, so each new product starts from scratch.</w:t>
+        <w:t>Building such products – first Outreach [3], an off-grid messaging system made of radios, gateways, an app and printed cases, and then the platform described here – showed the author where the difficulty had moved. Writing each part was no longer the slow step; keeping the parts in agreement was. The radio’s firmware and the app disagreed on the layout of a message, and a printed case did not fit the board it was made for. Neither part was wrong on its own. The facts they shared had been copied by hand from one tool to another, one copy changed, and the mistake appeared only when the parts met.</w:t>
       </w:r>
     </w:p>
     <w:p>
@@ -279,7 +279,65 @@
         <w:pStyle w:val="BodyText"/>
       </w:pPr>
       <w:r>
-        <w:t>Fiducial [4] gives every product the same structure, built on one rule: each fact is declared once, everything that uses it is derived from it, and every change is checked (Fig. 1). People and agents edit the declarations, never the outputs. The idea builds on model-driven engineering [5] and on build systems that track their inputs by hash [6], applied to every discipline of one product at once, in plain files that agents read and write well.</w:t>
+        <w:t>Agents do not remove this problem; they speed it up. An agent works inside one codebase and sees only what is in it, so the agent writing the firmware does not know the board changed, and the one writing the web page does not know the firmware did. Its output is also probabilistic: usually right, but never guaranteed. More code, written faster, in more disconnected places, gives an inconsistent product sooner.</w:t>
+      </w:r>
+    </w:p>
+    <w:p>
+      <w:pPr>
+        <w:pStyle w:val="BodyText"/>
+      </w:pPr>
+      <w:r>
+        <w:t>What is missing is not a better tool for any one discipline, but one shared and checked context for all of them: a single place where a product’s facts live, from which every part is produced, and which refuses a change that makes the parts disagree. This paper presents Fiducial [4], an open-source platform built to provide it, and tests whether its checks catch the mistakes that people and agents actually make.</w:t>
+      </w:r>
+    </w:p>
+    <w:p>
+      <w:pPr>
+        <w:pStyle w:val="Heading1"/>
+        <w:keepNext/>
+      </w:pPr>
+      <w:r>
+        <w:t>Background</w:t>
+      </w:r>
+    </w:p>
+    <w:p>
+      <w:pPr>
+        <w:pStyle w:val="BodyText"/>
+      </w:pPr>
+      <w:r>
+        <w:t>The idea that a fact should be written only once is not new. Model-driven engineering generates code and configuration from a central model, so that each design decision is stated in one place [5], and model-based systems engineering keeps the mechanical, electrical and software views of a product in one model and checks them for inconsistencies [6]. These approaches put a modelling tool at the centre and an engineer at its controls.</w:t>
+      </w:r>
+    </w:p>
+    <w:p>
+      <w:pPr>
+        <w:pStyle w:val="BodyText"/>
+      </w:pPr>
+      <w:r>
+        <w:t>Build systems solved a related problem for software. A build system knows which outputs depend on which inputs and rebuilds only what changed; Nix goes further and identifies every result by a fingerprint of its inputs, so that a build can be reproduced exactly and no change goes unnoticed [7]. This works within software, but a circuit board, an enclosure or a translated web page usually lies outside it.</w:t>
+      </w:r>
+    </w:p>
+    <w:p>
+      <w:pPr>
+        <w:pStyle w:val="BodyText"/>
+      </w:pPr>
+      <w:r>
+        <w:t>Coding agents, finally, are guided by context files such as AGENTS.md [8], which describe a repository’s layout and rules in plain language. They help, but an agent can still misread or ignore them, and nothing checks its work against the rest of the product. A known way to use a generator that can be wrong is to pair it with a checker that cannot: the generator proposes and a sound verifier decides [9]. Fiducial brings the three ideas together for a whole product: facts in plain text that agents can edit, outputs generated for every discipline, and checks that decide what is accepted.</w:t>
+      </w:r>
+    </w:p>
+    <w:p>
+      <w:pPr>
+        <w:pStyle w:val="Heading1"/>
+        <w:keepNext/>
+      </w:pPr>
+      <w:r>
+        <w:t>The Approach</w:t>
+      </w:r>
+    </w:p>
+    <w:p>
+      <w:pPr>
+        <w:pStyle w:val="BodyText"/>
+      </w:pPr>
+      <w:r>
+        <w:t>Fiducial treats a product as two kinds of thing. Facts are the decisions that define it: which pin a sensor is connected to, what a button says in each language, the brand colour, the size of the board, the layout of a message between a device and its app. Artifacts are everything built from those facts: source code, schematics, circuit boards, translation files, web pages, enclosure models. Drift is what happens when an artifact stops agreeing with a fact, or with another artifact that uses the same fact (Fig. 1a). The approach consists of three rules that together make drift visible and keep it out of the product (Fig. 1b).</w:t>
       </w:r>
     </w:p>
     <w:p>
@@ -293,7 +351,7 @@
       <w:r>
         <w:drawing>
           <wp:inline xmlns:a="http://schemas.openxmlformats.org/drawingml/2006/main" xmlns:pic="http://schemas.openxmlformats.org/drawingml/2006/picture">
-            <wp:extent cx="2880360" cy="2349894"/>
+            <wp:extent cx="2560320" cy="2088794"/>
             <wp:docPr id="1" name="Picture 1"/>
             <wp:cNvGraphicFramePr>
               <a:graphicFrameLocks noChangeAspect="1"/>
@@ -314,7 +372,7 @@
                   <pic:spPr>
                     <a:xfrm>
                       <a:off x="0" y="0"/>
-                      <a:ext cx="2880360" cy="2349894"/>
+                      <a:ext cx="2560320" cy="2088794"/>
                     </a:xfrm>
                     <a:prstGeom prst="rect"/>
                   </pic:spPr>
@@ -330,7 +388,39 @@
         <w:pStyle w:val="Slika"/>
       </w:pPr>
       <w:r>
-        <w:t>One fact in four places: (a) copied by hand, one copy changes and nothing notices; (b) declared once, every copy is derived and checked.</w:t>
+        <w:t>One fact used in four places: (a) copied by hand, one copy changes and nothing notices; (b) declared once, every copy is generated from the declaration and checked.</w:t>
+      </w:r>
+    </w:p>
+    <w:p>
+      <w:pPr>
+        <w:pStyle w:val="BodyText"/>
+      </w:pPr>
+      <w:r>
+        <w:t>Declare once. Every fact is written in exactly one place, a declaration: a typed text file in the product’s repository. Typed means the file has a fixed structure that a program can check, not free prose. A fact that exists once has no second copy to disagree with.</w:t>
+      </w:r>
+    </w:p>
+    <w:p>
+      <w:pPr>
+        <w:pStyle w:val="BodyText"/>
+      </w:pPr>
+      <w:r>
+        <w:t>Derive everything else. Every artifact that depends on a fact is generated from its declaration by one command, and generated files are never edited by hand. Generation is deterministic: the same declarations always produce exactly the same files, which makes the product reproducible and makes any difference meaningful.</w:t>
+      </w:r>
+    </w:p>
+    <w:p>
+      <w:pPr>
+        <w:pStyle w:val="BodyText"/>
+      </w:pPr>
+      <w:r>
+        <w:t>Check every change. Before a change is accepted, checks confirm that every artifact still matches what its declarations produce now, and that the declarations themselves are valid. A failing check names the declaration and the file at fault, so the person or agent knows what to fix.</w:t>
+      </w:r>
+    </w:p>
+    <w:p>
+      <w:pPr>
+        <w:pStyle w:val="BodyText"/>
+      </w:pPr>
+      <w:r>
+        <w:t>These rules change the role of an AI agent. The agent still edits declarations and code, but it is no longer trusted to keep anything consistent: generation does that, and the checks confirm it. Its mistakes are not prevented, but they are caught before they reach the product, with a message precise enough for the agent to correct itself. The name comes from electronics manufacturing, where fiducials are the marks on a circuit board that every machine aligns to; the declarations play that role for a whole product.</w:t>
       </w:r>
     </w:p>
     <w:p>
@@ -339,7 +429,7 @@
         <w:keepNext/>
       </w:pPr>
       <w:r>
-        <w:t>System Overview and Implementation</w:t>
+        <w:t>Implementation</w:t>
       </w:r>
     </w:p>
     <w:p>
@@ -347,7 +437,7 @@
         <w:pStyle w:val="BodyText"/>
       </w:pPr>
       <w:r>
-        <w:t>Fiducial is a command-line tool, fid, written in Rust. fid new creates a product repository with a fixed layout, and fid add enables capabilities – packaged pipelines for web applications, translations, legal pages, design systems, databases, firmware, hardware and more. Because every product shares one structure, a new one starts from working, checked parts. Fig. 2 shows how a change moves through it.</w:t>
+        <w:t>Fiducial is a command-line tool, fid, written in Rust. Fig. 2 shows how a change moves through it.</w:t>
       </w:r>
     </w:p>
     <w:p>
@@ -361,7 +451,7 @@
       <w:r>
         <w:drawing>
           <wp:inline xmlns:a="http://schemas.openxmlformats.org/drawingml/2006/main" xmlns:pic="http://schemas.openxmlformats.org/drawingml/2006/picture">
-            <wp:extent cx="2651760" cy="1644091"/>
+            <wp:extent cx="2468880" cy="1530706"/>
             <wp:docPr id="2" name="Picture 2"/>
             <wp:cNvGraphicFramePr>
               <a:graphicFrameLocks noChangeAspect="1"/>
@@ -382,7 +472,7 @@
                   <pic:spPr>
                     <a:xfrm>
                       <a:off x="0" y="0"/>
-                      <a:ext cx="2651760" cy="1644091"/>
+                      <a:ext cx="2468880" cy="1530706"/>
                     </a:xfrm>
                     <a:prstGeom prst="rect"/>
                   </pic:spPr>
@@ -398,7 +488,7 @@
         <w:pStyle w:val="Slika"/>
       </w:pPr>
       <w:r>
-        <w:t>A change in Fiducial: declarations are edited, derivation produces the artifacts with help from established engines, and the checks either accept the change or name the declaration at fault.</w:t>
+        <w:t>How a change moves through Fiducial: declarations are edited, generation produces the artifacts with the help of established engines, and the checks either accept the change or return a message naming the declaration at fault.</w:t>
       </w:r>
     </w:p>
     <w:p>
@@ -407,7 +497,7 @@
         <w:keepNext/>
       </w:pPr>
       <w:r>
-        <w:t>Declarations</w:t>
+        <w:t>One Structure for Every Product</w:t>
       </w:r>
     </w:p>
     <w:p>
@@ -415,7 +505,7 @@
         <w:pStyle w:val="BodyText"/>
       </w:pPr>
       <w:r>
-        <w:t>A declaration is a typed text file in version control: the strings of each language, the brand and pages, the colour palette, the messages a device sends, and the parts of a physical product with what each pin connects to. Text files were chosen over a modelling tool because coding agents read and write them well, and every change goes through a normal code review. A declaration holds facts only; nothing in it says where a part sits on the board or how a page is laid out.</w:t>
+        <w:t>fid new creates a product repository with a fixed layout, and fid add enables capabilities. A capability is a packaged piece of the platform for one discipline: its declarations, the generator that turns them into artifacts, its checks, and instructions for agents. There are 23, from web applications, translations and legal pages to databases, device messages, firmware and hardware. Because every product shares the same structure, a person or agent who knows one knows them all, and a new product starts from parts that already work and pass their checks. When the platform improves, fid upgrade brings the change into each product while keeping the product’s own edits.</w:t>
       </w:r>
     </w:p>
     <w:p>
@@ -424,7 +514,7 @@
         <w:keepNext/>
       </w:pPr>
       <w:r>
-        <w:t>Derivation</w:t>
+        <w:t>Declarations and Generation</w:t>
       </w:r>
     </w:p>
     <w:p>
@@ -432,7 +522,7 @@
         <w:pStyle w:val="BodyText"/>
       </w:pPr>
       <w:r>
-        <w:t>fid derive runs every pipeline. Each one reads the declarations it needs and writes its artifacts, such as a typed translation module, a sitemap, a firmware pin map, TypeScript types or a KiCad board [7]. The hash of every input and output is stored in a lock file. Derivation is deterministic: the same inputs always give the same bytes, so a changed hash always means a real change.</w:t>
+        <w:t>Declarations are plain text files in version control: the strings of each language, the pages and brand of the website, the colour palette with the contrast each pair of colours must reach, the messages a device exchanges with its app and, for hardware, every part with the net each of its pins connects to. Text was chosen over a graphical modelling tool because coding agents read and write it well, and because every change then goes through ordinary code review. fid derive runs each capability’s generator, which reads the declarations and writes the artifacts, from a typed module of translations to a firmware pin map or a KiCad circuit board [10]. A lock file records a cryptographic hash – a short fingerprint of a file’s contents – for every input and output, so the platform knows exactly what each artifact was made from.</w:t>
       </w:r>
     </w:p>
     <w:p>
@@ -441,7 +531,7 @@
         <w:keepNext/>
       </w:pPr>
       <w:r>
-        <w:t>Engines for Hard Problems</w:t>
+        <w:t>Checks</w:t>
       </w:r>
     </w:p>
     <w:p>
@@ -449,7 +539,7 @@
         <w:pStyle w:val="BodyText"/>
       </w:pPr>
       <w:r>
-        <w:t>Some derivations are real engineering problems. The first version placed board parts with a hand-written search, and each product added special rules until they began to interact. Now the platform only writes the problem down and hands it to an established engine: the CP-SAT solver [8] places the parts, build123d on the OpenCascade kernel [9] builds the case, and KiCad routes and checks the board. Every placement rule is one of eight generic kinds, so a new requirement is a new declaration, not new code.</w:t>
+        <w:t>Checks run in continuous integration, the automatic build that runs on every proposed change, and a change is merged only when they pass. There are three kinds. Freshness: fid derive --check compares every recorded fingerprint with the repository and fails if a declaration changed without its artifacts being regenerated, or if a generated file was edited by hand. Rules: generation refuses declarations that break a rule, such as a language missing a string, two colours with too little contrast, parts that cost more than the declared limit, or a board that does not fit its case. Consumers: compilers and type checkers read the generated files, so code that still uses a renamed fact stops compiling.</w:t>
       </w:r>
     </w:p>
     <w:p>
@@ -458,7 +548,7 @@
         <w:keepNext/>
       </w:pPr>
       <w:r>
-        <w:t>Checks</w:t>
+        <w:t>Engines for Hard Problems</w:t>
       </w:r>
     </w:p>
     <w:p>
@@ -466,7 +556,7 @@
         <w:pStyle w:val="BodyText"/>
       </w:pPr>
       <w:r>
-        <w:t>Three kinds of check run on every commit. fid derive --check fails when a declaration changed without its outputs being re-derived, or when an output was edited by hand. Derivation refuses declarations that break a rule: a missing translation, too little colour contrast, parts over the cost limit, a board that does not fit its case. Compilers and type checkers read the derived files, so code that still uses a renamed fact stops compiling. Each failure names the file and the declaration at fault, which is the signal an agent needs to correct itself.</w:t>
+        <w:t>Some generation steps are real engineering problems: where to place the parts on a board, how to connect them, how to build a case around them. The first version placed parts with a search written by hand, and every new product added special rules until the rules began to interact. It was replaced by a different structure: the platform writes the problem down in a fixed format and hands it to an established engine. A constraint solver, CP-SAT [11], receives the rules a placement must satisfy and finds one that does, or proves that none exists; build123d on the OpenCascade kernel [12] builds the case; and KiCad routes the board and checks it against its design rules. Every placement rule is one of eight general kinds, such as inside, apart or near, so a new product needs new declarations rather than new code. When declarations contradict each other, the solver names the smallest set that cannot hold together.</w:t>
       </w:r>
     </w:p>
     <w:p>
@@ -475,7 +565,7 @@
         <w:keepNext/>
       </w:pPr>
       <w:r>
-        <w:t>Working with AI Agents</w:t>
+        <w:t>Agents in the Loop</w:t>
       </w:r>
     </w:p>
     <w:p>
@@ -483,16 +573,16 @@
         <w:pStyle w:val="BodyText"/>
       </w:pPr>
       <w:r>
-        <w:t>Every product carries an AGENTS.md file [10] and one instruction file per capability, so any agent starts from the same context. Agents are told to fix a problem where the fact is declared, never in a generated file. When a mistake gets past the checks, it is not patched for that one product; it becomes a general rule for all of them.</w:t>
-      </w:r>
-    </w:p>
-    <w:p>
-      <w:pPr>
-        <w:pStyle w:val="Heading2"/>
+        <w:t>Every product carries an AGENTS.md file and one instruction file per capability, so any agent starts with the same description of the product and its rules, and a hook stops an agent from editing a generated file. Agents are asked to fix a problem where the fact lives: a wrong pin in the declaration, a wrong generator in the platform, never in the output. The platform grows the same way. When a mistake gets past the checks, it is not patched for one product but turned into a general rule that protects every product.</w:t>
+      </w:r>
+    </w:p>
+    <w:p>
+      <w:pPr>
+        <w:pStyle w:val="Heading1"/>
         <w:keepNext/>
       </w:pPr>
       <w:r>
-        <w:t>Worked Example: Sensor Stick</w:t>
+        <w:t>Example: A Sensor Stick</w:t>
       </w:r>
     </w:p>
     <w:p>
@@ -500,7 +590,7 @@
         <w:pStyle w:val="BodyText"/>
       </w:pPr>
       <w:r>
-        <w:t>The repository includes a public example: a USB-C stick that reports temperature and humidity to a web page (Fig. 3). It has a printed case, a two-layer board with 23 parts, Rust firmware and a web page. The person writes the product declaration, an outline drawing, the firmware and the page. Fiducial derives the board, the case, the manufacturing files, and the code both sides use to read the sensor’s messages.</w:t>
+        <w:t>To show the whole approach on something anyone can inspect, the repository contains a complete example product: a USB-C stick that measures temperature and humidity and shows them on a web page (Fig. 3). It is small on purpose, but it has every discipline a product has: a printed case, a circuit board, firmware and a web page.</w:t>
       </w:r>
     </w:p>
     <w:p>
@@ -551,7 +641,23 @@
         <w:pStyle w:val="Slika"/>
       </w:pPr>
       <w:r>
-        <w:t>The sensor stick, derived from its declaration: (a) the closed case; (b) the routed board inside it, with the sensor under its vent.</w:t>
+        <w:t>The sensor stick, generated from its declaration: (a) the closed case; (b) the routed board inside it, with the sensor under its vent.</w:t>
+      </w:r>
+    </w:p>
+    <w:p>
+      <w:pPr>
+        <w:pStyle w:val="BodyText"/>
+      </w:pPr>
+      <w:r>
+        <w:t>The person writes four things: the product declaration with its parts and connections, an outline of its shape, the firmware’s logic and the page. Everything else is generated: the placed and routed board with its schematic and bill of materials, the case built around the board with an opening for the connector and a vent over the sensor, the files a manufacturer needs, and the code the firmware and the page both use to exchange readings.</w:t>
+      </w:r>
+    </w:p>
+    <w:p>
+      <w:pPr>
+        <w:pStyle w:val="BodyText"/>
+      </w:pPr>
+      <w:r>
+        <w:t>Moving the sensor to another pin is one changed line in the declaration. Until the product is regenerated, the check fails; afterwards the board, the schematic, the firmware’s pin map and the page’s types have all followed, and neither the firmware nor the page needed an edit. If the new pin is one the chip’s sensor bus cannot use, the firmware stops compiling – before any board is made.</w:t>
       </w:r>
     </w:p>
     <w:p>
@@ -560,7 +666,16 @@
         <w:keepNext/>
       </w:pPr>
       <w:r>
-        <w:t>Results</w:t>
+        <w:t>Evaluation</w:t>
+      </w:r>
+    </w:p>
+    <w:p>
+      <w:pPr>
+        <w:pStyle w:val="Heading2"/>
+        <w:keepNext/>
+      </w:pPr>
+      <w:r>
+        <w:t>Development</w:t>
       </w:r>
     </w:p>
     <w:p>
@@ -568,7 +683,16 @@
         <w:pStyle w:val="BodyText"/>
       </w:pPr>
       <w:r>
-        <w:t>Fiducial was built in six weeks by one person working with AI agents and used on two products, the sensor stick and a private one. The sensor stick’s board passes KiCad’s design-rule check with no errors. Moving its sensor to another pin is one changed line: fid derive then rewrites 8 generated files in 37 s, including the board, the firmware’s pin map and the page’s types, and neither the firmware nor the page needs an edit.</w:t>
+        <w:t>Fiducial was built over six weeks by one person working with AI agents, through 68 reviewed pull requests, and used on two products: the sensor stick and a private product. The sensor stick’s board passes its design-rule check with no errors, and moving one pin regenerates 8 files in 37 s.</w:t>
+      </w:r>
+    </w:p>
+    <w:p>
+      <w:pPr>
+        <w:pStyle w:val="Heading2"/>
+        <w:keepNext/>
+      </w:pPr>
+      <w:r>
+        <w:t>Injected Mistakes</w:t>
       </w:r>
     </w:p>
     <w:p>
@@ -576,7 +700,15 @@
         <w:pStyle w:val="BodyText"/>
       </w:pPr>
       <w:r>
-        <w:t>To test whether the checks catch the mistakes people actually make, 20 realistic mistakes were injected one at a time, in the manner of mutation testing [11]: ten in a fresh web product in English and Serbian, and ten in the sensor stick’s hardware, firmware and interface. They cover eight kinds of drift (Table I). After each one the checks ran as in continuous integration, and the product was reset. Three correct changes and two runs with no change confirmed that the checks do not fail without a reason. The test is a script in the repository.</w:t>
+        <w:t>Checks are only useful if they catch the mistakes that people and agents actually make. To measure this, the test borrows the idea of mutation testing [13]: a realistic mistake is introduced on purpose, the checks are run, and the result shows whether they noticed. Twenty mistakes were chosen to cover eight kinds of drift met while building Fiducial and its products (Table I): ten in a fresh web product in English and Serbian, and ten in the sensor stick’s hardware, firmware and the interface between them.</w:t>
+      </w:r>
+    </w:p>
+    <w:p>
+      <w:pPr>
+        <w:pStyle w:val="BodyText"/>
+      </w:pPr>
+      <w:r>
+        <w:t>Each mistake was applied to a clean copy of the product, the checks ran in the same order as in continuous integration, and the copy was reset. Three correct changes and two runs with no change at all tested the opposite direction: that the checks do not fail without a reason. The test is a script in the repository and runs with one command.</w:t>
       </w:r>
     </w:p>
     <w:p>
@@ -669,7 +801,7 @@
               <w:jc w:val="left"/>
             </w:pPr>
             <w:r>
-              <w:t>Now</w:t>
+              <w:t>0.9.11</w:t>
             </w:r>
           </w:p>
         </w:tc>
@@ -1265,7 +1397,7 @@
         <w:pStyle w:val="BodyText"/>
       </w:pPr>
       <w:r>
-        <w:t>On release 0.9.4 the checks caught 15 of the 20. Each miss was a fact the platform did not yet own: two declarations edited without re-deriving went unnoticed, because only the hardware pipeline tracked its inputs; firmware could name a pin or a sensor address directly; and a Serbian string left in English passed every structural check. Each miss became a general rule. On release 0.9.11, all 20 are caught – 10 during derivation, 9 by --check and 1 by the compiler – and every correct change passes. Fig. 4 shows two of the messages.</w:t>
+        <w:t>On release 0.9.4 the checks caught 15 of the 20. The five misses were the most useful result, because each was a fact the platform did not yet own. Two were declarations edited without regenerating: only the hardware generator recorded which files it read, so the freshness check did not notice that the others’ inputs had changed. In two, the firmware wrote a pin number or a sensor address directly instead of taking it from the declaration. The last was a Serbian string left in English, complete in structure but not translated. Each became a general rule: every generator now records its inputs, firmware that writes a declared value directly is refused, and a translation identical to the default language fails unless it is declared the same on purpose. On release 0.9.11, all 20 are caught – 10 during generation, 9 by the freshness check and 1 by the compiler – and every correct change passes. Fig. 4 shows two of the messages.</w:t>
       </w:r>
     </w:p>
     <w:p>
@@ -1279,7 +1411,7 @@
       <w:r>
         <w:drawing>
           <wp:inline xmlns:a="http://schemas.openxmlformats.org/drawingml/2006/main" xmlns:pic="http://schemas.openxmlformats.org/drawingml/2006/picture">
-            <wp:extent cx="2880360" cy="1625003"/>
+            <wp:extent cx="2651760" cy="1496035"/>
             <wp:docPr id="4" name="Picture 4"/>
             <wp:cNvGraphicFramePr>
               <a:graphicFrameLocks noChangeAspect="1"/>
@@ -1300,7 +1432,7 @@
                   <pic:spPr>
                     <a:xfrm>
                       <a:off x="0" y="0"/>
-                      <a:ext cx="2880360" cy="1625003"/>
+                      <a:ext cx="2651760" cy="1496035"/>
                     </a:xfrm>
                     <a:prstGeom prst="rect"/>
                   </pic:spPr>
@@ -1316,7 +1448,7 @@
         <w:pStyle w:val="Slika"/>
       </w:pPr>
       <w:r>
-        <w:t>Two failures as the person or agent sees them: (a) a string added in English only; (b) firmware naming a pin directly.</w:t>
+        <w:t>Two failures as the person or agent sees them: (a) a string added in English only; (b) firmware naming a pin directly instead of taking it from the declaration.</w:t>
       </w:r>
     </w:p>
     <w:p>
@@ -1324,7 +1456,7 @@
         <w:pStyle w:val="BodyText"/>
       </w:pPr>
       <w:r>
-        <w:t>The mistakes were chosen by the author of the platform, only two products were built, and neither has been manufactured yet. The test measures the checks, not whether agents make fewer mistakes with Fiducial than without it.</w:t>
+        <w:t>The mistakes were chosen by the author of the platform, so they may favour what it was built to catch. Only two products have been built, and neither has yet been manufactured and tested. The test measures the checks, not whether agents working with Fiducial make fewer mistakes than agents working without it.</w:t>
       </w:r>
     </w:p>
     <w:p>
@@ -1341,7 +1473,7 @@
         <w:pStyle w:val="BodyText"/>
       </w:pPr>
       <w:r>
-        <w:t>Better models will move the line between what a person checks and what is left to agents, but a probabilistic system cannot guarantee its own output. Fiducial keeps that output bounded: each fact is declared once, everything else is derived, and every change is checked. With it, one person working with AI agents kept a product’s code, board and case in agreement, and mistakes were caught early by messages that name their cause. Future work will manufacture and test the sensor stick and compare agents working with and without the platform on the same tasks. Fiducial and the example are open source [4].</w:t>
+        <w:t>AI agents have made writing each part of a product fast, and that has moved the hard problem to keeping the parts in agreement. Better models will move the line between what a person checks and what is left to agents, but a probabilistic system cannot guarantee its output, and even a deterministic tool is only right about what it was told. Fiducial answers this at the level of the product rather than the codebase: each fact is declared once, every artifact is generated from it, every change is checked, and hard problems go to proven engines. In practice, this let one person working with AI agents keep a product’s firmware, web page, circuit board and case in agreement, with every injected mistake caught early by a message that names its cause. Next, the sensor stick will be manufactured and tested, and agents will be compared working with and without the platform on the same tasks. Fiducial and its example are open source [4].</w:t>
       </w:r>
     </w:p>
     <w:p>
@@ -1358,6 +1490,22 @@
         <w:pStyle w:val="references"/>
       </w:pPr>
       <w:r>
+        <w:t>Claude Code documentation. Available at: https://docs.anthropic.com/en/docs/claude-code</w:t>
+      </w:r>
+    </w:p>
+    <w:p>
+      <w:pPr>
+        <w:pStyle w:val="references"/>
+      </w:pPr>
+      <w:r>
+        <w:t>OpenAI Codex. Available at: https://openai.com/codex/</w:t>
+      </w:r>
+    </w:p>
+    <w:p>
+      <w:pPr>
+        <w:pStyle w:val="references"/>
+      </w:pPr>
+      <w:r>
         <w:t>A. Zdravković, Đ. Jovanović and P. Šubarević, “Outreach: Modular AI-enhanced off-grid mesh communication system for remote environments,” IEEESTEC – 18th Student Projects Conference, Niš, 2025.</w:t>
       </w:r>
     </w:p>
@@ -1366,7 +1514,7 @@
         <w:pStyle w:val="references"/>
       </w:pPr>
       <w:r>
-        <w:t>Claude Code documentation. Available at: https://docs.anthropic.com/en/docs/claude-code</w:t>
+        <w:t>A. Zdravković, Fiducial, release 0.9.11, 2026. Available at: https://github.com/AleksaZCodes/fiducial</w:t>
       </w:r>
     </w:p>
     <w:p>
@@ -1374,7 +1522,7 @@
         <w:pStyle w:val="references"/>
       </w:pPr>
       <w:r>
-        <w:t>OpenAI Codex. Available at: https://openai.com/codex/</w:t>
+        <w:t>D. C. Schmidt, “Guest editor’s introduction: Model-driven engineering,” Computer, vol. 39, no. 2, pp. 25–31, 2006.</w:t>
       </w:r>
     </w:p>
     <w:p>
@@ -1382,7 +1530,7 @@
         <w:pStyle w:val="references"/>
       </w:pPr>
       <w:r>
-        <w:t>A. Zdravković, Fiducial, release 0.9.11, 2026. Available at: https://github.com/AleksaZCodes/fiducial</w:t>
+        <w:t>S. J. I. Herzig, A. Qamar and C. J. J. Paredis, “An approach to identifying inconsistencies in model-based systems engineering,” Procedia Computer Science, vol. 28, pp. 354–362, 2014.</w:t>
       </w:r>
     </w:p>
     <w:p>
@@ -1390,7 +1538,7 @@
         <w:pStyle w:val="references"/>
       </w:pPr>
       <w:r>
-        <w:t>D. C. Schmidt, “Guest editor’s introduction: Model-driven engineering,” Computer, vol. 39, no. 2, pp. 25–31, 2006.</w:t>
+        <w:t>E. Dolstra, M. de Jonge and E. Visser, “Nix: A safe and policy-free system for software deployment,” in Proc. LISA, 2004, pp. 79–92.</w:t>
       </w:r>
     </w:p>
     <w:p>
@@ -1398,7 +1546,7 @@
         <w:pStyle w:val="references"/>
       </w:pPr>
       <w:r>
-        <w:t>E. Dolstra, M. de Jonge and E. Visser, “Nix: A safe and policy-free system for software deployment,” in Proc. LISA, 2004, pp. 79–92.</w:t>
+        <w:t>AGENTS.md, a format for guiding coding agents. Available at: https://agents.md/</w:t>
       </w:r>
     </w:p>
     <w:p>
@@ -1406,6 +1554,14 @@
         <w:pStyle w:val="references"/>
       </w:pPr>
       <w:r>
+        <w:t>S. Kambhampati et al., “Position: LLMs can’t plan, but can help planning in LLM-Modulo frameworks,” in Proc. ICML, PMLR 235, 2024.</w:t>
+      </w:r>
+    </w:p>
+    <w:p>
+      <w:pPr>
+        <w:pStyle w:val="references"/>
+      </w:pPr>
+      <w:r>
         <w:t>KiCad EDA. Available at: https://www.kicad.org/</w:t>
       </w:r>
     </w:p>
@@ -1423,14 +1579,6 @@
       </w:pPr>
       <w:r>
         <w:t>build123d, a Python CAD library on the OpenCascade kernel. Available at: https://github.com/gumyr/build123d</w:t>
-      </w:r>
-    </w:p>
-    <w:p>
-      <w:pPr>
-        <w:pStyle w:val="references"/>
-      </w:pPr>
-      <w:r>
-        <w:t>AGENTS.md, a format for guiding coding agents. Available at: https://agents.md/</w:t>
       </w:r>
     </w:p>
     <w:p>

</xml_diff>

<commit_message>
docs(paper): existing approaches, and why Fiducial is built differently
Background becomes Existing Approaches: model-based engineering,
ECAD-MCAD links, design as code (atopile, build123d), interface
languages (Protocol Buffers), build systems (Bazel, Nix) and agent
context files, each with what it keeps in agreement and where it stops,
in prose and in Table I. Each keeps one kind of fact or one pair of
disciplines in agreement; Fiducial keeps what works in each and changes
the unit from files and tools to facts. The atopile point is first-hand:
the design spec found a circuit language leaves the case, the layout and
the cost outside.

Still four pages: Fig. 2 moves after Checks, where its loop has been
explained, and a few clauses that repeated others are gone.

Co-Authored-By: Claude Opus 5.5 <noreply@anthropic.com>
Claude-Session: https://claude.ai/code/session_0185NnNkfrVmB6KpyPa4GJCQ
</commit_message>
<xml_diff>
--- a/docs/paper/Fiducial_Zdravkovic_Aleksa.docx
+++ b/docs/paper/Fiducial_Zdravkovic_Aleksa.docx
@@ -279,7 +279,7 @@
         <w:pStyle w:val="BodyText"/>
       </w:pPr>
       <w:r>
-        <w:t>Agents do not remove this problem; they speed it up. An agent works inside one codebase and sees only what is in it, so the agent writing the firmware does not know the board changed, and the one writing the web page does not know the firmware did. Its output is also probabilistic: usually right, but never guaranteed. More code, written faster, in more disconnected places, gives an inconsistent product sooner.</w:t>
+        <w:t>Agents do not remove this problem; they speed it up. An agent sees only the codebase it works in, so the agent writing the firmware does not know the board changed, and the one writing the web page does not know the firmware did. Its output is also probabilistic: usually right, but never guaranteed. More code, written faster, in more disconnected places, gives an inconsistent product sooner.</w:t>
       </w:r>
     </w:p>
     <w:p>
@@ -287,7 +287,7 @@
         <w:pStyle w:val="BodyText"/>
       </w:pPr>
       <w:r>
-        <w:t>What is missing is not a better tool for any one discipline, but one shared and checked context for all of them: a single place where a product’s facts live, from which every part is produced, and which refuses a change that makes the parts disagree. This paper presents Fiducial [4], an open-source platform built to provide it, and tests whether its checks catch the mistakes that people and agents actually make.</w:t>
+        <w:t>What is missing is not a better tool for any one discipline, but one shared and checked context for all of them: a single place where a product’s facts live, from which every part is produced, and which refuses a change that makes the parts disagree. This paper presents Fiducial [4], an open-source platform built to provide it, compares it with existing approaches, and tests whether its checks catch the mistakes that people and agents actually make.</w:t>
       </w:r>
     </w:p>
     <w:p>
@@ -296,7 +296,7 @@
         <w:keepNext/>
       </w:pPr>
       <w:r>
-        <w:t>Background</w:t>
+        <w:t>Existing Approaches</w:t>
       </w:r>
     </w:p>
     <w:p>
@@ -304,7 +304,7 @@
         <w:pStyle w:val="BodyText"/>
       </w:pPr>
       <w:r>
-        <w:t>The idea that a fact should be written only once is not new. Model-driven engineering generates code and configuration from a central model, so that each design decision is stated in one place [5], and model-based systems engineering keeps the mechanical, electrical and software views of a product in one model and checks them for inconsistencies [6]. These approaches put a modelling tool at the centre and an engineer at its controls.</w:t>
+        <w:t>Several kinds of tool already address parts of this problem, and each falls short in the same way: it keeps one kind of fact, or one pair of disciplines, in agreement, but not the product as a whole (Table I).</w:t>
       </w:r>
     </w:p>
     <w:p>
@@ -312,7 +312,7 @@
         <w:pStyle w:val="BodyText"/>
       </w:pPr>
       <w:r>
-        <w:t>Build systems solved a related problem for software. A build system knows which outputs depend on which inputs and rebuilds only what changed; Nix goes further and identifies every result by a fingerprint of its inputs, so that a build can be reproduced exactly and no change goes unnoticed [7]. This works within software, but a circuit board, an enclosure or a translated web page usually lies outside it.</w:t>
+        <w:t>Model-driven and model-based systems engineering keep a design in one central model and generate or check other views from it [5], [6]. They are the closest in spirit, but the model lives in a specialised graphical tool, the code is still written by hand beside it, and an agent cannot easily work in it. Engineering suites link neighbouring disciplines instead: Altium’s MCAD CoDesigner passes changes between a circuit board and its mechanical model [7]. The firmware, the app and the translations stay outside, and the link is between two tools, not from one source.</w:t>
       </w:r>
     </w:p>
     <w:p>
@@ -320,7 +320,456 @@
         <w:pStyle w:val="BodyText"/>
       </w:pPr>
       <w:r>
-        <w:t>Coding agents, finally, are guided by context files such as AGENTS.md [8], which describe a repository’s layout and rules in plain language. They help, but an agent can still misread or ignore them, and nothing checks its work against the rest of the product. A known way to use a generator that can be wrong is to pair it with a checker that cannot: the generator proposes and a sound verifier decides [9]. Fiducial brings the three ideas together for a whole product: facts in plain text that agents can edit, outputs generated for every discipline, and checks that decide what is accepted.</w:t>
+        <w:t>Design-as-code tools write hardware as text: a circuit in atopile [8], a case as a build123d script [9]. This is what makes hardware writable by an agent, and Fiducial uses build123d. But each covers one discipline. Fiducial’s first design planned to author boards in atopile, and found that a circuit language does not cover the case, the layout or the cost, so the board’s facts would still be copied into each of them. Interface languages such as Protocol Buffers declare a message once and generate the code for both sides [10]. That removes the drift met in Outreach, but only for messages; a pin, a colour or a board size has no such home.</w:t>
+      </w:r>
+    </w:p>
+    <w:p>
+      <w:pPr>
+        <w:pStyle w:val="BodyText"/>
+      </w:pPr>
+      <w:r>
+        <w:t>Build systems such as Bazel [11] and Nix [12] rebuild exactly what changed, and Nix identifies every result by a fingerprint of its inputs. They guarantee that outputs follow from files, not that files agree with each other: the same fact typed into two source files builds without complaint. Coding agents, finally, follow context files such as AGENTS.md [13], which describe a repository’s rules but do not enforce them. A known way to use a generator that can be wrong is to pair it with a checker that cannot [14], but no existing checker spans a whole product.</w:t>
+      </w:r>
+    </w:p>
+    <w:p>
+      <w:pPr>
+        <w:pStyle w:val="tablehead"/>
+        <w:keepNext/>
+      </w:pPr>
+      <w:r>
+        <w:t>Existing Approaches and Where They Stop</w:t>
+      </w:r>
+    </w:p>
+    <w:tbl>
+      <w:tblPr>
+        <w:tblW w:type="dxa" w:w="4550"/>
+        <w:jc w:val="center"/>
+        <w:tblLook w:firstColumn="1" w:firstRow="1" w:lastColumn="0" w:lastRow="0" w:noHBand="0" w:noVBand="1" w:val="04A0"/>
+        <w:tblLayout w:type="fixed"/>
+        <w:tblBorders>
+          <w:top w:val="single" w:sz="4" w:space="0" w:color="000000"/>
+          <w:left w:val="single" w:sz="4" w:space="0" w:color="000000"/>
+          <w:bottom w:val="single" w:sz="4" w:space="0" w:color="000000"/>
+          <w:right w:val="single" w:sz="4" w:space="0" w:color="000000"/>
+          <w:insideH w:val="single" w:sz="4" w:space="0" w:color="000000"/>
+          <w:insideV w:val="single" w:sz="4" w:space="0" w:color="000000"/>
+        </w:tblBorders>
+      </w:tblPr>
+      <w:tblGrid>
+        <w:gridCol w:w="1500"/>
+        <w:gridCol w:w="1550"/>
+        <w:gridCol w:w="1500"/>
+      </w:tblGrid>
+      <w:tr>
+        <w:trPr>
+          <w:cantSplit/>
+        </w:trPr>
+        <w:tc>
+          <w:tcPr>
+            <w:tcW w:type="dxa" w:w="1500"/>
+          </w:tcPr>
+          <w:p>
+            <w:pPr>
+              <w:pStyle w:val="tablecolhead"/>
+              <w:keepNext/>
+              <w:jc w:val="left"/>
+            </w:pPr>
+            <w:r>
+              <w:t>Approach</w:t>
+            </w:r>
+          </w:p>
+        </w:tc>
+        <w:tc>
+          <w:tcPr>
+            <w:tcW w:type="dxa" w:w="1550"/>
+          </w:tcPr>
+          <w:p>
+            <w:pPr>
+              <w:pStyle w:val="tablecolhead"/>
+              <w:keepNext/>
+              <w:jc w:val="left"/>
+            </w:pPr>
+            <w:r>
+              <w:t>Keeps in agreement</w:t>
+            </w:r>
+          </w:p>
+        </w:tc>
+        <w:tc>
+          <w:tcPr>
+            <w:tcW w:type="dxa" w:w="1500"/>
+          </w:tcPr>
+          <w:p>
+            <w:pPr>
+              <w:pStyle w:val="tablecolhead"/>
+              <w:keepNext/>
+              <w:jc w:val="left"/>
+            </w:pPr>
+            <w:r>
+              <w:t>Stops at</w:t>
+            </w:r>
+          </w:p>
+        </w:tc>
+      </w:tr>
+      <w:tr>
+        <w:trPr>
+          <w:cantSplit/>
+        </w:trPr>
+        <w:tc>
+          <w:tcPr>
+            <w:tcW w:type="dxa" w:w="1500"/>
+          </w:tcPr>
+          <w:p>
+            <w:pPr>
+              <w:pStyle w:val="tablecopy"/>
+              <w:keepNext/>
+              <w:jc w:val="left"/>
+            </w:pPr>
+            <w:r>
+              <w:t>Model-based engineering</w:t>
+            </w:r>
+          </w:p>
+        </w:tc>
+        <w:tc>
+          <w:tcPr>
+            <w:tcW w:type="dxa" w:w="1550"/>
+          </w:tcPr>
+          <w:p>
+            <w:pPr>
+              <w:pStyle w:val="tablecopy"/>
+              <w:keepNext/>
+              <w:jc w:val="left"/>
+            </w:pPr>
+            <w:r>
+              <w:t>views of one model</w:t>
+            </w:r>
+          </w:p>
+        </w:tc>
+        <w:tc>
+          <w:tcPr>
+            <w:tcW w:type="dxa" w:w="1500"/>
+          </w:tcPr>
+          <w:p>
+            <w:pPr>
+              <w:pStyle w:val="tablecopy"/>
+              <w:keepNext/>
+              <w:jc w:val="left"/>
+            </w:pPr>
+            <w:r>
+              <w:t>graphical tool; code by hand</w:t>
+            </w:r>
+          </w:p>
+        </w:tc>
+      </w:tr>
+      <w:tr>
+        <w:trPr>
+          <w:cantSplit/>
+        </w:trPr>
+        <w:tc>
+          <w:tcPr>
+            <w:tcW w:type="dxa" w:w="1500"/>
+          </w:tcPr>
+          <w:p>
+            <w:pPr>
+              <w:pStyle w:val="tablecopy"/>
+              <w:keepNext/>
+              <w:jc w:val="left"/>
+            </w:pPr>
+            <w:r>
+              <w:t>ECAD–MCAD links</w:t>
+            </w:r>
+          </w:p>
+        </w:tc>
+        <w:tc>
+          <w:tcPr>
+            <w:tcW w:type="dxa" w:w="1550"/>
+          </w:tcPr>
+          <w:p>
+            <w:pPr>
+              <w:pStyle w:val="tablecopy"/>
+              <w:keepNext/>
+              <w:jc w:val="left"/>
+            </w:pPr>
+            <w:r>
+              <w:t>board and case</w:t>
+            </w:r>
+          </w:p>
+        </w:tc>
+        <w:tc>
+          <w:tcPr>
+            <w:tcW w:type="dxa" w:w="1500"/>
+          </w:tcPr>
+          <w:p>
+            <w:pPr>
+              <w:pStyle w:val="tablecopy"/>
+              <w:keepNext/>
+              <w:jc w:val="left"/>
+            </w:pPr>
+            <w:r>
+              <w:t>two disciplines, two tools</w:t>
+            </w:r>
+          </w:p>
+        </w:tc>
+      </w:tr>
+      <w:tr>
+        <w:trPr>
+          <w:cantSplit/>
+        </w:trPr>
+        <w:tc>
+          <w:tcPr>
+            <w:tcW w:type="dxa" w:w="1500"/>
+          </w:tcPr>
+          <w:p>
+            <w:pPr>
+              <w:pStyle w:val="tablecopy"/>
+              <w:keepNext/>
+              <w:jc w:val="left"/>
+            </w:pPr>
+            <w:r>
+              <w:t>Design as code</w:t>
+            </w:r>
+          </w:p>
+        </w:tc>
+        <w:tc>
+          <w:tcPr>
+            <w:tcW w:type="dxa" w:w="1550"/>
+          </w:tcPr>
+          <w:p>
+            <w:pPr>
+              <w:pStyle w:val="tablecopy"/>
+              <w:keepNext/>
+              <w:jc w:val="left"/>
+            </w:pPr>
+            <w:r>
+              <w:t>one discipline</w:t>
+            </w:r>
+          </w:p>
+        </w:tc>
+        <w:tc>
+          <w:tcPr>
+            <w:tcW w:type="dxa" w:w="1500"/>
+          </w:tcPr>
+          <w:p>
+            <w:pPr>
+              <w:pStyle w:val="tablecopy"/>
+              <w:keepNext/>
+              <w:jc w:val="left"/>
+            </w:pPr>
+            <w:r>
+              <w:t>facts shared with others</w:t>
+            </w:r>
+          </w:p>
+        </w:tc>
+      </w:tr>
+      <w:tr>
+        <w:trPr>
+          <w:cantSplit/>
+        </w:trPr>
+        <w:tc>
+          <w:tcPr>
+            <w:tcW w:type="dxa" w:w="1500"/>
+          </w:tcPr>
+          <w:p>
+            <w:pPr>
+              <w:pStyle w:val="tablecopy"/>
+              <w:keepNext/>
+              <w:jc w:val="left"/>
+            </w:pPr>
+            <w:r>
+              <w:t>Interface languages</w:t>
+            </w:r>
+          </w:p>
+        </w:tc>
+        <w:tc>
+          <w:tcPr>
+            <w:tcW w:type="dxa" w:w="1550"/>
+          </w:tcPr>
+          <w:p>
+            <w:pPr>
+              <w:pStyle w:val="tablecopy"/>
+              <w:keepNext/>
+              <w:jc w:val="left"/>
+            </w:pPr>
+            <w:r>
+              <w:t>messages, both sides</w:t>
+            </w:r>
+          </w:p>
+        </w:tc>
+        <w:tc>
+          <w:tcPr>
+            <w:tcW w:type="dxa" w:w="1500"/>
+          </w:tcPr>
+          <w:p>
+            <w:pPr>
+              <w:pStyle w:val="tablecopy"/>
+              <w:keepNext/>
+              <w:jc w:val="left"/>
+            </w:pPr>
+            <w:r>
+              <w:t>everything else</w:t>
+            </w:r>
+          </w:p>
+        </w:tc>
+      </w:tr>
+      <w:tr>
+        <w:trPr>
+          <w:cantSplit/>
+        </w:trPr>
+        <w:tc>
+          <w:tcPr>
+            <w:tcW w:type="dxa" w:w="1500"/>
+          </w:tcPr>
+          <w:p>
+            <w:pPr>
+              <w:pStyle w:val="tablecopy"/>
+              <w:keepNext/>
+              <w:jc w:val="left"/>
+            </w:pPr>
+            <w:r>
+              <w:t>Build systems</w:t>
+            </w:r>
+          </w:p>
+        </w:tc>
+        <w:tc>
+          <w:tcPr>
+            <w:tcW w:type="dxa" w:w="1550"/>
+          </w:tcPr>
+          <w:p>
+            <w:pPr>
+              <w:pStyle w:val="tablecopy"/>
+              <w:keepNext/>
+              <w:jc w:val="left"/>
+            </w:pPr>
+            <w:r>
+              <w:t>outputs with files</w:t>
+            </w:r>
+          </w:p>
+        </w:tc>
+        <w:tc>
+          <w:tcPr>
+            <w:tcW w:type="dxa" w:w="1500"/>
+          </w:tcPr>
+          <w:p>
+            <w:pPr>
+              <w:pStyle w:val="tablecopy"/>
+              <w:keepNext/>
+              <w:jc w:val="left"/>
+            </w:pPr>
+            <w:r>
+              <w:t>two files that disagree</w:t>
+            </w:r>
+          </w:p>
+        </w:tc>
+      </w:tr>
+      <w:tr>
+        <w:trPr>
+          <w:cantSplit/>
+        </w:trPr>
+        <w:tc>
+          <w:tcPr>
+            <w:tcW w:type="dxa" w:w="1500"/>
+          </w:tcPr>
+          <w:p>
+            <w:pPr>
+              <w:pStyle w:val="tablecopy"/>
+              <w:keepNext/>
+              <w:jc w:val="left"/>
+            </w:pPr>
+            <w:r>
+              <w:t>Agent context files</w:t>
+            </w:r>
+          </w:p>
+        </w:tc>
+        <w:tc>
+          <w:tcPr>
+            <w:tcW w:type="dxa" w:w="1550"/>
+          </w:tcPr>
+          <w:p>
+            <w:pPr>
+              <w:pStyle w:val="tablecopy"/>
+              <w:keepNext/>
+              <w:jc w:val="left"/>
+            </w:pPr>
+            <w:r>
+              <w:t>nothing; they advise</w:t>
+            </w:r>
+          </w:p>
+        </w:tc>
+        <w:tc>
+          <w:tcPr>
+            <w:tcW w:type="dxa" w:w="1500"/>
+          </w:tcPr>
+          <w:p>
+            <w:pPr>
+              <w:pStyle w:val="tablecopy"/>
+              <w:keepNext/>
+              <w:jc w:val="left"/>
+            </w:pPr>
+            <w:r>
+              <w:t>not enforced</w:t>
+            </w:r>
+          </w:p>
+        </w:tc>
+      </w:tr>
+      <w:tr>
+        <w:trPr>
+          <w:cantSplit/>
+        </w:trPr>
+        <w:tc>
+          <w:tcPr>
+            <w:tcW w:type="dxa" w:w="1500"/>
+          </w:tcPr>
+          <w:p>
+            <w:pPr>
+              <w:pStyle w:val="tablecopy"/>
+              <w:jc w:val="left"/>
+            </w:pPr>
+            <w:r>
+              <w:t>Fiducial</w:t>
+            </w:r>
+          </w:p>
+        </w:tc>
+        <w:tc>
+          <w:tcPr>
+            <w:tcW w:type="dxa" w:w="1550"/>
+          </w:tcPr>
+          <w:p>
+            <w:pPr>
+              <w:pStyle w:val="tablecopy"/>
+              <w:jc w:val="left"/>
+            </w:pPr>
+            <w:r>
+              <w:t>every declared fact</w:t>
+            </w:r>
+          </w:p>
+        </w:tc>
+        <w:tc>
+          <w:tcPr>
+            <w:tcW w:type="dxa" w:w="1500"/>
+          </w:tcPr>
+          <w:p>
+            <w:pPr>
+              <w:pStyle w:val="tablecopy"/>
+              <w:jc w:val="left"/>
+            </w:pPr>
+            <w:r>
+              <w:t>facts not yet declared</w:t>
+            </w:r>
+          </w:p>
+        </w:tc>
+      </w:tr>
+    </w:tbl>
+    <w:p>
+      <w:pPr>
+        <w:pStyle w:val="BodyText"/>
+      </w:pPr>
+      <w:r/>
+    </w:p>
+    <w:p>
+      <w:pPr>
+        <w:pStyle w:val="BodyText"/>
+      </w:pPr>
+      <w:r>
+        <w:t>Fiducial keeps what works in each – text that agents can write, outputs tied to inputs by fingerprints, established engines for hard problems, and checks that decide – and changes the unit. It tracks facts rather than files or tools, across every discipline of one product, so any fact – a message, a pin, a colour, a size – has exactly one home.</w:t>
       </w:r>
     </w:p>
     <w:p>
@@ -351,7 +800,7 @@
       <w:r>
         <w:drawing>
           <wp:inline xmlns:a="http://schemas.openxmlformats.org/drawingml/2006/main" xmlns:pic="http://schemas.openxmlformats.org/drawingml/2006/picture">
-            <wp:extent cx="2560320" cy="2088794"/>
+            <wp:extent cx="2103120" cy="1715795"/>
             <wp:docPr id="1" name="Picture 1"/>
             <wp:cNvGraphicFramePr>
               <a:graphicFrameLocks noChangeAspect="1"/>
@@ -372,7 +821,7 @@
                   <pic:spPr>
                     <a:xfrm>
                       <a:off x="0" y="0"/>
-                      <a:ext cx="2560320" cy="2088794"/>
+                      <a:ext cx="2103120" cy="1715795"/>
                     </a:xfrm>
                     <a:prstGeom prst="rect"/>
                   </pic:spPr>
@@ -386,9 +835,10 @@
     <w:p>
       <w:pPr>
         <w:pStyle w:val="Slika"/>
-      </w:pPr>
-      <w:r>
-        <w:t>One fact used in four places: (a) copied by hand, one copy changes and nothing notices; (b) declared once, every copy is generated from the declaration and checked.</w:t>
+        <w:keepNext w:val="0"/>
+      </w:pPr>
+      <w:r>
+        <w:t>One fact used in four places: (a) copied by hand, one copy changes and nothing notices; (b) declared once, every copy is generated and checked.</w:t>
       </w:r>
     </w:p>
     <w:p>
@@ -437,7 +887,58 @@
         <w:pStyle w:val="BodyText"/>
       </w:pPr>
       <w:r>
-        <w:t>Fiducial is a command-line tool, fid, written in Rust. Fig. 2 shows how a change moves through it.</w:t>
+        <w:t>Fiducial is a command-line tool, fid, written in Rust. Its parts are described below; Fig. 2 shows how a change moves through them.</w:t>
+      </w:r>
+    </w:p>
+    <w:p>
+      <w:pPr>
+        <w:pStyle w:val="Heading2"/>
+        <w:keepNext/>
+      </w:pPr>
+      <w:r>
+        <w:t>One Structure for Every Product</w:t>
+      </w:r>
+    </w:p>
+    <w:p>
+      <w:pPr>
+        <w:pStyle w:val="BodyText"/>
+      </w:pPr>
+      <w:r>
+        <w:t>fid new creates a product repository with a fixed layout, and fid add enables capabilities. A capability packages one discipline: its declarations, the generator that turns them into artifacts, its checks and instructions for agents. There are 23, from web applications and translations to firmware and hardware. Because every product has the same structure, whoever knows one knows them all, and a new product starts from parts that already work. fid upgrade brings platform improvements into each product while keeping its own edits.</w:t>
+      </w:r>
+    </w:p>
+    <w:p>
+      <w:pPr>
+        <w:pStyle w:val="Heading2"/>
+        <w:keepNext/>
+      </w:pPr>
+      <w:r>
+        <w:t>Declarations and Generation</w:t>
+      </w:r>
+    </w:p>
+    <w:p>
+      <w:pPr>
+        <w:pStyle w:val="BodyText"/>
+      </w:pPr>
+      <w:r>
+        <w:t>Declarations are plain text files in version control, from the strings of each language to every part of a board with the net each pin connects to. Text was chosen over a graphical modelling tool because coding agents read and write it well, and every change then goes through ordinary code review. fid derive runs each capability’s generator, which reads the declarations and writes the artifacts, from a typed module of translations to a firmware pin map or a KiCad circuit board [15]. A lock file records a cryptographic hash – a short fingerprint of a file’s contents – for every input and output, so the platform knows exactly what each artifact was made from.</w:t>
+      </w:r>
+    </w:p>
+    <w:p>
+      <w:pPr>
+        <w:pStyle w:val="Heading2"/>
+        <w:keepNext/>
+      </w:pPr>
+      <w:r>
+        <w:t>Checks</w:t>
+      </w:r>
+    </w:p>
+    <w:p>
+      <w:pPr>
+        <w:pStyle w:val="BodyText"/>
+      </w:pPr>
+      <w:r>
+        <w:t>Checks run in continuous integration, the automatic build that runs on every proposed change, and a change is merged only when they pass. There are three kinds. Freshness: fid derive --check compares every recorded fingerprint with the repository and fails if a declaration changed without its artifacts being regenerated, or if a generated file was edited by hand. Rules: generation refuses declarations that break a rule, such as a language missing a string, two colours with too little contrast, parts that cost more than the declared limit, or a board that does not fit its case. Consumers: compilers and type checkers read the generated files, so code that still uses a renamed fact stops compiling.</w:t>
       </w:r>
     </w:p>
     <w:p>
@@ -451,7 +952,7 @@
       <w:r>
         <w:drawing>
           <wp:inline xmlns:a="http://schemas.openxmlformats.org/drawingml/2006/main" xmlns:pic="http://schemas.openxmlformats.org/drawingml/2006/picture">
-            <wp:extent cx="2468880" cy="1530706"/>
+            <wp:extent cx="2103120" cy="1303934"/>
             <wp:docPr id="2" name="Picture 2"/>
             <wp:cNvGraphicFramePr>
               <a:graphicFrameLocks noChangeAspect="1"/>
@@ -472,7 +973,7 @@
                   <pic:spPr>
                     <a:xfrm>
                       <a:off x="0" y="0"/>
-                      <a:ext cx="2468880" cy="1530706"/>
+                      <a:ext cx="2103120" cy="1303934"/>
                     </a:xfrm>
                     <a:prstGeom prst="rect"/>
                   </pic:spPr>
@@ -486,6 +987,7 @@
     <w:p>
       <w:pPr>
         <w:pStyle w:val="Slika"/>
+        <w:keepNext w:val="0"/>
       </w:pPr>
       <w:r>
         <w:t>How a change moves through Fiducial: declarations are edited, generation produces the artifacts with the help of established engines, and the checks either accept the change or return a message naming the declaration at fault.</w:t>
@@ -497,7 +999,7 @@
         <w:keepNext/>
       </w:pPr>
       <w:r>
-        <w:t>One Structure for Every Product</w:t>
+        <w:t>Engines for Hard Problems</w:t>
       </w:r>
     </w:p>
     <w:p>
@@ -505,7 +1007,7 @@
         <w:pStyle w:val="BodyText"/>
       </w:pPr>
       <w:r>
-        <w:t>fid new creates a product repository with a fixed layout, and fid add enables capabilities. A capability is a packaged piece of the platform for one discipline: its declarations, the generator that turns them into artifacts, its checks, and instructions for agents. There are 23, from web applications, translations and legal pages to databases, device messages, firmware and hardware. Because every product shares the same structure, a person or agent who knows one knows them all, and a new product starts from parts that already work and pass their checks. When the platform improves, fid upgrade brings the change into each product while keeping the product’s own edits.</w:t>
+        <w:t>Some generation steps are real engineering problems: where to place the parts on a board, how to connect them, how to build a case around them. The first version placed parts with a hand-written search, and each new product added special rules until they began to interact. Now the platform only writes the problem down and hands it to an established engine. A constraint solver, CP-SAT [16], is given the rules a placement must satisfy and finds one that does, or proves none exists; build123d [9] builds the case; KiCad routes and checks the board. Every placement rule is one of eight general kinds, such as inside, apart or near, so a new product needs new declarations rather than new code.</w:t>
       </w:r>
     </w:p>
     <w:p>
@@ -514,7 +1016,7 @@
         <w:keepNext/>
       </w:pPr>
       <w:r>
-        <w:t>Declarations and Generation</w:t>
+        <w:t>Agents in the Loop</w:t>
       </w:r>
     </w:p>
     <w:p>
@@ -522,58 +1024,7 @@
         <w:pStyle w:val="BodyText"/>
       </w:pPr>
       <w:r>
-        <w:t>Declarations are plain text files in version control: the strings of each language, the pages and brand of the website, the colour palette with the contrast each pair of colours must reach, the messages a device exchanges with its app and, for hardware, every part with the net each of its pins connects to. Text was chosen over a graphical modelling tool because coding agents read and write it well, and because every change then goes through ordinary code review. fid derive runs each capability’s generator, which reads the declarations and writes the artifacts, from a typed module of translations to a firmware pin map or a KiCad circuit board [10]. A lock file records a cryptographic hash – a short fingerprint of a file’s contents – for every input and output, so the platform knows exactly what each artifact was made from.</w:t>
-      </w:r>
-    </w:p>
-    <w:p>
-      <w:pPr>
-        <w:pStyle w:val="Heading2"/>
-        <w:keepNext/>
-      </w:pPr>
-      <w:r>
-        <w:t>Checks</w:t>
-      </w:r>
-    </w:p>
-    <w:p>
-      <w:pPr>
-        <w:pStyle w:val="BodyText"/>
-      </w:pPr>
-      <w:r>
-        <w:t>Checks run in continuous integration, the automatic build that runs on every proposed change, and a change is merged only when they pass. There are three kinds. Freshness: fid derive --check compares every recorded fingerprint with the repository and fails if a declaration changed without its artifacts being regenerated, or if a generated file was edited by hand. Rules: generation refuses declarations that break a rule, such as a language missing a string, two colours with too little contrast, parts that cost more than the declared limit, or a board that does not fit its case. Consumers: compilers and type checkers read the generated files, so code that still uses a renamed fact stops compiling.</w:t>
-      </w:r>
-    </w:p>
-    <w:p>
-      <w:pPr>
-        <w:pStyle w:val="Heading2"/>
-        <w:keepNext/>
-      </w:pPr>
-      <w:r>
-        <w:t>Engines for Hard Problems</w:t>
-      </w:r>
-    </w:p>
-    <w:p>
-      <w:pPr>
-        <w:pStyle w:val="BodyText"/>
-      </w:pPr>
-      <w:r>
-        <w:t>Some generation steps are real engineering problems: where to place the parts on a board, how to connect them, how to build a case around them. The first version placed parts with a search written by hand, and every new product added special rules until the rules began to interact. It was replaced by a different structure: the platform writes the problem down in a fixed format and hands it to an established engine. A constraint solver, CP-SAT [11], receives the rules a placement must satisfy and finds one that does, or proves that none exists; build123d on the OpenCascade kernel [12] builds the case; and KiCad routes the board and checks it against its design rules. Every placement rule is one of eight general kinds, such as inside, apart or near, so a new product needs new declarations rather than new code. When declarations contradict each other, the solver names the smallest set that cannot hold together.</w:t>
-      </w:r>
-    </w:p>
-    <w:p>
-      <w:pPr>
-        <w:pStyle w:val="Heading2"/>
-        <w:keepNext/>
-      </w:pPr>
-      <w:r>
-        <w:t>Agents in the Loop</w:t>
-      </w:r>
-    </w:p>
-    <w:p>
-      <w:pPr>
-        <w:pStyle w:val="BodyText"/>
-      </w:pPr>
-      <w:r>
-        <w:t>Every product carries an AGENTS.md file and one instruction file per capability, so any agent starts with the same description of the product and its rules, and a hook stops an agent from editing a generated file. Agents are asked to fix a problem where the fact lives: a wrong pin in the declaration, a wrong generator in the platform, never in the output. The platform grows the same way. When a mistake gets past the checks, it is not patched for one product but turned into a general rule that protects every product.</w:t>
+        <w:t>Every product carries an AGENTS.md file and one instruction file per capability, so any agent starts from the same description of the product, and a hook stops it from editing a generated file. Agents fix a problem where the fact lives, never in the output. The platform grows the same way: a mistake that gets past the checks becomes a general rule for every product.</w:t>
       </w:r>
     </w:p>
     <w:p>
@@ -590,7 +1041,7 @@
         <w:pStyle w:val="BodyText"/>
       </w:pPr>
       <w:r>
-        <w:t>To show the whole approach on something anyone can inspect, the repository contains a complete example product: a USB-C stick that measures temperature and humidity and shows them on a web page (Fig. 3). It is small on purpose, but it has every discipline a product has: a printed case, a circuit board, firmware and a web page.</w:t>
+        <w:t>The repository contains a complete example product: a USB-C stick that measures temperature and humidity and shows them on a web page (Fig. 3). It is small, but it has every discipline: a printed case, a circuit board, firmware and a web page.</w:t>
       </w:r>
     </w:p>
     <w:p>
@@ -604,7 +1055,7 @@
       <w:r>
         <w:drawing>
           <wp:inline xmlns:a="http://schemas.openxmlformats.org/drawingml/2006/main" xmlns:pic="http://schemas.openxmlformats.org/drawingml/2006/picture">
-            <wp:extent cx="2880360" cy="1302675"/>
+            <wp:extent cx="2468880" cy="1116579"/>
             <wp:docPr id="3" name="Picture 3"/>
             <wp:cNvGraphicFramePr>
               <a:graphicFrameLocks noChangeAspect="1"/>
@@ -625,7 +1076,7 @@
                   <pic:spPr>
                     <a:xfrm>
                       <a:off x="0" y="0"/>
-                      <a:ext cx="2880360" cy="1302675"/>
+                      <a:ext cx="2468880" cy="1116579"/>
                     </a:xfrm>
                     <a:prstGeom prst="rect"/>
                   </pic:spPr>
@@ -639,6 +1090,7 @@
     <w:p>
       <w:pPr>
         <w:pStyle w:val="Slika"/>
+        <w:keepNext w:val="0"/>
       </w:pPr>
       <w:r>
         <w:t>The sensor stick, generated from its declaration: (a) the closed case; (b) the routed board inside it, with the sensor under its vent.</w:t>
@@ -649,15 +1101,7 @@
         <w:pStyle w:val="BodyText"/>
       </w:pPr>
       <w:r>
-        <w:t>The person writes four things: the product declaration with its parts and connections, an outline of its shape, the firmware’s logic and the page. Everything else is generated: the placed and routed board with its schematic and bill of materials, the case built around the board with an opening for the connector and a vent over the sensor, the files a manufacturer needs, and the code the firmware and the page both use to exchange readings.</w:t>
-      </w:r>
-    </w:p>
-    <w:p>
-      <w:pPr>
-        <w:pStyle w:val="BodyText"/>
-      </w:pPr>
-      <w:r>
-        <w:t>Moving the sensor to another pin is one changed line in the declaration. Until the product is regenerated, the check fails; afterwards the board, the schematic, the firmware’s pin map and the page’s types have all followed, and neither the firmware nor the page needed an edit. If the new pin is one the chip’s sensor bus cannot use, the firmware stops compiling – before any board is made.</w:t>
+        <w:t>The person writes the product declaration, an outline of its shape, the firmware’s logic and the page. Everything else is generated: the routed board with its schematic and bill of materials, the case built around it, the files a manufacturer needs, and the code the firmware and the page use to exchange readings. Moving the sensor to another pin is one changed line. Until the product is regenerated the check fails; afterwards the board, the firmware’s pin map and the page’s types have all followed, with no edit to the firmware or the page. If the new pin is one the chip’s sensor bus cannot use, the firmware stops compiling – before any board is made.</w:t>
       </w:r>
     </w:p>
     <w:p>
@@ -671,28 +1115,10 @@
     </w:p>
     <w:p>
       <w:pPr>
-        <w:pStyle w:val="Heading2"/>
-        <w:keepNext/>
-      </w:pPr>
-      <w:r>
-        <w:t>Development</w:t>
-      </w:r>
-    </w:p>
-    <w:p>
-      <w:pPr>
         <w:pStyle w:val="BodyText"/>
       </w:pPr>
       <w:r>
-        <w:t>Fiducial was built over six weeks by one person working with AI agents, through 68 reviewed pull requests, and used on two products: the sensor stick and a private product. The sensor stick’s board passes its design-rule check with no errors, and moving one pin regenerates 8 files in 37 s.</w:t>
-      </w:r>
-    </w:p>
-    <w:p>
-      <w:pPr>
-        <w:pStyle w:val="Heading2"/>
-        <w:keepNext/>
-      </w:pPr>
-      <w:r>
-        <w:t>Injected Mistakes</w:t>
+        <w:t>Fiducial was built over six weeks by one person working with AI agents, through 68 reviewed pull requests, and used on two products: the sensor stick and a private product. On the sensor stick, moving one pin regenerates 8 files in 37 s.</w:t>
       </w:r>
     </w:p>
     <w:p>
@@ -700,15 +1126,7 @@
         <w:pStyle w:val="BodyText"/>
       </w:pPr>
       <w:r>
-        <w:t>Checks are only useful if they catch the mistakes that people and agents actually make. To measure this, the test borrows the idea of mutation testing [13]: a realistic mistake is introduced on purpose, the checks are run, and the result shows whether they noticed. Twenty mistakes were chosen to cover eight kinds of drift met while building Fiducial and its products (Table I): ten in a fresh web product in English and Serbian, and ten in the sensor stick’s hardware, firmware and the interface between them.</w:t>
-      </w:r>
-    </w:p>
-    <w:p>
-      <w:pPr>
-        <w:pStyle w:val="BodyText"/>
-      </w:pPr>
-      <w:r>
-        <w:t>Each mistake was applied to a clean copy of the product, the checks ran in the same order as in continuous integration, and the copy was reset. Three correct changes and two runs with no change at all tested the opposite direction: that the checks do not fail without a reason. The test is a script in the repository and runs with one command.</w:t>
+        <w:t>Checks are only useful if they catch the mistakes that people and agents actually make. The test borrows the idea of mutation testing [17]: a realistic mistake is introduced on purpose, the checks are run, and the result shows whether they noticed. Twenty mistakes cover eight kinds of drift met while building Fiducial and its products (Table II): ten in a fresh web product in English and Serbian, and ten in the sensor stick’s hardware, firmware and the interface between them. Each was applied to a clean copy, the checks ran as in continuous integration, and the copy was reset. Three correct changes and two runs with no change tested the opposite direction: that the checks do not fail without a reason. The test is a script in the repository.</w:t>
       </w:r>
     </w:p>
     <w:p>
@@ -722,7 +1140,7 @@
     </w:p>
     <w:tbl>
       <w:tblPr>
-        <w:tblW w:type="dxa" w:w="4500"/>
+        <w:tblW w:type="dxa" w:w="4510"/>
         <w:jc w:val="center"/>
         <w:tblLook w:firstColumn="1" w:firstRow="1" w:lastColumn="0" w:lastRow="0" w:noHBand="0" w:noVBand="1" w:val="04A0"/>
         <w:tblLayout w:type="fixed"/>
@@ -736,10 +1154,10 @@
         </w:tblBorders>
       </w:tblPr>
       <w:tblGrid>
-        <w:gridCol w:w="1400"/>
-        <w:gridCol w:w="1900"/>
-        <w:gridCol w:w="600"/>
-        <w:gridCol w:w="600"/>
+        <w:gridCol w:w="1330"/>
+        <w:gridCol w:w="1780"/>
+        <w:gridCol w:w="640"/>
+        <w:gridCol w:w="760"/>
       </w:tblGrid>
       <w:tr>
         <w:trPr>
@@ -747,7 +1165,7 @@
         </w:trPr>
         <w:tc>
           <w:tcPr>
-            <w:tcW w:type="dxa" w:w="1400"/>
+            <w:tcW w:type="dxa" w:w="1330"/>
           </w:tcPr>
           <w:p>
             <w:pPr>
@@ -762,7 +1180,7 @@
         </w:tc>
         <w:tc>
           <w:tcPr>
-            <w:tcW w:type="dxa" w:w="1900"/>
+            <w:tcW w:type="dxa" w:w="1780"/>
           </w:tcPr>
           <w:p>
             <w:pPr>
@@ -777,7 +1195,7 @@
         </w:tc>
         <w:tc>
           <w:tcPr>
-            <w:tcW w:type="dxa" w:w="600"/>
+            <w:tcW w:type="dxa" w:w="640"/>
           </w:tcPr>
           <w:p>
             <w:pPr>
@@ -792,7 +1210,7 @@
         </w:tc>
         <w:tc>
           <w:tcPr>
-            <w:tcW w:type="dxa" w:w="600"/>
+            <w:tcW w:type="dxa" w:w="760"/>
           </w:tcPr>
           <w:p>
             <w:pPr>
@@ -812,7 +1230,7 @@
         </w:trPr>
         <w:tc>
           <w:tcPr>
-            <w:tcW w:type="dxa" w:w="1400"/>
+            <w:tcW w:type="dxa" w:w="1330"/>
           </w:tcPr>
           <w:p>
             <w:pPr>
@@ -827,7 +1245,7 @@
         </w:tc>
         <w:tc>
           <w:tcPr>
-            <w:tcW w:type="dxa" w:w="1900"/>
+            <w:tcW w:type="dxa" w:w="1780"/>
           </w:tcPr>
           <w:p>
             <w:pPr>
@@ -842,7 +1260,7 @@
         </w:tc>
         <w:tc>
           <w:tcPr>
-            <w:tcW w:type="dxa" w:w="600"/>
+            <w:tcW w:type="dxa" w:w="640"/>
           </w:tcPr>
           <w:p>
             <w:pPr>
@@ -857,7 +1275,7 @@
         </w:tc>
         <w:tc>
           <w:tcPr>
-            <w:tcW w:type="dxa" w:w="600"/>
+            <w:tcW w:type="dxa" w:w="760"/>
           </w:tcPr>
           <w:p>
             <w:pPr>
@@ -877,7 +1295,7 @@
         </w:trPr>
         <w:tc>
           <w:tcPr>
-            <w:tcW w:type="dxa" w:w="1400"/>
+            <w:tcW w:type="dxa" w:w="1330"/>
           </w:tcPr>
           <w:p>
             <w:pPr>
@@ -892,7 +1310,7 @@
         </w:tc>
         <w:tc>
           <w:tcPr>
-            <w:tcW w:type="dxa" w:w="1900"/>
+            <w:tcW w:type="dxa" w:w="1780"/>
           </w:tcPr>
           <w:p>
             <w:pPr>
@@ -907,7 +1325,7 @@
         </w:tc>
         <w:tc>
           <w:tcPr>
-            <w:tcW w:type="dxa" w:w="600"/>
+            <w:tcW w:type="dxa" w:w="640"/>
           </w:tcPr>
           <w:p>
             <w:pPr>
@@ -922,7 +1340,7 @@
         </w:tc>
         <w:tc>
           <w:tcPr>
-            <w:tcW w:type="dxa" w:w="600"/>
+            <w:tcW w:type="dxa" w:w="760"/>
           </w:tcPr>
           <w:p>
             <w:pPr>
@@ -942,7 +1360,7 @@
         </w:trPr>
         <w:tc>
           <w:tcPr>
-            <w:tcW w:type="dxa" w:w="1400"/>
+            <w:tcW w:type="dxa" w:w="1330"/>
           </w:tcPr>
           <w:p>
             <w:pPr>
@@ -957,7 +1375,7 @@
         </w:tc>
         <w:tc>
           <w:tcPr>
-            <w:tcW w:type="dxa" w:w="1900"/>
+            <w:tcW w:type="dxa" w:w="1780"/>
           </w:tcPr>
           <w:p>
             <w:pPr>
@@ -972,7 +1390,7 @@
         </w:tc>
         <w:tc>
           <w:tcPr>
-            <w:tcW w:type="dxa" w:w="600"/>
+            <w:tcW w:type="dxa" w:w="640"/>
           </w:tcPr>
           <w:p>
             <w:pPr>
@@ -987,7 +1405,7 @@
         </w:tc>
         <w:tc>
           <w:tcPr>
-            <w:tcW w:type="dxa" w:w="600"/>
+            <w:tcW w:type="dxa" w:w="760"/>
           </w:tcPr>
           <w:p>
             <w:pPr>
@@ -1007,7 +1425,7 @@
         </w:trPr>
         <w:tc>
           <w:tcPr>
-            <w:tcW w:type="dxa" w:w="1400"/>
+            <w:tcW w:type="dxa" w:w="1330"/>
           </w:tcPr>
           <w:p>
             <w:pPr>
@@ -1022,7 +1440,7 @@
         </w:tc>
         <w:tc>
           <w:tcPr>
-            <w:tcW w:type="dxa" w:w="1900"/>
+            <w:tcW w:type="dxa" w:w="1780"/>
           </w:tcPr>
           <w:p>
             <w:pPr>
@@ -1037,7 +1455,7 @@
         </w:tc>
         <w:tc>
           <w:tcPr>
-            <w:tcW w:type="dxa" w:w="600"/>
+            <w:tcW w:type="dxa" w:w="640"/>
           </w:tcPr>
           <w:p>
             <w:pPr>
@@ -1052,7 +1470,7 @@
         </w:tc>
         <w:tc>
           <w:tcPr>
-            <w:tcW w:type="dxa" w:w="600"/>
+            <w:tcW w:type="dxa" w:w="760"/>
           </w:tcPr>
           <w:p>
             <w:pPr>
@@ -1072,7 +1490,7 @@
         </w:trPr>
         <w:tc>
           <w:tcPr>
-            <w:tcW w:type="dxa" w:w="1400"/>
+            <w:tcW w:type="dxa" w:w="1330"/>
           </w:tcPr>
           <w:p>
             <w:pPr>
@@ -1087,7 +1505,7 @@
         </w:tc>
         <w:tc>
           <w:tcPr>
-            <w:tcW w:type="dxa" w:w="1900"/>
+            <w:tcW w:type="dxa" w:w="1780"/>
           </w:tcPr>
           <w:p>
             <w:pPr>
@@ -1102,7 +1520,7 @@
         </w:tc>
         <w:tc>
           <w:tcPr>
-            <w:tcW w:type="dxa" w:w="600"/>
+            <w:tcW w:type="dxa" w:w="640"/>
           </w:tcPr>
           <w:p>
             <w:pPr>
@@ -1117,7 +1535,7 @@
         </w:tc>
         <w:tc>
           <w:tcPr>
-            <w:tcW w:type="dxa" w:w="600"/>
+            <w:tcW w:type="dxa" w:w="760"/>
           </w:tcPr>
           <w:p>
             <w:pPr>
@@ -1137,7 +1555,7 @@
         </w:trPr>
         <w:tc>
           <w:tcPr>
-            <w:tcW w:type="dxa" w:w="1400"/>
+            <w:tcW w:type="dxa" w:w="1330"/>
           </w:tcPr>
           <w:p>
             <w:pPr>
@@ -1152,7 +1570,7 @@
         </w:tc>
         <w:tc>
           <w:tcPr>
-            <w:tcW w:type="dxa" w:w="1900"/>
+            <w:tcW w:type="dxa" w:w="1780"/>
           </w:tcPr>
           <w:p>
             <w:pPr>
@@ -1167,7 +1585,7 @@
         </w:tc>
         <w:tc>
           <w:tcPr>
-            <w:tcW w:type="dxa" w:w="600"/>
+            <w:tcW w:type="dxa" w:w="640"/>
           </w:tcPr>
           <w:p>
             <w:pPr>
@@ -1182,7 +1600,7 @@
         </w:tc>
         <w:tc>
           <w:tcPr>
-            <w:tcW w:type="dxa" w:w="600"/>
+            <w:tcW w:type="dxa" w:w="760"/>
           </w:tcPr>
           <w:p>
             <w:pPr>
@@ -1202,7 +1620,7 @@
         </w:trPr>
         <w:tc>
           <w:tcPr>
-            <w:tcW w:type="dxa" w:w="1400"/>
+            <w:tcW w:type="dxa" w:w="1330"/>
           </w:tcPr>
           <w:p>
             <w:pPr>
@@ -1217,7 +1635,7 @@
         </w:tc>
         <w:tc>
           <w:tcPr>
-            <w:tcW w:type="dxa" w:w="1900"/>
+            <w:tcW w:type="dxa" w:w="1780"/>
           </w:tcPr>
           <w:p>
             <w:pPr>
@@ -1232,7 +1650,7 @@
         </w:tc>
         <w:tc>
           <w:tcPr>
-            <w:tcW w:type="dxa" w:w="600"/>
+            <w:tcW w:type="dxa" w:w="640"/>
           </w:tcPr>
           <w:p>
             <w:pPr>
@@ -1247,7 +1665,7 @@
         </w:tc>
         <w:tc>
           <w:tcPr>
-            <w:tcW w:type="dxa" w:w="600"/>
+            <w:tcW w:type="dxa" w:w="760"/>
           </w:tcPr>
           <w:p>
             <w:pPr>
@@ -1267,7 +1685,7 @@
         </w:trPr>
         <w:tc>
           <w:tcPr>
-            <w:tcW w:type="dxa" w:w="1400"/>
+            <w:tcW w:type="dxa" w:w="1330"/>
           </w:tcPr>
           <w:p>
             <w:pPr>
@@ -1282,7 +1700,7 @@
         </w:tc>
         <w:tc>
           <w:tcPr>
-            <w:tcW w:type="dxa" w:w="1900"/>
+            <w:tcW w:type="dxa" w:w="1780"/>
           </w:tcPr>
           <w:p>
             <w:pPr>
@@ -1297,7 +1715,7 @@
         </w:tc>
         <w:tc>
           <w:tcPr>
-            <w:tcW w:type="dxa" w:w="600"/>
+            <w:tcW w:type="dxa" w:w="640"/>
           </w:tcPr>
           <w:p>
             <w:pPr>
@@ -1312,7 +1730,7 @@
         </w:tc>
         <w:tc>
           <w:tcPr>
-            <w:tcW w:type="dxa" w:w="600"/>
+            <w:tcW w:type="dxa" w:w="760"/>
           </w:tcPr>
           <w:p>
             <w:pPr>
@@ -1332,7 +1750,7 @@
         </w:trPr>
         <w:tc>
           <w:tcPr>
-            <w:tcW w:type="dxa" w:w="1400"/>
+            <w:tcW w:type="dxa" w:w="1330"/>
           </w:tcPr>
           <w:p>
             <w:pPr>
@@ -1346,7 +1764,7 @@
         </w:tc>
         <w:tc>
           <w:tcPr>
-            <w:tcW w:type="dxa" w:w="1900"/>
+            <w:tcW w:type="dxa" w:w="1780"/>
           </w:tcPr>
           <w:p>
             <w:pPr>
@@ -1358,7 +1776,7 @@
         </w:tc>
         <w:tc>
           <w:tcPr>
-            <w:tcW w:type="dxa" w:w="600"/>
+            <w:tcW w:type="dxa" w:w="640"/>
           </w:tcPr>
           <w:p>
             <w:pPr>
@@ -1372,7 +1790,7 @@
         </w:tc>
         <w:tc>
           <w:tcPr>
-            <w:tcW w:type="dxa" w:w="600"/>
+            <w:tcW w:type="dxa" w:w="760"/>
           </w:tcPr>
           <w:p>
             <w:pPr>
@@ -1397,7 +1815,7 @@
         <w:pStyle w:val="BodyText"/>
       </w:pPr>
       <w:r>
-        <w:t>On release 0.9.4 the checks caught 15 of the 20. The five misses were the most useful result, because each was a fact the platform did not yet own. Two were declarations edited without regenerating: only the hardware generator recorded which files it read, so the freshness check did not notice that the others’ inputs had changed. In two, the firmware wrote a pin number or a sensor address directly instead of taking it from the declaration. The last was a Serbian string left in English, complete in structure but not translated. Each became a general rule: every generator now records its inputs, firmware that writes a declared value directly is refused, and a translation identical to the default language fails unless it is declared the same on purpose. On release 0.9.11, all 20 are caught – 10 during generation, 9 by the freshness check and 1 by the compiler – and every correct change passes. Fig. 4 shows two of the messages.</w:t>
+        <w:t>On release 0.9.4 the checks caught 15 of the 20, and each of the five misses was a fact the platform did not yet own. Two were declarations edited without regenerating: only the hardware generator recorded which files it read, so the freshness check did not notice that the others’ inputs had changed. In two, the firmware wrote a pin number or a sensor address directly instead of taking it from the declaration. The last was a Serbian string left in English, complete in structure but not translated. Each became a general rule: every generator now records its inputs, firmware that writes a declared value directly is refused, and a translation identical to the default language fails unless it is declared the same on purpose. On release 0.9.11, all 20 are caught – 10 during generation, 9 by the freshness check and 1 by the compiler – and every correct change passes. Fig. 4 shows two of the messages.</w:t>
       </w:r>
     </w:p>
     <w:p>
@@ -1411,7 +1829,7 @@
       <w:r>
         <w:drawing>
           <wp:inline xmlns:a="http://schemas.openxmlformats.org/drawingml/2006/main" xmlns:pic="http://schemas.openxmlformats.org/drawingml/2006/picture">
-            <wp:extent cx="2651760" cy="1496035"/>
+            <wp:extent cx="2194560" cy="1238098"/>
             <wp:docPr id="4" name="Picture 4"/>
             <wp:cNvGraphicFramePr>
               <a:graphicFrameLocks noChangeAspect="1"/>
@@ -1432,7 +1850,7 @@
                   <pic:spPr>
                     <a:xfrm>
                       <a:off x="0" y="0"/>
-                      <a:ext cx="2651760" cy="1496035"/>
+                      <a:ext cx="2194560" cy="1238098"/>
                     </a:xfrm>
                     <a:prstGeom prst="rect"/>
                   </pic:spPr>
@@ -1446,6 +1864,7 @@
     <w:p>
       <w:pPr>
         <w:pStyle w:val="Slika"/>
+        <w:keepNext w:val="0"/>
       </w:pPr>
       <w:r>
         <w:t>Two failures as the person or agent sees them: (a) a string added in English only; (b) firmware naming a pin directly instead of taking it from the declaration.</w:t>
@@ -1473,7 +1892,7 @@
         <w:pStyle w:val="BodyText"/>
       </w:pPr>
       <w:r>
-        <w:t>AI agents have made writing each part of a product fast, and that has moved the hard problem to keeping the parts in agreement. Better models will move the line between what a person checks and what is left to agents, but a probabilistic system cannot guarantee its output, and even a deterministic tool is only right about what it was told. Fiducial answers this at the level of the product rather than the codebase: each fact is declared once, every artifact is generated from it, every change is checked, and hard problems go to proven engines. In practice, this let one person working with AI agents keep a product’s firmware, web page, circuit board and case in agreement, with every injected mistake caught early by a message that names its cause. Next, the sensor stick will be manufactured and tested, and agents will be compared working with and without the platform on the same tasks. Fiducial and its example are open source [4].</w:t>
+        <w:t>AI agents have made writing each part of a product fast, and that has moved the hard problem to keeping the parts in agreement. Better models will move the line between what a person checks and what is left to agents, but a probabilistic system cannot guarantee its output, and even a deterministic tool is only right about what it was told. Fiducial answers this at the level of the product rather than the codebase. In practice, it let one person working with AI agents keep a product’s firmware, web page, circuit board and case in agreement, with every injected mistake caught early by a message that names its cause. The next steps are to manufacture the sensor stick and to compare agents working with and without the platform. Fiducial and its example are open source [4].</w:t>
       </w:r>
     </w:p>
     <w:p>
@@ -1538,6 +1957,46 @@
         <w:pStyle w:val="references"/>
       </w:pPr>
       <w:r>
+        <w:t>Altium, MCAD CoDesigner, ECAD–MCAD collaboration. Available at: https://www.altium.com/</w:t>
+      </w:r>
+    </w:p>
+    <w:p>
+      <w:pPr>
+        <w:pStyle w:val="references"/>
+      </w:pPr>
+      <w:r>
+        <w:t>atopile, a language for designing circuit boards as code. Available at: https://github.com/atopile/atopile</w:t>
+      </w:r>
+    </w:p>
+    <w:p>
+      <w:pPr>
+        <w:pStyle w:val="references"/>
+      </w:pPr>
+      <w:r>
+        <w:t>build123d, a Python CAD library on the OpenCascade kernel. Available at: https://github.com/gumyr/build123d</w:t>
+      </w:r>
+    </w:p>
+    <w:p>
+      <w:pPr>
+        <w:pStyle w:val="references"/>
+      </w:pPr>
+      <w:r>
+        <w:t>Protocol Buffers. Available at: https://protobuf.dev/</w:t>
+      </w:r>
+    </w:p>
+    <w:p>
+      <w:pPr>
+        <w:pStyle w:val="references"/>
+      </w:pPr>
+      <w:r>
+        <w:t>Bazel, a build and test tool. Available at: https://bazel.build/</w:t>
+      </w:r>
+    </w:p>
+    <w:p>
+      <w:pPr>
+        <w:pStyle w:val="references"/>
+      </w:pPr>
+      <w:r>
         <w:t>E. Dolstra, M. de Jonge and E. Visser, “Nix: A safe and policy-free system for software deployment,” in Proc. LISA, 2004, pp. 79–92.</w:t>
       </w:r>
     </w:p>
@@ -1571,14 +2030,6 @@
       </w:pPr>
       <w:r>
         <w:t>L. Perron and F. Didier, CP-SAT, Google OR-Tools. Available at: https://developers.google.com/optimization/cp/cp_solver</w:t>
-      </w:r>
-    </w:p>
-    <w:p>
-      <w:pPr>
-        <w:pStyle w:val="references"/>
-      </w:pPr>
-      <w:r>
-        <w:t>build123d, a Python CAD library on the OpenCascade kernel. Available at: https://github.com/gumyr/build123d</w:t>
       </w:r>
     </w:p>
     <w:p>

</xml_diff>

<commit_message>
docs(paper): Fig. 1 on the front page; the abstract states today's result
Fig. 1 moves into the introduction, beside the problem it pictures, so
the first page carries the paper's central figure. The abstract says
what the checks catch now (all 20, each with a message naming its
cause, every correct change let through) instead of the first run's 15.

Co-Authored-By: Claude Opus 5.5 <noreply@anthropic.com>
Claude-Session: https://claude.ai/code/session_0185NnNkfrVmB6KpyPa4GJCQ
</commit_message>
<xml_diff>
--- a/docs/paper/Fiducial_Zdravkovic_Aleksa.docx
+++ b/docs/paper/Fiducial_Zdravkovic_Aleksa.docx
@@ -232,7 +232,7 @@
         <w:t>Abstract—</w:t>
       </w:r>
       <w:r>
-        <w:t>AI coding agents can now write firmware, web applications and even circuit-board and enclosure code, which lets one person attempt products that used to need a team. Building such products showed the author where this falls short: each part can be written quickly, but the facts the parts share are copied between them, and nothing keeps the copies in agreement. This paper presents Fiducial, an open-source platform that gives a whole product, software and hardware alike, one structure. Every fact is declared once, every artifact that uses it is generated from that declaration, and checks on every change refuse anything that no longer agrees with it, so AI agents work inside the checks instead of being trusted. When 20 realistic mistakes were injected into two products, the first version of the checks caught 15; each miss became a general rule, and the current version catches all 20.</w:t>
+        <w:t>AI coding agents can now write firmware, web applications and even circuit-board and enclosure code, which lets one person attempt products that used to need a team. Building such products showed the author where this falls short: each part can be written quickly, but the facts the parts share are copied between them, and nothing keeps the copies in agreement. This paper presents Fiducial, an open-source platform that gives a whole product, software and hardware alike, one structure. Every fact is declared once, every artifact that uses it is generated from that declaration, and checks on every change refuse anything that no longer agrees with it, so AI agents work inside the checks instead of being trusted. Of 20 realistic mistakes injected into a web product and a USB-C sensor stick, the checks catch all 20, each with a message naming its cause, and let every correct change through.</w:t>
       </w:r>
     </w:p>
     <w:p>
@@ -271,522 +271,7 @@
         <w:pStyle w:val="BodyText"/>
       </w:pPr>
       <w:r>
-        <w:t>Building such products – first Outreach [3], an off-grid messaging system made of radios, gateways, an app and printed cases, and then the platform described here – showed the author where the difficulty had moved. Writing each part was no longer the slow step; keeping the parts in agreement was. The radio’s firmware and the app disagreed on the layout of a message, and a printed case did not fit the board it was made for. Neither part was wrong on its own. The facts they shared had been copied by hand from one tool to another, one copy changed, and the mistake appeared only when the parts met.</w:t>
-      </w:r>
-    </w:p>
-    <w:p>
-      <w:pPr>
-        <w:pStyle w:val="BodyText"/>
-      </w:pPr>
-      <w:r>
-        <w:t>Agents do not remove this problem; they speed it up. An agent sees only the codebase it works in, so the agent writing the firmware does not know the board changed, and the one writing the web page does not know the firmware did. Its output is also probabilistic: usually right, but never guaranteed. More code, written faster, in more disconnected places, gives an inconsistent product sooner.</w:t>
-      </w:r>
-    </w:p>
-    <w:p>
-      <w:pPr>
-        <w:pStyle w:val="BodyText"/>
-      </w:pPr>
-      <w:r>
-        <w:t>What is missing is not a better tool for any one discipline, but one shared and checked context for all of them: a single place where a product’s facts live, from which every part is produced, and which refuses a change that makes the parts disagree. This paper presents Fiducial [4], an open-source platform built to provide it, compares it with existing approaches, and tests whether its checks catch the mistakes that people and agents actually make.</w:t>
-      </w:r>
-    </w:p>
-    <w:p>
-      <w:pPr>
-        <w:pStyle w:val="Heading1"/>
-        <w:keepNext/>
-      </w:pPr>
-      <w:r>
-        <w:t>Existing Approaches</w:t>
-      </w:r>
-    </w:p>
-    <w:p>
-      <w:pPr>
-        <w:pStyle w:val="BodyText"/>
-      </w:pPr>
-      <w:r>
-        <w:t>Several kinds of tool already address parts of this problem, and each falls short in the same way: it keeps one kind of fact, or one pair of disciplines, in agreement, but not the product as a whole (Table I).</w:t>
-      </w:r>
-    </w:p>
-    <w:p>
-      <w:pPr>
-        <w:pStyle w:val="BodyText"/>
-      </w:pPr>
-      <w:r>
-        <w:t>Model-driven and model-based systems engineering keep a design in one central model and generate or check other views from it [5], [6]. They are the closest in spirit, but the model lives in a specialised graphical tool, the code is still written by hand beside it, and an agent cannot easily work in it. Engineering suites link neighbouring disciplines instead: Altium’s MCAD CoDesigner passes changes between a circuit board and its mechanical model [7]. The firmware, the app and the translations stay outside, and the link is between two tools, not from one source.</w:t>
-      </w:r>
-    </w:p>
-    <w:p>
-      <w:pPr>
-        <w:pStyle w:val="BodyText"/>
-      </w:pPr>
-      <w:r>
-        <w:t>Design-as-code tools write hardware as text: a circuit in atopile [8], a case as a build123d script [9]. This is what makes hardware writable by an agent, and Fiducial uses build123d. But each covers one discipline. Fiducial’s first design planned to author boards in atopile, and found that a circuit language does not cover the case, the layout or the cost, so the board’s facts would still be copied into each of them. Interface languages such as Protocol Buffers declare a message once and generate the code for both sides [10]. That removes the drift met in Outreach, but only for messages; a pin, a colour or a board size has no such home.</w:t>
-      </w:r>
-    </w:p>
-    <w:p>
-      <w:pPr>
-        <w:pStyle w:val="BodyText"/>
-      </w:pPr>
-      <w:r>
-        <w:t>Build systems such as Bazel [11] and Nix [12] rebuild exactly what changed, and Nix identifies every result by a fingerprint of its inputs. They guarantee that outputs follow from files, not that files agree with each other: the same fact typed into two source files builds without complaint. Coding agents, finally, follow context files such as AGENTS.md [13], which describe a repository’s rules but do not enforce them. A known way to use a generator that can be wrong is to pair it with a checker that cannot [14], but no existing checker spans a whole product.</w:t>
-      </w:r>
-    </w:p>
-    <w:p>
-      <w:pPr>
-        <w:pStyle w:val="tablehead"/>
-        <w:keepNext/>
-      </w:pPr>
-      <w:r>
-        <w:t>Existing Approaches and Where They Stop</w:t>
-      </w:r>
-    </w:p>
-    <w:tbl>
-      <w:tblPr>
-        <w:tblW w:type="dxa" w:w="4550"/>
-        <w:jc w:val="center"/>
-        <w:tblLook w:firstColumn="1" w:firstRow="1" w:lastColumn="0" w:lastRow="0" w:noHBand="0" w:noVBand="1" w:val="04A0"/>
-        <w:tblLayout w:type="fixed"/>
-        <w:tblBorders>
-          <w:top w:val="single" w:sz="4" w:space="0" w:color="000000"/>
-          <w:left w:val="single" w:sz="4" w:space="0" w:color="000000"/>
-          <w:bottom w:val="single" w:sz="4" w:space="0" w:color="000000"/>
-          <w:right w:val="single" w:sz="4" w:space="0" w:color="000000"/>
-          <w:insideH w:val="single" w:sz="4" w:space="0" w:color="000000"/>
-          <w:insideV w:val="single" w:sz="4" w:space="0" w:color="000000"/>
-        </w:tblBorders>
-      </w:tblPr>
-      <w:tblGrid>
-        <w:gridCol w:w="1500"/>
-        <w:gridCol w:w="1550"/>
-        <w:gridCol w:w="1500"/>
-      </w:tblGrid>
-      <w:tr>
-        <w:trPr>
-          <w:cantSplit/>
-        </w:trPr>
-        <w:tc>
-          <w:tcPr>
-            <w:tcW w:type="dxa" w:w="1500"/>
-          </w:tcPr>
-          <w:p>
-            <w:pPr>
-              <w:pStyle w:val="tablecolhead"/>
-              <w:keepNext/>
-              <w:jc w:val="left"/>
-            </w:pPr>
-            <w:r>
-              <w:t>Approach</w:t>
-            </w:r>
-          </w:p>
-        </w:tc>
-        <w:tc>
-          <w:tcPr>
-            <w:tcW w:type="dxa" w:w="1550"/>
-          </w:tcPr>
-          <w:p>
-            <w:pPr>
-              <w:pStyle w:val="tablecolhead"/>
-              <w:keepNext/>
-              <w:jc w:val="left"/>
-            </w:pPr>
-            <w:r>
-              <w:t>Keeps in agreement</w:t>
-            </w:r>
-          </w:p>
-        </w:tc>
-        <w:tc>
-          <w:tcPr>
-            <w:tcW w:type="dxa" w:w="1500"/>
-          </w:tcPr>
-          <w:p>
-            <w:pPr>
-              <w:pStyle w:val="tablecolhead"/>
-              <w:keepNext/>
-              <w:jc w:val="left"/>
-            </w:pPr>
-            <w:r>
-              <w:t>Stops at</w:t>
-            </w:r>
-          </w:p>
-        </w:tc>
-      </w:tr>
-      <w:tr>
-        <w:trPr>
-          <w:cantSplit/>
-        </w:trPr>
-        <w:tc>
-          <w:tcPr>
-            <w:tcW w:type="dxa" w:w="1500"/>
-          </w:tcPr>
-          <w:p>
-            <w:pPr>
-              <w:pStyle w:val="tablecopy"/>
-              <w:keepNext/>
-              <w:jc w:val="left"/>
-            </w:pPr>
-            <w:r>
-              <w:t>Model-based engineering</w:t>
-            </w:r>
-          </w:p>
-        </w:tc>
-        <w:tc>
-          <w:tcPr>
-            <w:tcW w:type="dxa" w:w="1550"/>
-          </w:tcPr>
-          <w:p>
-            <w:pPr>
-              <w:pStyle w:val="tablecopy"/>
-              <w:keepNext/>
-              <w:jc w:val="left"/>
-            </w:pPr>
-            <w:r>
-              <w:t>views of one model</w:t>
-            </w:r>
-          </w:p>
-        </w:tc>
-        <w:tc>
-          <w:tcPr>
-            <w:tcW w:type="dxa" w:w="1500"/>
-          </w:tcPr>
-          <w:p>
-            <w:pPr>
-              <w:pStyle w:val="tablecopy"/>
-              <w:keepNext/>
-              <w:jc w:val="left"/>
-            </w:pPr>
-            <w:r>
-              <w:t>graphical tool; code by hand</w:t>
-            </w:r>
-          </w:p>
-        </w:tc>
-      </w:tr>
-      <w:tr>
-        <w:trPr>
-          <w:cantSplit/>
-        </w:trPr>
-        <w:tc>
-          <w:tcPr>
-            <w:tcW w:type="dxa" w:w="1500"/>
-          </w:tcPr>
-          <w:p>
-            <w:pPr>
-              <w:pStyle w:val="tablecopy"/>
-              <w:keepNext/>
-              <w:jc w:val="left"/>
-            </w:pPr>
-            <w:r>
-              <w:t>ECAD–MCAD links</w:t>
-            </w:r>
-          </w:p>
-        </w:tc>
-        <w:tc>
-          <w:tcPr>
-            <w:tcW w:type="dxa" w:w="1550"/>
-          </w:tcPr>
-          <w:p>
-            <w:pPr>
-              <w:pStyle w:val="tablecopy"/>
-              <w:keepNext/>
-              <w:jc w:val="left"/>
-            </w:pPr>
-            <w:r>
-              <w:t>board and case</w:t>
-            </w:r>
-          </w:p>
-        </w:tc>
-        <w:tc>
-          <w:tcPr>
-            <w:tcW w:type="dxa" w:w="1500"/>
-          </w:tcPr>
-          <w:p>
-            <w:pPr>
-              <w:pStyle w:val="tablecopy"/>
-              <w:keepNext/>
-              <w:jc w:val="left"/>
-            </w:pPr>
-            <w:r>
-              <w:t>two disciplines, two tools</w:t>
-            </w:r>
-          </w:p>
-        </w:tc>
-      </w:tr>
-      <w:tr>
-        <w:trPr>
-          <w:cantSplit/>
-        </w:trPr>
-        <w:tc>
-          <w:tcPr>
-            <w:tcW w:type="dxa" w:w="1500"/>
-          </w:tcPr>
-          <w:p>
-            <w:pPr>
-              <w:pStyle w:val="tablecopy"/>
-              <w:keepNext/>
-              <w:jc w:val="left"/>
-            </w:pPr>
-            <w:r>
-              <w:t>Design as code</w:t>
-            </w:r>
-          </w:p>
-        </w:tc>
-        <w:tc>
-          <w:tcPr>
-            <w:tcW w:type="dxa" w:w="1550"/>
-          </w:tcPr>
-          <w:p>
-            <w:pPr>
-              <w:pStyle w:val="tablecopy"/>
-              <w:keepNext/>
-              <w:jc w:val="left"/>
-            </w:pPr>
-            <w:r>
-              <w:t>one discipline</w:t>
-            </w:r>
-          </w:p>
-        </w:tc>
-        <w:tc>
-          <w:tcPr>
-            <w:tcW w:type="dxa" w:w="1500"/>
-          </w:tcPr>
-          <w:p>
-            <w:pPr>
-              <w:pStyle w:val="tablecopy"/>
-              <w:keepNext/>
-              <w:jc w:val="left"/>
-            </w:pPr>
-            <w:r>
-              <w:t>facts shared with others</w:t>
-            </w:r>
-          </w:p>
-        </w:tc>
-      </w:tr>
-      <w:tr>
-        <w:trPr>
-          <w:cantSplit/>
-        </w:trPr>
-        <w:tc>
-          <w:tcPr>
-            <w:tcW w:type="dxa" w:w="1500"/>
-          </w:tcPr>
-          <w:p>
-            <w:pPr>
-              <w:pStyle w:val="tablecopy"/>
-              <w:keepNext/>
-              <w:jc w:val="left"/>
-            </w:pPr>
-            <w:r>
-              <w:t>Interface languages</w:t>
-            </w:r>
-          </w:p>
-        </w:tc>
-        <w:tc>
-          <w:tcPr>
-            <w:tcW w:type="dxa" w:w="1550"/>
-          </w:tcPr>
-          <w:p>
-            <w:pPr>
-              <w:pStyle w:val="tablecopy"/>
-              <w:keepNext/>
-              <w:jc w:val="left"/>
-            </w:pPr>
-            <w:r>
-              <w:t>messages, both sides</w:t>
-            </w:r>
-          </w:p>
-        </w:tc>
-        <w:tc>
-          <w:tcPr>
-            <w:tcW w:type="dxa" w:w="1500"/>
-          </w:tcPr>
-          <w:p>
-            <w:pPr>
-              <w:pStyle w:val="tablecopy"/>
-              <w:keepNext/>
-              <w:jc w:val="left"/>
-            </w:pPr>
-            <w:r>
-              <w:t>everything else</w:t>
-            </w:r>
-          </w:p>
-        </w:tc>
-      </w:tr>
-      <w:tr>
-        <w:trPr>
-          <w:cantSplit/>
-        </w:trPr>
-        <w:tc>
-          <w:tcPr>
-            <w:tcW w:type="dxa" w:w="1500"/>
-          </w:tcPr>
-          <w:p>
-            <w:pPr>
-              <w:pStyle w:val="tablecopy"/>
-              <w:keepNext/>
-              <w:jc w:val="left"/>
-            </w:pPr>
-            <w:r>
-              <w:t>Build systems</w:t>
-            </w:r>
-          </w:p>
-        </w:tc>
-        <w:tc>
-          <w:tcPr>
-            <w:tcW w:type="dxa" w:w="1550"/>
-          </w:tcPr>
-          <w:p>
-            <w:pPr>
-              <w:pStyle w:val="tablecopy"/>
-              <w:keepNext/>
-              <w:jc w:val="left"/>
-            </w:pPr>
-            <w:r>
-              <w:t>outputs with files</w:t>
-            </w:r>
-          </w:p>
-        </w:tc>
-        <w:tc>
-          <w:tcPr>
-            <w:tcW w:type="dxa" w:w="1500"/>
-          </w:tcPr>
-          <w:p>
-            <w:pPr>
-              <w:pStyle w:val="tablecopy"/>
-              <w:keepNext/>
-              <w:jc w:val="left"/>
-            </w:pPr>
-            <w:r>
-              <w:t>two files that disagree</w:t>
-            </w:r>
-          </w:p>
-        </w:tc>
-      </w:tr>
-      <w:tr>
-        <w:trPr>
-          <w:cantSplit/>
-        </w:trPr>
-        <w:tc>
-          <w:tcPr>
-            <w:tcW w:type="dxa" w:w="1500"/>
-          </w:tcPr>
-          <w:p>
-            <w:pPr>
-              <w:pStyle w:val="tablecopy"/>
-              <w:keepNext/>
-              <w:jc w:val="left"/>
-            </w:pPr>
-            <w:r>
-              <w:t>Agent context files</w:t>
-            </w:r>
-          </w:p>
-        </w:tc>
-        <w:tc>
-          <w:tcPr>
-            <w:tcW w:type="dxa" w:w="1550"/>
-          </w:tcPr>
-          <w:p>
-            <w:pPr>
-              <w:pStyle w:val="tablecopy"/>
-              <w:keepNext/>
-              <w:jc w:val="left"/>
-            </w:pPr>
-            <w:r>
-              <w:t>nothing; they advise</w:t>
-            </w:r>
-          </w:p>
-        </w:tc>
-        <w:tc>
-          <w:tcPr>
-            <w:tcW w:type="dxa" w:w="1500"/>
-          </w:tcPr>
-          <w:p>
-            <w:pPr>
-              <w:pStyle w:val="tablecopy"/>
-              <w:keepNext/>
-              <w:jc w:val="left"/>
-            </w:pPr>
-            <w:r>
-              <w:t>not enforced</w:t>
-            </w:r>
-          </w:p>
-        </w:tc>
-      </w:tr>
-      <w:tr>
-        <w:trPr>
-          <w:cantSplit/>
-        </w:trPr>
-        <w:tc>
-          <w:tcPr>
-            <w:tcW w:type="dxa" w:w="1500"/>
-          </w:tcPr>
-          <w:p>
-            <w:pPr>
-              <w:pStyle w:val="tablecopy"/>
-              <w:jc w:val="left"/>
-            </w:pPr>
-            <w:r>
-              <w:t>Fiducial</w:t>
-            </w:r>
-          </w:p>
-        </w:tc>
-        <w:tc>
-          <w:tcPr>
-            <w:tcW w:type="dxa" w:w="1550"/>
-          </w:tcPr>
-          <w:p>
-            <w:pPr>
-              <w:pStyle w:val="tablecopy"/>
-              <w:jc w:val="left"/>
-            </w:pPr>
-            <w:r>
-              <w:t>every declared fact</w:t>
-            </w:r>
-          </w:p>
-        </w:tc>
-        <w:tc>
-          <w:tcPr>
-            <w:tcW w:type="dxa" w:w="1500"/>
-          </w:tcPr>
-          <w:p>
-            <w:pPr>
-              <w:pStyle w:val="tablecopy"/>
-              <w:jc w:val="left"/>
-            </w:pPr>
-            <w:r>
-              <w:t>facts not yet declared</w:t>
-            </w:r>
-          </w:p>
-        </w:tc>
-      </w:tr>
-    </w:tbl>
-    <w:p>
-      <w:pPr>
-        <w:pStyle w:val="BodyText"/>
-      </w:pPr>
-      <w:r/>
-    </w:p>
-    <w:p>
-      <w:pPr>
-        <w:pStyle w:val="BodyText"/>
-      </w:pPr>
-      <w:r>
-        <w:t>Fiducial keeps what works in each – text that agents can write, outputs tied to inputs by fingerprints, established engines for hard problems, and checks that decide – and changes the unit. It tracks facts rather than files or tools, across every discipline of one product, so any fact – a message, a pin, a colour, a size – has exactly one home.</w:t>
-      </w:r>
-    </w:p>
-    <w:p>
-      <w:pPr>
-        <w:pStyle w:val="Heading1"/>
-        <w:keepNext/>
-      </w:pPr>
-      <w:r>
-        <w:t>The Approach</w:t>
-      </w:r>
-    </w:p>
-    <w:p>
-      <w:pPr>
-        <w:pStyle w:val="BodyText"/>
-      </w:pPr>
-      <w:r>
-        <w:t>Fiducial treats a product as two kinds of thing. Facts are the decisions that define it: which pin a sensor is connected to, what a button says in each language, the brand colour, the size of the board, the layout of a message between a device and its app. Artifacts are everything built from those facts: source code, schematics, circuit boards, translation files, web pages, enclosure models. Drift is what happens when an artifact stops agreeing with a fact, or with another artifact that uses the same fact (Fig. 1a). The approach consists of three rules that together make drift visible and keep it out of the product (Fig. 1b).</w:t>
+        <w:t>Building such products – first Outreach [3], an off-grid messaging system made of radios, gateways, an app and printed cases, and then the platform described here – showed the author where the difficulty had moved. Writing each part was no longer the slow step; keeping the parts in agreement was. The radio’s firmware and the app disagreed on the layout of a message, and a printed case did not fit the board it was made for. Neither part was wrong on its own. The facts they shared had been copied by hand from one tool to another, one copy changed, and the mistake appeared only when the parts met (Fig. 1a).</w:t>
       </w:r>
     </w:p>
     <w:p>
@@ -839,6 +324,521 @@
       </w:pPr>
       <w:r>
         <w:t>One fact used in four places: (a) copied by hand, one copy changes and nothing notices; (b) declared once, every copy is generated and checked.</w:t>
+      </w:r>
+    </w:p>
+    <w:p>
+      <w:pPr>
+        <w:pStyle w:val="BodyText"/>
+      </w:pPr>
+      <w:r>
+        <w:t>Agents do not remove this problem; they speed it up. An agent sees only the codebase it works in, so the agent writing the firmware does not know the board changed, and the one writing the web page does not know the firmware did. Its output is also probabilistic: usually right, but never guaranteed. More code, written faster, in more disconnected places, gives an inconsistent product sooner.</w:t>
+      </w:r>
+    </w:p>
+    <w:p>
+      <w:pPr>
+        <w:pStyle w:val="BodyText"/>
+      </w:pPr>
+      <w:r>
+        <w:t>What is missing is not a better tool for any one discipline, but one shared and checked context for all of them: a single place where a product’s facts live, from which every part is produced, and which refuses a change that makes the parts disagree (Fig. 1b). This paper presents Fiducial [4], an open-source platform built to provide it, compares it with existing approaches, and tests whether its checks catch the mistakes that people and agents actually make.</w:t>
+      </w:r>
+    </w:p>
+    <w:p>
+      <w:pPr>
+        <w:pStyle w:val="Heading1"/>
+        <w:keepNext/>
+      </w:pPr>
+      <w:r>
+        <w:t>Existing Approaches</w:t>
+      </w:r>
+    </w:p>
+    <w:p>
+      <w:pPr>
+        <w:pStyle w:val="BodyText"/>
+      </w:pPr>
+      <w:r>
+        <w:t>Several kinds of tool already address parts of this problem, and each falls short in the same way: it keeps one kind of fact, or one pair of disciplines, in agreement, but not the product as a whole (Table I).</w:t>
+      </w:r>
+    </w:p>
+    <w:p>
+      <w:pPr>
+        <w:pStyle w:val="BodyText"/>
+      </w:pPr>
+      <w:r>
+        <w:t>Model-driven and model-based systems engineering keep a design in one central model and generate or check other views from it [5], [6]. They are the closest in spirit, but the model lives in a specialised graphical tool, the code is still written by hand beside it, and an agent cannot easily work in it. Engineering suites link neighbouring disciplines instead: Altium’s MCAD CoDesigner passes changes between a circuit board and its mechanical model [7]. The firmware, the app and the translations stay outside, and the link is between two tools, not from one source.</w:t>
+      </w:r>
+    </w:p>
+    <w:p>
+      <w:pPr>
+        <w:pStyle w:val="BodyText"/>
+      </w:pPr>
+      <w:r>
+        <w:t>Design-as-code tools write hardware as text: a circuit in atopile [8], a case as a build123d script [9]. This is what makes hardware writable by an agent, and Fiducial uses build123d. But each covers one discipline. Fiducial’s first design planned to author boards in atopile, and found that a circuit language does not cover the case, the layout or the cost, so the board’s facts would still be copied into each of them. Interface languages such as Protocol Buffers declare a message once and generate the code for both sides [10]. That removes the drift met in Outreach, but only for messages; a pin, a colour or a board size has no such home.</w:t>
+      </w:r>
+    </w:p>
+    <w:p>
+      <w:pPr>
+        <w:pStyle w:val="BodyText"/>
+      </w:pPr>
+      <w:r>
+        <w:t>Build systems such as Bazel [11] and Nix [12] rebuild exactly what changed, and Nix identifies every result by a fingerprint of its inputs. They guarantee that outputs follow from files, not that files agree with each other: the same fact typed into two source files builds without complaint. Coding agents, finally, follow context files such as AGENTS.md [13], which describe a repository’s rules but do not enforce them. A known way to use a generator that can be wrong is to pair it with a checker that cannot [14], but no existing checker spans a whole product.</w:t>
+      </w:r>
+    </w:p>
+    <w:p>
+      <w:pPr>
+        <w:pStyle w:val="tablehead"/>
+        <w:keepNext/>
+      </w:pPr>
+      <w:r>
+        <w:t>Existing Approaches and Where They Stop</w:t>
+      </w:r>
+    </w:p>
+    <w:tbl>
+      <w:tblPr>
+        <w:tblW w:type="dxa" w:w="4550"/>
+        <w:jc w:val="center"/>
+        <w:tblLook w:firstColumn="1" w:firstRow="1" w:lastColumn="0" w:lastRow="0" w:noHBand="0" w:noVBand="1" w:val="04A0"/>
+        <w:tblLayout w:type="fixed"/>
+        <w:tblBorders>
+          <w:top w:val="single" w:sz="4" w:space="0" w:color="000000"/>
+          <w:left w:val="single" w:sz="4" w:space="0" w:color="000000"/>
+          <w:bottom w:val="single" w:sz="4" w:space="0" w:color="000000"/>
+          <w:right w:val="single" w:sz="4" w:space="0" w:color="000000"/>
+          <w:insideH w:val="single" w:sz="4" w:space="0" w:color="000000"/>
+          <w:insideV w:val="single" w:sz="4" w:space="0" w:color="000000"/>
+        </w:tblBorders>
+      </w:tblPr>
+      <w:tblGrid>
+        <w:gridCol w:w="1500"/>
+        <w:gridCol w:w="1550"/>
+        <w:gridCol w:w="1500"/>
+      </w:tblGrid>
+      <w:tr>
+        <w:trPr>
+          <w:cantSplit/>
+        </w:trPr>
+        <w:tc>
+          <w:tcPr>
+            <w:tcW w:type="dxa" w:w="1500"/>
+          </w:tcPr>
+          <w:p>
+            <w:pPr>
+              <w:pStyle w:val="tablecolhead"/>
+              <w:keepNext/>
+              <w:jc w:val="left"/>
+            </w:pPr>
+            <w:r>
+              <w:t>Approach</w:t>
+            </w:r>
+          </w:p>
+        </w:tc>
+        <w:tc>
+          <w:tcPr>
+            <w:tcW w:type="dxa" w:w="1550"/>
+          </w:tcPr>
+          <w:p>
+            <w:pPr>
+              <w:pStyle w:val="tablecolhead"/>
+              <w:keepNext/>
+              <w:jc w:val="left"/>
+            </w:pPr>
+            <w:r>
+              <w:t>Keeps in agreement</w:t>
+            </w:r>
+          </w:p>
+        </w:tc>
+        <w:tc>
+          <w:tcPr>
+            <w:tcW w:type="dxa" w:w="1500"/>
+          </w:tcPr>
+          <w:p>
+            <w:pPr>
+              <w:pStyle w:val="tablecolhead"/>
+              <w:keepNext/>
+              <w:jc w:val="left"/>
+            </w:pPr>
+            <w:r>
+              <w:t>Stops at</w:t>
+            </w:r>
+          </w:p>
+        </w:tc>
+      </w:tr>
+      <w:tr>
+        <w:trPr>
+          <w:cantSplit/>
+        </w:trPr>
+        <w:tc>
+          <w:tcPr>
+            <w:tcW w:type="dxa" w:w="1500"/>
+          </w:tcPr>
+          <w:p>
+            <w:pPr>
+              <w:pStyle w:val="tablecopy"/>
+              <w:keepNext/>
+              <w:jc w:val="left"/>
+            </w:pPr>
+            <w:r>
+              <w:t>Model-based engineering</w:t>
+            </w:r>
+          </w:p>
+        </w:tc>
+        <w:tc>
+          <w:tcPr>
+            <w:tcW w:type="dxa" w:w="1550"/>
+          </w:tcPr>
+          <w:p>
+            <w:pPr>
+              <w:pStyle w:val="tablecopy"/>
+              <w:keepNext/>
+              <w:jc w:val="left"/>
+            </w:pPr>
+            <w:r>
+              <w:t>views of one model</w:t>
+            </w:r>
+          </w:p>
+        </w:tc>
+        <w:tc>
+          <w:tcPr>
+            <w:tcW w:type="dxa" w:w="1500"/>
+          </w:tcPr>
+          <w:p>
+            <w:pPr>
+              <w:pStyle w:val="tablecopy"/>
+              <w:keepNext/>
+              <w:jc w:val="left"/>
+            </w:pPr>
+            <w:r>
+              <w:t>graphical tool; code by hand</w:t>
+            </w:r>
+          </w:p>
+        </w:tc>
+      </w:tr>
+      <w:tr>
+        <w:trPr>
+          <w:cantSplit/>
+        </w:trPr>
+        <w:tc>
+          <w:tcPr>
+            <w:tcW w:type="dxa" w:w="1500"/>
+          </w:tcPr>
+          <w:p>
+            <w:pPr>
+              <w:pStyle w:val="tablecopy"/>
+              <w:keepNext/>
+              <w:jc w:val="left"/>
+            </w:pPr>
+            <w:r>
+              <w:t>ECAD–MCAD links</w:t>
+            </w:r>
+          </w:p>
+        </w:tc>
+        <w:tc>
+          <w:tcPr>
+            <w:tcW w:type="dxa" w:w="1550"/>
+          </w:tcPr>
+          <w:p>
+            <w:pPr>
+              <w:pStyle w:val="tablecopy"/>
+              <w:keepNext/>
+              <w:jc w:val="left"/>
+            </w:pPr>
+            <w:r>
+              <w:t>board and case</w:t>
+            </w:r>
+          </w:p>
+        </w:tc>
+        <w:tc>
+          <w:tcPr>
+            <w:tcW w:type="dxa" w:w="1500"/>
+          </w:tcPr>
+          <w:p>
+            <w:pPr>
+              <w:pStyle w:val="tablecopy"/>
+              <w:keepNext/>
+              <w:jc w:val="left"/>
+            </w:pPr>
+            <w:r>
+              <w:t>two disciplines, two tools</w:t>
+            </w:r>
+          </w:p>
+        </w:tc>
+      </w:tr>
+      <w:tr>
+        <w:trPr>
+          <w:cantSplit/>
+        </w:trPr>
+        <w:tc>
+          <w:tcPr>
+            <w:tcW w:type="dxa" w:w="1500"/>
+          </w:tcPr>
+          <w:p>
+            <w:pPr>
+              <w:pStyle w:val="tablecopy"/>
+              <w:keepNext/>
+              <w:jc w:val="left"/>
+            </w:pPr>
+            <w:r>
+              <w:t>Design as code</w:t>
+            </w:r>
+          </w:p>
+        </w:tc>
+        <w:tc>
+          <w:tcPr>
+            <w:tcW w:type="dxa" w:w="1550"/>
+          </w:tcPr>
+          <w:p>
+            <w:pPr>
+              <w:pStyle w:val="tablecopy"/>
+              <w:keepNext/>
+              <w:jc w:val="left"/>
+            </w:pPr>
+            <w:r>
+              <w:t>one discipline</w:t>
+            </w:r>
+          </w:p>
+        </w:tc>
+        <w:tc>
+          <w:tcPr>
+            <w:tcW w:type="dxa" w:w="1500"/>
+          </w:tcPr>
+          <w:p>
+            <w:pPr>
+              <w:pStyle w:val="tablecopy"/>
+              <w:keepNext/>
+              <w:jc w:val="left"/>
+            </w:pPr>
+            <w:r>
+              <w:t>facts shared with others</w:t>
+            </w:r>
+          </w:p>
+        </w:tc>
+      </w:tr>
+      <w:tr>
+        <w:trPr>
+          <w:cantSplit/>
+        </w:trPr>
+        <w:tc>
+          <w:tcPr>
+            <w:tcW w:type="dxa" w:w="1500"/>
+          </w:tcPr>
+          <w:p>
+            <w:pPr>
+              <w:pStyle w:val="tablecopy"/>
+              <w:keepNext/>
+              <w:jc w:val="left"/>
+            </w:pPr>
+            <w:r>
+              <w:t>Interface languages</w:t>
+            </w:r>
+          </w:p>
+        </w:tc>
+        <w:tc>
+          <w:tcPr>
+            <w:tcW w:type="dxa" w:w="1550"/>
+          </w:tcPr>
+          <w:p>
+            <w:pPr>
+              <w:pStyle w:val="tablecopy"/>
+              <w:keepNext/>
+              <w:jc w:val="left"/>
+            </w:pPr>
+            <w:r>
+              <w:t>messages, both sides</w:t>
+            </w:r>
+          </w:p>
+        </w:tc>
+        <w:tc>
+          <w:tcPr>
+            <w:tcW w:type="dxa" w:w="1500"/>
+          </w:tcPr>
+          <w:p>
+            <w:pPr>
+              <w:pStyle w:val="tablecopy"/>
+              <w:keepNext/>
+              <w:jc w:val="left"/>
+            </w:pPr>
+            <w:r>
+              <w:t>everything else</w:t>
+            </w:r>
+          </w:p>
+        </w:tc>
+      </w:tr>
+      <w:tr>
+        <w:trPr>
+          <w:cantSplit/>
+        </w:trPr>
+        <w:tc>
+          <w:tcPr>
+            <w:tcW w:type="dxa" w:w="1500"/>
+          </w:tcPr>
+          <w:p>
+            <w:pPr>
+              <w:pStyle w:val="tablecopy"/>
+              <w:keepNext/>
+              <w:jc w:val="left"/>
+            </w:pPr>
+            <w:r>
+              <w:t>Build systems</w:t>
+            </w:r>
+          </w:p>
+        </w:tc>
+        <w:tc>
+          <w:tcPr>
+            <w:tcW w:type="dxa" w:w="1550"/>
+          </w:tcPr>
+          <w:p>
+            <w:pPr>
+              <w:pStyle w:val="tablecopy"/>
+              <w:keepNext/>
+              <w:jc w:val="left"/>
+            </w:pPr>
+            <w:r>
+              <w:t>outputs with files</w:t>
+            </w:r>
+          </w:p>
+        </w:tc>
+        <w:tc>
+          <w:tcPr>
+            <w:tcW w:type="dxa" w:w="1500"/>
+          </w:tcPr>
+          <w:p>
+            <w:pPr>
+              <w:pStyle w:val="tablecopy"/>
+              <w:keepNext/>
+              <w:jc w:val="left"/>
+            </w:pPr>
+            <w:r>
+              <w:t>two files that disagree</w:t>
+            </w:r>
+          </w:p>
+        </w:tc>
+      </w:tr>
+      <w:tr>
+        <w:trPr>
+          <w:cantSplit/>
+        </w:trPr>
+        <w:tc>
+          <w:tcPr>
+            <w:tcW w:type="dxa" w:w="1500"/>
+          </w:tcPr>
+          <w:p>
+            <w:pPr>
+              <w:pStyle w:val="tablecopy"/>
+              <w:keepNext/>
+              <w:jc w:val="left"/>
+            </w:pPr>
+            <w:r>
+              <w:t>Agent context files</w:t>
+            </w:r>
+          </w:p>
+        </w:tc>
+        <w:tc>
+          <w:tcPr>
+            <w:tcW w:type="dxa" w:w="1550"/>
+          </w:tcPr>
+          <w:p>
+            <w:pPr>
+              <w:pStyle w:val="tablecopy"/>
+              <w:keepNext/>
+              <w:jc w:val="left"/>
+            </w:pPr>
+            <w:r>
+              <w:t>nothing; they advise</w:t>
+            </w:r>
+          </w:p>
+        </w:tc>
+        <w:tc>
+          <w:tcPr>
+            <w:tcW w:type="dxa" w:w="1500"/>
+          </w:tcPr>
+          <w:p>
+            <w:pPr>
+              <w:pStyle w:val="tablecopy"/>
+              <w:keepNext/>
+              <w:jc w:val="left"/>
+            </w:pPr>
+            <w:r>
+              <w:t>not enforced</w:t>
+            </w:r>
+          </w:p>
+        </w:tc>
+      </w:tr>
+      <w:tr>
+        <w:trPr>
+          <w:cantSplit/>
+        </w:trPr>
+        <w:tc>
+          <w:tcPr>
+            <w:tcW w:type="dxa" w:w="1500"/>
+          </w:tcPr>
+          <w:p>
+            <w:pPr>
+              <w:pStyle w:val="tablecopy"/>
+              <w:jc w:val="left"/>
+            </w:pPr>
+            <w:r>
+              <w:t>Fiducial</w:t>
+            </w:r>
+          </w:p>
+        </w:tc>
+        <w:tc>
+          <w:tcPr>
+            <w:tcW w:type="dxa" w:w="1550"/>
+          </w:tcPr>
+          <w:p>
+            <w:pPr>
+              <w:pStyle w:val="tablecopy"/>
+              <w:jc w:val="left"/>
+            </w:pPr>
+            <w:r>
+              <w:t>every declared fact</w:t>
+            </w:r>
+          </w:p>
+        </w:tc>
+        <w:tc>
+          <w:tcPr>
+            <w:tcW w:type="dxa" w:w="1500"/>
+          </w:tcPr>
+          <w:p>
+            <w:pPr>
+              <w:pStyle w:val="tablecopy"/>
+              <w:jc w:val="left"/>
+            </w:pPr>
+            <w:r>
+              <w:t>facts not yet declared</w:t>
+            </w:r>
+          </w:p>
+        </w:tc>
+      </w:tr>
+    </w:tbl>
+    <w:p>
+      <w:pPr>
+        <w:pStyle w:val="BodyText"/>
+      </w:pPr>
+      <w:r/>
+    </w:p>
+    <w:p>
+      <w:pPr>
+        <w:pStyle w:val="BodyText"/>
+      </w:pPr>
+      <w:r>
+        <w:t>Fiducial keeps what works in each – text that agents can write, outputs tied to inputs by fingerprints, established engines for hard problems, and checks that decide – and changes the unit. It tracks facts rather than files or tools, across every discipline of one product, so any fact – a message, a pin, a colour, a size – has exactly one home.</w:t>
+      </w:r>
+    </w:p>
+    <w:p>
+      <w:pPr>
+        <w:pStyle w:val="Heading1"/>
+        <w:keepNext/>
+      </w:pPr>
+      <w:r>
+        <w:t>The Approach</w:t>
+      </w:r>
+    </w:p>
+    <w:p>
+      <w:pPr>
+        <w:pStyle w:val="BodyText"/>
+      </w:pPr>
+      <w:r>
+        <w:t>Fiducial treats a product as two kinds of thing. Facts are the decisions that define it: which pin a sensor is connected to, what a button says in each language, the brand colour, the size of the board, the layout of a message between a device and its app. Artifacts are everything built from those facts: source code, schematics, circuit boards, translation files, web pages, enclosure models. Drift is what happens when an artifact stops agreeing with a fact, or with another artifact that uses the same fact (Fig. 1a). The approach consists of three rules that together make drift visible and keep it out of the product (Fig. 1b).</w:t>
       </w:r>
     </w:p>
     <w:p>

</xml_diff>

<commit_message>
docs(paper): a short abstract in the Outreach paper's form
What Fiducial is, the problem, how it answers it, and the result today,
in four sentences. The introduction says building these products "has
shown" where the difficulty moved, not "showed the author".

Co-Authored-By: Claude Opus 5.5 <noreply@anthropic.com>
Claude-Session: https://claude.ai/code/session_0185NnNkfrVmB6KpyPa4GJCQ
</commit_message>
<xml_diff>
--- a/docs/paper/Fiducial_Zdravkovic_Aleksa.docx
+++ b/docs/paper/Fiducial_Zdravkovic_Aleksa.docx
@@ -232,7 +232,7 @@
         <w:t>Abstract—</w:t>
       </w:r>
       <w:r>
-        <w:t>AI coding agents can now write firmware, web applications and even circuit-board and enclosure code, which lets one person attempt products that used to need a team. Building such products showed the author where this falls short: each part can be written quickly, but the facts the parts share are copied between them, and nothing keeps the copies in agreement. This paper presents Fiducial, an open-source platform that gives a whole product, software and hardware alike, one structure. Every fact is declared once, every artifact that uses it is generated from that declaration, and checks on every change refuse anything that no longer agrees with it, so AI agents work inside the checks instead of being trusted. Of 20 realistic mistakes injected into a web product and a USB-C sensor stick, the checks catch all 20, each with a message naming its cause, and let every correct change through.</w:t>
+        <w:t>This paper presents Fiducial, an open-source platform for building products that span software and hardware with AI coding agents. Agents now write each part of a product quickly, but the facts the parts share are still copied between them and drift apart. Fiducial declares every fact once, generates every artifact from it – code, translations, circuit board and enclosure – and checks every change, so agents work within guarantees instead of being trusted. In a test of 20 realistic mistakes, the checks caught all 20 before they could be merged.</w:t>
       </w:r>
     </w:p>
     <w:p>
@@ -271,7 +271,7 @@
         <w:pStyle w:val="BodyText"/>
       </w:pPr>
       <w:r>
-        <w:t>Building such products – first Outreach [3], an off-grid messaging system made of radios, gateways, an app and printed cases, and then the platform described here – showed the author where the difficulty had moved. Writing each part was no longer the slow step; keeping the parts in agreement was. The radio’s firmware and the app disagreed on the layout of a message, and a printed case did not fit the board it was made for. Neither part was wrong on its own. The facts they shared had been copied by hand from one tool to another, one copy changed, and the mistake appeared only when the parts met (Fig. 1a).</w:t>
+        <w:t>Building such products – first Outreach [3], an off-grid messaging system made of radios, gateways, an app and printed cases, and then the platform described here – has shown where the difficulty has moved. Writing each part is no longer the slow step; keeping the parts in agreement is. In Outreach, the radio’s firmware and the app disagreed on the layout of a message, and a printed case did not fit the board it was made for. Neither part was wrong on its own. The facts they shared had been copied by hand from one tool to another, one copy changed, and the mistake appeared only when the parts met (Fig. 1a).</w:t>
       </w:r>
     </w:p>
     <w:p>

</xml_diff>